<commit_message>
Deploy latest version of PFS documents 6ed0c08eab292f9bba9e1135d200d14baeef9cbc
</commit_message>
<xml_diff>
--- a/latest/AR.docx
+++ b/latest/AR.docx
@@ -49,7 +49,7 @@
         </w:drawing>
       </w:r>
     </w:p>
-    <w:bookmarkStart w:id="421" w:name="ceos-ard---optical---aquatic-reflectance"/>
+    <w:bookmarkStart w:id="423" w:name="ceos-ard---optical---aquatic-reflectance"/>
     <w:p>
       <w:pPr>
         <w:pStyle w:val="berschrift1"/>
@@ -66,12 +66,53 @@
         <w:t xml:space="preserve"> </w:t>
       </w:r>
     </w:p>
-    <w:bookmarkStart w:id="24" w:name="document-status"/>
+    <w:bookmarkStart w:id="24" w:name="draft-version"/>
     <w:p>
       <w:pPr>
         <w:pStyle w:val="berschrift2"/>
       </w:pPr>
       <w:r>
+        <w:t xml:space="preserve">Draft Version</w:t>
+      </w:r>
+    </w:p>
+    <w:p>
+      <w:pPr>
+        <w:pStyle w:val="FirstParagraph"/>
+      </w:pPr>
+      <w:r>
+        <w:t xml:space="preserve">This is a draft version.</w:t>
+      </w:r>
+      <w:r>
+        <w:t xml:space="preserve"> </w:t>
+      </w:r>
+      <w:r>
+        <w:t xml:space="preserve">Please visit the</w:t>
+      </w:r>
+      <w:r>
+        <w:t xml:space="preserve"> </w:t>
+      </w:r>
+      <w:hyperlink r:id="rId23">
+        <w:r>
+          <w:rPr>
+            <w:rStyle w:val="Hyperlink"/>
+          </w:rPr>
+          <w:t xml:space="preserve">CEOS-ARD website</w:t>
+        </w:r>
+      </w:hyperlink>
+      <w:r>
+        <w:t xml:space="preserve"> </w:t>
+      </w:r>
+      <w:r>
+        <w:t xml:space="preserve">for the latest endorsed version of this document.</w:t>
+      </w:r>
+    </w:p>
+    <w:bookmarkEnd w:id="24"/>
+    <w:bookmarkStart w:id="26" w:name="document-status"/>
+    <w:p>
+      <w:pPr>
+        <w:pStyle w:val="berschrift2"/>
+      </w:pPr>
+      <w:r>
         <w:t xml:space="preserve">Document Status</w:t>
       </w:r>
     </w:p>
@@ -93,7 +134,7 @@
       <w:r>
         <w:t xml:space="preserve"> </w:t>
       </w:r>
-      <w:hyperlink r:id="rId23">
+      <w:hyperlink r:id="rId25">
         <w:r>
           <w:rPr>
             <w:rStyle w:val="Hyperlink"/>
@@ -102,8 +143,8 @@
         </w:r>
       </w:hyperlink>
     </w:p>
-    <w:bookmarkEnd w:id="24"/>
-    <w:bookmarkStart w:id="26" w:name="document-history"/>
+    <w:bookmarkEnd w:id="26"/>
+    <w:bookmarkStart w:id="28" w:name="document-history"/>
     <w:p>
       <w:pPr>
         <w:pStyle w:val="berschrift2"/>
@@ -112,7 +153,7 @@
         <w:t xml:space="preserve">Document History</w:t>
       </w:r>
     </w:p>
-    <w:bookmarkStart w:id="25" w:name="patch"/>
+    <w:bookmarkStart w:id="27" w:name="patch"/>
     <w:p>
       <w:pPr>
         <w:pStyle w:val="berschrift3"/>
@@ -292,9 +333,9 @@
         <w:t xml:space="preserve">Matthias Mohr</w:t>
       </w:r>
     </w:p>
-    <w:bookmarkEnd w:id="25"/>
-    <w:bookmarkEnd w:id="26"/>
-    <w:bookmarkStart w:id="30" w:name="contributing-authors"/>
+    <w:bookmarkEnd w:id="27"/>
+    <w:bookmarkEnd w:id="28"/>
+    <w:bookmarkStart w:id="32" w:name="contributing-authors"/>
     <w:p>
       <w:pPr>
         <w:pStyle w:val="berschrift2"/>
@@ -303,7 +344,7 @@
         <w:t xml:space="preserve">Contributing Authors</w:t>
       </w:r>
     </w:p>
-    <w:bookmarkStart w:id="27" w:name="technical-leads"/>
+    <w:bookmarkStart w:id="29" w:name="technical-leads"/>
     <w:p>
       <w:pPr>
         <w:pStyle w:val="berschrift3"/>
@@ -336,8 +377,8 @@
         <w:t xml:space="preserve">Daniela Gurlin (Independent Consultant)</w:t>
       </w:r>
     </w:p>
-    <w:bookmarkEnd w:id="27"/>
-    <w:bookmarkStart w:id="28" w:name="organisational-leads"/>
+    <w:bookmarkEnd w:id="29"/>
+    <w:bookmarkStart w:id="30" w:name="organisational-leads"/>
     <w:p>
       <w:pPr>
         <w:pStyle w:val="berschrift3"/>
@@ -370,8 +411,8 @@
         <w:t xml:space="preserve">Harvey Jones (CEOS-ARD Oversight Group Secretariat)</w:t>
       </w:r>
     </w:p>
-    <w:bookmarkEnd w:id="28"/>
-    <w:bookmarkStart w:id="29" w:name="contributors"/>
+    <w:bookmarkEnd w:id="30"/>
+    <w:bookmarkStart w:id="31" w:name="contributors"/>
     <w:p>
       <w:pPr>
         <w:pStyle w:val="berschrift3"/>
@@ -685,9 +726,9 @@
         <w:br w:type="page"/>
       </w:r>
     </w:p>
-    <w:bookmarkEnd w:id="29"/>
-    <w:bookmarkEnd w:id="30"/>
-    <w:bookmarkStart w:id="31" w:name="ceos-analysis-ready-data-definition"/>
+    <w:bookmarkEnd w:id="31"/>
+    <w:bookmarkEnd w:id="32"/>
+    <w:bookmarkStart w:id="33" w:name="ceos-analysis-ready-data-definition"/>
     <w:p>
       <w:pPr>
         <w:pStyle w:val="berschrift2"/>
@@ -704,8 +745,8 @@
         <w:t xml:space="preserve">CEOS Analysis Ready Data (CEOS-ARD) are satellite data that have been processed to a minimum set of requirements and organized into a form that allows immediate analysis with a minimum of additional user effort and interoperability both through time and with other datasets.</w:t>
       </w:r>
     </w:p>
-    <w:bookmarkEnd w:id="31"/>
-    <w:bookmarkStart w:id="32" w:name="description"/>
+    <w:bookmarkEnd w:id="33"/>
+    <w:bookmarkStart w:id="34" w:name="description"/>
     <w:p>
       <w:pPr>
         <w:pStyle w:val="berschrift2"/>
@@ -747,7 +788,7 @@
         <w:t xml:space="preserve"> </w:t>
       </w:r>
       <w:r>
-        <w:t xml:space="preserve">2.0.0-draft</w:t>
+        <w:t xml:space="preserve">2.0.1-draft</w:t>
       </w:r>
     </w:p>
     <w:p>
@@ -773,8 +814,8 @@
         <w:br w:type="page"/>
       </w:r>
     </w:p>
-    <w:bookmarkEnd w:id="32"/>
-    <w:bookmarkStart w:id="33" w:name="definitions-and-abbreviations"/>
+    <w:bookmarkEnd w:id="34"/>
+    <w:bookmarkStart w:id="35" w:name="definitions-and-abbreviations"/>
     <w:p>
       <w:pPr>
         <w:pStyle w:val="berschrift2"/>
@@ -1092,8 +1133,8 @@
         <w:br w:type="page"/>
       </w:r>
     </w:p>
-    <w:bookmarkEnd w:id="33"/>
-    <w:bookmarkStart w:id="251" w:name="requirements"/>
+    <w:bookmarkEnd w:id="35"/>
+    <w:bookmarkStart w:id="253" w:name="requirements"/>
     <w:p>
       <w:pPr>
         <w:pStyle w:val="berschrift2"/>
@@ -1148,7 +1189,7 @@
         <w:t xml:space="preserve">Instead, use the textual identifier that is provided below the title.</w:t>
       </w:r>
     </w:p>
-    <w:bookmarkStart w:id="111" w:name="sec:meta"/>
+    <w:bookmarkStart w:id="113" w:name="sec:meta"/>
     <w:p>
       <w:pPr>
         <w:pStyle w:val="berschrift3"/>
@@ -1210,7 +1251,7 @@
         <w:t xml:space="preserve">Information should be available in the metadata as a single DOI landing page, which may include links to further detailed documents and references to citable peer-reviewed algorithms or technical documentation.</w:t>
       </w:r>
     </w:p>
-    <w:bookmarkStart w:id="37" w:name="sec:meta-ardver"/>
+    <w:bookmarkStart w:id="39" w:name="sec:meta-ardver"/>
     <w:p>
       <w:pPr>
         <w:pStyle w:val="berschrift4"/>
@@ -1245,7 +1286,7 @@
         <w:t xml:space="preserve">meta-ardver</w:t>
       </w:r>
     </w:p>
-    <w:bookmarkStart w:id="34" w:name="threshold-requirements"/>
+    <w:bookmarkStart w:id="36" w:name="threshold-requirements"/>
     <w:p>
       <w:pPr>
         <w:pStyle w:val="berschrift5"/>
@@ -1262,8 +1303,8 @@
         <w:t xml:space="preserve">Version of the CEOS-ARD PFS with which the product is complying is identified.</w:t>
       </w:r>
     </w:p>
-    <w:bookmarkEnd w:id="34"/>
-    <w:bookmarkStart w:id="35" w:name="goal-requirements"/>
+    <w:bookmarkEnd w:id="36"/>
+    <w:bookmarkStart w:id="37" w:name="goal-requirements"/>
     <w:p>
       <w:pPr>
         <w:pStyle w:val="berschrift5"/>
@@ -1283,8 +1324,8 @@
         <w:t xml:space="preserve"> </w:t>
       </w:r>
     </w:p>
-    <w:bookmarkEnd w:id="35"/>
-    <w:bookmarkStart w:id="36" w:name="assessment"/>
+    <w:bookmarkEnd w:id="37"/>
+    <w:bookmarkStart w:id="38" w:name="assessment"/>
     <w:p>
       <w:pPr>
         <w:pStyle w:val="berschrift5"/>
@@ -1348,9 +1389,9 @@
         </w:pict>
       </w:r>
     </w:p>
-    <w:bookmarkEnd w:id="36"/>
-    <w:bookmarkEnd w:id="37"/>
-    <w:bookmarkStart w:id="41" w:name="sec:meta-trace-ar"/>
+    <w:bookmarkEnd w:id="38"/>
+    <w:bookmarkEnd w:id="39"/>
+    <w:bookmarkStart w:id="43" w:name="sec:meta-trace-ar"/>
     <w:p>
       <w:pPr>
         <w:pStyle w:val="berschrift4"/>
@@ -1385,7 +1426,7 @@
         <w:t xml:space="preserve">meta-trace-ar</w:t>
       </w:r>
     </w:p>
-    <w:bookmarkStart w:id="38" w:name="threshold-requirements-1"/>
+    <w:bookmarkStart w:id="40" w:name="threshold-requirements-1"/>
     <w:p>
       <w:pPr>
         <w:pStyle w:val="berschrift5"/>
@@ -1469,8 +1510,8 @@
         <w:t xml:space="preserve">) is given.</w:t>
       </w:r>
     </w:p>
-    <w:bookmarkEnd w:id="38"/>
-    <w:bookmarkStart w:id="39" w:name="goal-requirements-1"/>
+    <w:bookmarkEnd w:id="40"/>
+    <w:bookmarkStart w:id="41" w:name="goal-requirements-1"/>
     <w:p>
       <w:pPr>
         <w:pStyle w:val="berschrift5"/>
@@ -1524,8 +1565,8 @@
         <w:t xml:space="preserve">. Traceability requires an estimate of measurement uncertainty.</w:t>
       </w:r>
     </w:p>
-    <w:bookmarkEnd w:id="39"/>
-    <w:bookmarkStart w:id="40" w:name="assessment-1"/>
+    <w:bookmarkEnd w:id="41"/>
+    <w:bookmarkStart w:id="42" w:name="assessment-1"/>
     <w:p>
       <w:pPr>
         <w:pStyle w:val="berschrift5"/>
@@ -1589,9 +1630,9 @@
         </w:pict>
       </w:r>
     </w:p>
-    <w:bookmarkEnd w:id="40"/>
-    <w:bookmarkEnd w:id="41"/>
-    <w:bookmarkStart w:id="45" w:name="sec:meta-memare-optical"/>
+    <w:bookmarkEnd w:id="42"/>
+    <w:bookmarkEnd w:id="43"/>
+    <w:bookmarkStart w:id="47" w:name="sec:meta-memare-optical"/>
     <w:p>
       <w:pPr>
         <w:pStyle w:val="berschrift4"/>
@@ -1626,7 +1667,7 @@
         <w:t xml:space="preserve">meta-memare-optical</w:t>
       </w:r>
     </w:p>
-    <w:bookmarkStart w:id="42" w:name="threshold-requirements-2"/>
+    <w:bookmarkStart w:id="44" w:name="threshold-requirements-2"/>
     <w:p>
       <w:pPr>
         <w:pStyle w:val="berschrift5"/>
@@ -1643,8 +1684,8 @@
         <w:t xml:space="preserve">Metadata is provided in a structure that enables a computer algorithm to be used to consistently and automatically identify and extract each component part for further use.</w:t>
       </w:r>
     </w:p>
-    <w:bookmarkEnd w:id="42"/>
-    <w:bookmarkStart w:id="43" w:name="goal-requirements-2"/>
+    <w:bookmarkEnd w:id="44"/>
+    <w:bookmarkStart w:id="45" w:name="goal-requirements-2"/>
     <w:p>
       <w:pPr>
         <w:pStyle w:val="berschrift5"/>
@@ -1661,8 +1702,8 @@
         <w:t xml:space="preserve">As threshold, but metadata should be provided in a community endorsed standard that facilitates machine-readability, such as ISO 19115-2.</w:t>
       </w:r>
     </w:p>
-    <w:bookmarkEnd w:id="43"/>
-    <w:bookmarkStart w:id="44" w:name="assessment-2"/>
+    <w:bookmarkEnd w:id="45"/>
+    <w:bookmarkStart w:id="46" w:name="assessment-2"/>
     <w:p>
       <w:pPr>
         <w:pStyle w:val="berschrift5"/>
@@ -1726,9 +1767,9 @@
         </w:pict>
       </w:r>
     </w:p>
-    <w:bookmarkEnd w:id="44"/>
-    <w:bookmarkEnd w:id="45"/>
-    <w:bookmarkStart w:id="49" w:name="sec:meta-time-ar"/>
+    <w:bookmarkEnd w:id="46"/>
+    <w:bookmarkEnd w:id="47"/>
+    <w:bookmarkStart w:id="51" w:name="sec:meta-time-ar"/>
     <w:p>
       <w:pPr>
         <w:pStyle w:val="berschrift4"/>
@@ -1763,7 +1804,7 @@
         <w:t xml:space="preserve">meta-time-ar</w:t>
       </w:r>
     </w:p>
-    <w:bookmarkStart w:id="46" w:name="threshold-requirements-3"/>
+    <w:bookmarkStart w:id="48" w:name="threshold-requirements-3"/>
     <w:p>
       <w:pPr>
         <w:pStyle w:val="berschrift5"/>
@@ -1780,8 +1821,8 @@
         <w:t xml:space="preserve">The beginning and end of the data collection time is expressed in date/time and identified in the metadata consistent with ISO 8601. The time is expressed with the time offset from UTC unambiguously identified.</w:t>
       </w:r>
     </w:p>
-    <w:bookmarkEnd w:id="46"/>
-    <w:bookmarkStart w:id="47" w:name="goal-requirements-3"/>
+    <w:bookmarkEnd w:id="48"/>
+    <w:bookmarkStart w:id="49" w:name="goal-requirements-3"/>
     <w:p>
       <w:pPr>
         <w:pStyle w:val="berschrift5"/>
@@ -1798,8 +1839,8 @@
         <w:t xml:space="preserve">As threshold, but information required to determine, within a stated uncertainty, when the individual observations were taken is available.</w:t>
       </w:r>
     </w:p>
-    <w:bookmarkEnd w:id="47"/>
-    <w:bookmarkStart w:id="48" w:name="assessment-3"/>
+    <w:bookmarkEnd w:id="49"/>
+    <w:bookmarkStart w:id="50" w:name="assessment-3"/>
     <w:p>
       <w:pPr>
         <w:pStyle w:val="berschrift5"/>
@@ -1863,9 +1904,9 @@
         </w:pict>
       </w:r>
     </w:p>
-    <w:bookmarkEnd w:id="48"/>
-    <w:bookmarkEnd w:id="49"/>
-    <w:bookmarkStart w:id="53" w:name="sec:meta-geoarea-optical"/>
+    <w:bookmarkEnd w:id="50"/>
+    <w:bookmarkEnd w:id="51"/>
+    <w:bookmarkStart w:id="55" w:name="sec:meta-geoarea-optical"/>
     <w:p>
       <w:pPr>
         <w:pStyle w:val="berschrift4"/>
@@ -1900,7 +1941,7 @@
         <w:t xml:space="preserve">meta-geoarea-optical</w:t>
       </w:r>
     </w:p>
-    <w:bookmarkStart w:id="50" w:name="threshold-requirements-4"/>
+    <w:bookmarkStart w:id="52" w:name="threshold-requirements-4"/>
     <w:p>
       <w:pPr>
         <w:pStyle w:val="berschrift5"/>
@@ -1917,8 +1958,8 @@
         <w:t xml:space="preserve">The surface location to which the data relates is identified, typically as a series of four corner points, expressed in an accepted coordinate reference system (e.g., WGS84).</w:t>
       </w:r>
     </w:p>
-    <w:bookmarkEnd w:id="50"/>
-    <w:bookmarkStart w:id="51" w:name="goal-requirements-4"/>
+    <w:bookmarkEnd w:id="52"/>
+    <w:bookmarkStart w:id="53" w:name="goal-requirements-4"/>
     <w:p>
       <w:pPr>
         <w:pStyle w:val="berschrift5"/>
@@ -1935,8 +1976,8 @@
         <w:t xml:space="preserve">The geographic area covered by the observations is identified specifically, such as through a set of coordinates of a closely bounding polygon. The location to which each pixel refers is identified (or can be reliably determined) with the projection system (if any) and reference datum provided.</w:t>
       </w:r>
     </w:p>
-    <w:bookmarkEnd w:id="51"/>
-    <w:bookmarkStart w:id="52" w:name="assessment-4"/>
+    <w:bookmarkEnd w:id="53"/>
+    <w:bookmarkStart w:id="54" w:name="assessment-4"/>
     <w:p>
       <w:pPr>
         <w:pStyle w:val="berschrift5"/>
@@ -2000,9 +2041,9 @@
         </w:pict>
       </w:r>
     </w:p>
-    <w:bookmarkEnd w:id="52"/>
-    <w:bookmarkEnd w:id="53"/>
-    <w:bookmarkStart w:id="57" w:name="sec:meta-crs-ar"/>
+    <w:bookmarkEnd w:id="54"/>
+    <w:bookmarkEnd w:id="55"/>
+    <w:bookmarkStart w:id="59" w:name="sec:meta-crs-ar"/>
     <w:p>
       <w:pPr>
         <w:pStyle w:val="berschrift4"/>
@@ -2037,7 +2078,7 @@
         <w:t xml:space="preserve">meta-crs-ar</w:t>
       </w:r>
     </w:p>
-    <w:bookmarkStart w:id="54" w:name="threshold-requirements-5"/>
+    <w:bookmarkStart w:id="56" w:name="threshold-requirements-5"/>
     <w:p>
       <w:pPr>
         <w:pStyle w:val="berschrift5"/>
@@ -2054,8 +2095,8 @@
         <w:t xml:space="preserve">The coordinate reference system that has been used is detailed.</w:t>
       </w:r>
     </w:p>
-    <w:bookmarkEnd w:id="54"/>
-    <w:bookmarkStart w:id="55" w:name="goal-requirements-5"/>
+    <w:bookmarkEnd w:id="56"/>
+    <w:bookmarkStart w:id="57" w:name="goal-requirements-5"/>
     <w:p>
       <w:pPr>
         <w:pStyle w:val="berschrift5"/>
@@ -2075,8 +2116,8 @@
         <w:t xml:space="preserve"> </w:t>
       </w:r>
     </w:p>
-    <w:bookmarkEnd w:id="55"/>
-    <w:bookmarkStart w:id="56" w:name="assessment-5"/>
+    <w:bookmarkEnd w:id="57"/>
+    <w:bookmarkStart w:id="58" w:name="assessment-5"/>
     <w:p>
       <w:pPr>
         <w:pStyle w:val="berschrift5"/>
@@ -2140,9 +2181,9 @@
         </w:pict>
       </w:r>
     </w:p>
-    <w:bookmarkEnd w:id="56"/>
-    <w:bookmarkEnd w:id="57"/>
-    <w:bookmarkStart w:id="61" w:name="sec:meta-mapproj-ar"/>
+    <w:bookmarkEnd w:id="58"/>
+    <w:bookmarkEnd w:id="59"/>
+    <w:bookmarkStart w:id="63" w:name="sec:meta-mapproj-ar"/>
     <w:p>
       <w:pPr>
         <w:pStyle w:val="berschrift4"/>
@@ -2177,7 +2218,7 @@
         <w:t xml:space="preserve">meta-mapproj-ar</w:t>
       </w:r>
     </w:p>
-    <w:bookmarkStart w:id="58" w:name="threshold-requirements-6"/>
+    <w:bookmarkStart w:id="60" w:name="threshold-requirements-6"/>
     <w:p>
       <w:pPr>
         <w:pStyle w:val="berschrift5"/>
@@ -2194,8 +2235,8 @@
         <w:t xml:space="preserve">The map projection that has been used and any relevant parameters required in relation to use of data in that map projection is detailed.</w:t>
       </w:r>
     </w:p>
-    <w:bookmarkEnd w:id="58"/>
-    <w:bookmarkStart w:id="59" w:name="goal-requirements-6"/>
+    <w:bookmarkEnd w:id="60"/>
+    <w:bookmarkStart w:id="61" w:name="goal-requirements-6"/>
     <w:p>
       <w:pPr>
         <w:pStyle w:val="berschrift5"/>
@@ -2215,8 +2256,8 @@
         <w:t xml:space="preserve"> </w:t>
       </w:r>
     </w:p>
-    <w:bookmarkEnd w:id="59"/>
-    <w:bookmarkStart w:id="60" w:name="assessment-6"/>
+    <w:bookmarkEnd w:id="61"/>
+    <w:bookmarkStart w:id="62" w:name="assessment-6"/>
     <w:p>
       <w:pPr>
         <w:pStyle w:val="berschrift5"/>
@@ -2280,9 +2321,9 @@
         </w:pict>
       </w:r>
     </w:p>
-    <w:bookmarkEnd w:id="60"/>
-    <w:bookmarkEnd w:id="61"/>
-    <w:bookmarkStart w:id="65" w:name="sec:meta-geocorm-ar"/>
+    <w:bookmarkEnd w:id="62"/>
+    <w:bookmarkEnd w:id="63"/>
+    <w:bookmarkStart w:id="67" w:name="sec:meta-geocorm-ar"/>
     <w:p>
       <w:pPr>
         <w:pStyle w:val="berschrift4"/>
@@ -2317,7 +2358,7 @@
         <w:t xml:space="preserve">meta-geocorm-ar</w:t>
       </w:r>
     </w:p>
-    <w:bookmarkStart w:id="62" w:name="threshold-requirements-7"/>
+    <w:bookmarkStart w:id="64" w:name="threshold-requirements-7"/>
     <w:p>
       <w:pPr>
         <w:pStyle w:val="berschrift5"/>
@@ -2337,8 +2378,8 @@
         <w:t xml:space="preserve"> </w:t>
       </w:r>
     </w:p>
-    <w:bookmarkEnd w:id="62"/>
-    <w:bookmarkStart w:id="63" w:name="goal-requirements-7"/>
+    <w:bookmarkEnd w:id="64"/>
+    <w:bookmarkStart w:id="65" w:name="goal-requirements-7"/>
     <w:p>
       <w:pPr>
         <w:pStyle w:val="berschrift5"/>
@@ -2355,8 +2396,8 @@
         <w:t xml:space="preserve">Information on geometric correction source and methods are provided, including reference database and auxiliary data such as elevation model(s) and reference chip-sets.</w:t>
       </w:r>
     </w:p>
-    <w:bookmarkEnd w:id="63"/>
-    <w:bookmarkStart w:id="64" w:name="assessment-7"/>
+    <w:bookmarkEnd w:id="65"/>
+    <w:bookmarkStart w:id="66" w:name="assessment-7"/>
     <w:p>
       <w:pPr>
         <w:pStyle w:val="berschrift5"/>
@@ -2420,9 +2461,9 @@
         </w:pict>
       </w:r>
     </w:p>
-    <w:bookmarkEnd w:id="64"/>
-    <w:bookmarkEnd w:id="65"/>
-    <w:bookmarkStart w:id="69" w:name="sec:meta-geounc"/>
+    <w:bookmarkEnd w:id="66"/>
+    <w:bookmarkEnd w:id="67"/>
+    <w:bookmarkStart w:id="71" w:name="sec:meta-geounc"/>
     <w:p>
       <w:pPr>
         <w:pStyle w:val="berschrift4"/>
@@ -2457,7 +2498,7 @@
         <w:t xml:space="preserve">meta-geounc</w:t>
       </w:r>
     </w:p>
-    <w:bookmarkStart w:id="66" w:name="threshold-requirements-8"/>
+    <w:bookmarkStart w:id="68" w:name="threshold-requirements-8"/>
     <w:p>
       <w:pPr>
         <w:pStyle w:val="berschrift5"/>
@@ -2477,8 +2518,8 @@
         <w:t xml:space="preserve"> </w:t>
       </w:r>
     </w:p>
-    <w:bookmarkEnd w:id="66"/>
-    <w:bookmarkStart w:id="67" w:name="goal-requirements-8"/>
+    <w:bookmarkEnd w:id="68"/>
+    <w:bookmarkStart w:id="69" w:name="goal-requirements-8"/>
     <w:p>
       <w:pPr>
         <w:pStyle w:val="berschrift5"/>
@@ -2495,8 +2536,8 @@
         <w:t xml:space="preserve">Inclusion of metrics describing the assessed geodetic uncertainty of the data, expressed in units of the coordinate system of the data. Uncertainty is assessed by independent verification (as well as internal model-fit where applicable). Uncertainties are expressed quantitatively.</w:t>
       </w:r>
     </w:p>
-    <w:bookmarkEnd w:id="67"/>
-    <w:bookmarkStart w:id="68" w:name="assessment-8"/>
+    <w:bookmarkEnd w:id="69"/>
+    <w:bookmarkStart w:id="70" w:name="assessment-8"/>
     <w:p>
       <w:pPr>
         <w:pStyle w:val="berschrift5"/>
@@ -2560,9 +2601,9 @@
         </w:pict>
       </w:r>
     </w:p>
-    <w:bookmarkEnd w:id="68"/>
-    <w:bookmarkEnd w:id="69"/>
-    <w:bookmarkStart w:id="74" w:name="sec:meta-instru-ar"/>
+    <w:bookmarkEnd w:id="70"/>
+    <w:bookmarkEnd w:id="71"/>
+    <w:bookmarkStart w:id="76" w:name="sec:meta-instru-ar"/>
     <w:p>
       <w:pPr>
         <w:pStyle w:val="berschrift4"/>
@@ -2597,7 +2638,7 @@
         <w:t xml:space="preserve">meta-instru-ar</w:t>
       </w:r>
     </w:p>
-    <w:bookmarkStart w:id="70" w:name="threshold-requirements-9"/>
+    <w:bookmarkStart w:id="72" w:name="threshold-requirements-9"/>
     <w:p>
       <w:pPr>
         <w:pStyle w:val="berschrift5"/>
@@ -2614,8 +2655,8 @@
         <w:t xml:space="preserve">The instrument used to collect the data is identified.</w:t>
       </w:r>
     </w:p>
-    <w:bookmarkEnd w:id="70"/>
-    <w:bookmarkStart w:id="72" w:name="goal-requirements-9"/>
+    <w:bookmarkEnd w:id="72"/>
+    <w:bookmarkStart w:id="74" w:name="goal-requirements-9"/>
     <w:p>
       <w:pPr>
         <w:pStyle w:val="berschrift5"/>
@@ -2643,7 +2684,7 @@
       <w:r>
         <w:t xml:space="preserve">record (</w:t>
       </w:r>
-      <w:hyperlink r:id="rId71">
+      <w:hyperlink r:id="rId73">
         <w:r>
           <w:rPr>
             <w:rStyle w:val="Hyperlink"/>
@@ -2655,8 +2696,8 @@
         <w:t xml:space="preserve">).</w:t>
       </w:r>
     </w:p>
-    <w:bookmarkEnd w:id="72"/>
-    <w:bookmarkStart w:id="73" w:name="assessment-9"/>
+    <w:bookmarkEnd w:id="74"/>
+    <w:bookmarkStart w:id="75" w:name="assessment-9"/>
     <w:p>
       <w:pPr>
         <w:pStyle w:val="berschrift5"/>
@@ -2720,9 +2761,9 @@
         </w:pict>
       </w:r>
     </w:p>
-    <w:bookmarkEnd w:id="73"/>
-    <w:bookmarkEnd w:id="74"/>
-    <w:bookmarkStart w:id="78" w:name="sec:meta-specband-ar"/>
+    <w:bookmarkEnd w:id="75"/>
+    <w:bookmarkEnd w:id="76"/>
+    <w:bookmarkStart w:id="80" w:name="sec:meta-specband-ar"/>
     <w:p>
       <w:pPr>
         <w:pStyle w:val="berschrift4"/>
@@ -2757,7 +2798,7 @@
         <w:t xml:space="preserve">meta-specband-ar</w:t>
       </w:r>
     </w:p>
-    <w:bookmarkStart w:id="75" w:name="threshold-requirements-10"/>
+    <w:bookmarkStart w:id="77" w:name="threshold-requirements-10"/>
     <w:p>
       <w:pPr>
         <w:pStyle w:val="berschrift5"/>
@@ -2774,8 +2815,8 @@
         <w:t xml:space="preserve">Full spectral response function is provided.</w:t>
       </w:r>
     </w:p>
-    <w:bookmarkEnd w:id="75"/>
-    <w:bookmarkStart w:id="76" w:name="goal-requirements-10"/>
+    <w:bookmarkEnd w:id="77"/>
+    <w:bookmarkStart w:id="78" w:name="goal-requirements-10"/>
     <w:p>
       <w:pPr>
         <w:pStyle w:val="berschrift5"/>
@@ -2795,8 +2836,8 @@
         <w:t xml:space="preserve"> </w:t>
       </w:r>
     </w:p>
-    <w:bookmarkEnd w:id="76"/>
-    <w:bookmarkStart w:id="77" w:name="assessment-10"/>
+    <w:bookmarkEnd w:id="78"/>
+    <w:bookmarkStart w:id="79" w:name="assessment-10"/>
     <w:p>
       <w:pPr>
         <w:pStyle w:val="berschrift5"/>
@@ -2860,9 +2901,9 @@
         </w:pict>
       </w:r>
     </w:p>
-    <w:bookmarkEnd w:id="77"/>
-    <w:bookmarkEnd w:id="78"/>
-    <w:bookmarkStart w:id="82" w:name="sec:meta-sencal-ar"/>
+    <w:bookmarkEnd w:id="79"/>
+    <w:bookmarkEnd w:id="80"/>
+    <w:bookmarkStart w:id="84" w:name="sec:meta-sencal-ar"/>
     <w:p>
       <w:pPr>
         <w:pStyle w:val="berschrift4"/>
@@ -2897,7 +2938,7 @@
         <w:t xml:space="preserve">meta-sencal-ar</w:t>
       </w:r>
     </w:p>
-    <w:bookmarkStart w:id="79" w:name="threshold-requirements-11"/>
+    <w:bookmarkStart w:id="81" w:name="threshold-requirements-11"/>
     <w:p>
       <w:pPr>
         <w:pStyle w:val="berschrift5"/>
@@ -2914,8 +2955,8 @@
         <w:t xml:space="preserve">Binary description of calibrated/not calibrated only.</w:t>
       </w:r>
     </w:p>
-    <w:bookmarkEnd w:id="79"/>
-    <w:bookmarkStart w:id="80" w:name="goal-requirements-11"/>
+    <w:bookmarkEnd w:id="81"/>
+    <w:bookmarkStart w:id="82" w:name="goal-requirements-11"/>
     <w:p>
       <w:pPr>
         <w:pStyle w:val="berschrift5"/>
@@ -2932,8 +2973,8 @@
         <w:t xml:space="preserve">Specification of sensor calibration parameters including history of onboard calibrations where available.</w:t>
       </w:r>
     </w:p>
-    <w:bookmarkEnd w:id="80"/>
-    <w:bookmarkStart w:id="81" w:name="assessment-11"/>
+    <w:bookmarkEnd w:id="82"/>
+    <w:bookmarkStart w:id="83" w:name="assessment-11"/>
     <w:p>
       <w:pPr>
         <w:pStyle w:val="berschrift5"/>
@@ -2997,9 +3038,9 @@
         </w:pict>
       </w:r>
     </w:p>
-    <w:bookmarkEnd w:id="81"/>
-    <w:bookmarkEnd w:id="82"/>
-    <w:bookmarkStart w:id="86" w:name="sec:meta-radunc"/>
+    <w:bookmarkEnd w:id="83"/>
+    <w:bookmarkEnd w:id="84"/>
+    <w:bookmarkStart w:id="88" w:name="sec:meta-radunc"/>
     <w:p>
       <w:pPr>
         <w:pStyle w:val="berschrift4"/>
@@ -3034,7 +3075,7 @@
         <w:t xml:space="preserve">meta-radunc</w:t>
       </w:r>
     </w:p>
-    <w:bookmarkStart w:id="83" w:name="threshold-requirements-12"/>
+    <w:bookmarkStart w:id="85" w:name="threshold-requirements-12"/>
     <w:p>
       <w:pPr>
         <w:pStyle w:val="berschrift5"/>
@@ -3051,8 +3092,8 @@
         <w:t xml:space="preserve">Metrics describing the assessed radiometric uncertainty of the version of the data or product are provided. Method of determination of radiometric uncertainty is specified.</w:t>
       </w:r>
     </w:p>
-    <w:bookmarkEnd w:id="83"/>
-    <w:bookmarkStart w:id="84" w:name="goal-requirements-12"/>
+    <w:bookmarkEnd w:id="85"/>
+    <w:bookmarkStart w:id="86" w:name="goal-requirements-12"/>
     <w:p>
       <w:pPr>
         <w:pStyle w:val="berschrift5"/>
@@ -3069,8 +3110,8 @@
         <w:t xml:space="preserve">As threshold, but the absolute radiometric uncertainty of the data is provided.</w:t>
       </w:r>
     </w:p>
-    <w:bookmarkEnd w:id="84"/>
-    <w:bookmarkStart w:id="85" w:name="assessment-12"/>
+    <w:bookmarkEnd w:id="86"/>
+    <w:bookmarkStart w:id="87" w:name="assessment-12"/>
     <w:p>
       <w:pPr>
         <w:pStyle w:val="berschrift5"/>
@@ -3134,9 +3175,9 @@
         </w:pict>
       </w:r>
     </w:p>
-    <w:bookmarkEnd w:id="85"/>
-    <w:bookmarkEnd w:id="86"/>
-    <w:bookmarkStart w:id="90" w:name="sec:meta-radenc"/>
+    <w:bookmarkEnd w:id="87"/>
+    <w:bookmarkEnd w:id="88"/>
+    <w:bookmarkStart w:id="92" w:name="sec:meta-radenc"/>
     <w:p>
       <w:pPr>
         <w:pStyle w:val="berschrift4"/>
@@ -3171,7 +3212,7 @@
         <w:t xml:space="preserve">meta-radenc</w:t>
       </w:r>
     </w:p>
-    <w:bookmarkStart w:id="87" w:name="threshold-requirements-13"/>
+    <w:bookmarkStart w:id="89" w:name="threshold-requirements-13"/>
     <w:p>
       <w:pPr>
         <w:pStyle w:val="berschrift5"/>
@@ -3188,8 +3229,8 @@
         <w:t xml:space="preserve">Range and bit depth are provided.</w:t>
       </w:r>
     </w:p>
-    <w:bookmarkEnd w:id="87"/>
-    <w:bookmarkStart w:id="88" w:name="goal-requirements-13"/>
+    <w:bookmarkEnd w:id="89"/>
+    <w:bookmarkStart w:id="90" w:name="goal-requirements-13"/>
     <w:p>
       <w:pPr>
         <w:pStyle w:val="berschrift5"/>
@@ -3209,8 +3250,8 @@
         <w:t xml:space="preserve"> </w:t>
       </w:r>
     </w:p>
-    <w:bookmarkEnd w:id="88"/>
-    <w:bookmarkStart w:id="89" w:name="assessment-13"/>
+    <w:bookmarkEnd w:id="90"/>
+    <w:bookmarkStart w:id="91" w:name="assessment-13"/>
     <w:p>
       <w:pPr>
         <w:pStyle w:val="berschrift5"/>
@@ -3274,9 +3315,9 @@
         </w:pict>
       </w:r>
     </w:p>
-    <w:bookmarkEnd w:id="89"/>
-    <w:bookmarkEnd w:id="90"/>
-    <w:bookmarkStart w:id="94" w:name="sec:meta-malgos-ar"/>
+    <w:bookmarkEnd w:id="91"/>
+    <w:bookmarkEnd w:id="92"/>
+    <w:bookmarkStart w:id="96" w:name="sec:meta-malgos-ar"/>
     <w:p>
       <w:pPr>
         <w:pStyle w:val="berschrift4"/>
@@ -3311,7 +3352,7 @@
         <w:t xml:space="preserve">meta-malgos-ar</w:t>
       </w:r>
     </w:p>
-    <w:bookmarkStart w:id="91" w:name="threshold-requirements-14"/>
+    <w:bookmarkStart w:id="93" w:name="threshold-requirements-14"/>
     <w:p>
       <w:pPr>
         <w:pStyle w:val="berschrift5"/>
@@ -3356,8 +3397,8 @@
         <w:t xml:space="preserve">It is possible that corrections are applied through non-disclosed processes. CEOS-ARD does not require full and open data and methods.</w:t>
       </w:r>
     </w:p>
-    <w:bookmarkEnd w:id="91"/>
-    <w:bookmarkStart w:id="92" w:name="goal-requirements-14"/>
+    <w:bookmarkEnd w:id="93"/>
+    <w:bookmarkStart w:id="94" w:name="goal-requirements-14"/>
     <w:p>
       <w:pPr>
         <w:pStyle w:val="berschrift5"/>
@@ -3377,8 +3418,8 @@
         <w:t xml:space="preserve"> </w:t>
       </w:r>
     </w:p>
-    <w:bookmarkEnd w:id="92"/>
-    <w:bookmarkStart w:id="93" w:name="assessment-14"/>
+    <w:bookmarkEnd w:id="94"/>
+    <w:bookmarkStart w:id="95" w:name="assessment-14"/>
     <w:p>
       <w:pPr>
         <w:pStyle w:val="berschrift5"/>
@@ -3442,9 +3483,9 @@
         </w:pict>
       </w:r>
     </w:p>
-    <w:bookmarkEnd w:id="93"/>
-    <w:bookmarkEnd w:id="94"/>
-    <w:bookmarkStart w:id="98" w:name="sec:meta-auxdat-ar"/>
+    <w:bookmarkEnd w:id="95"/>
+    <w:bookmarkEnd w:id="96"/>
+    <w:bookmarkStart w:id="100" w:name="sec:meta-auxdat-ar"/>
     <w:p>
       <w:pPr>
         <w:pStyle w:val="berschrift4"/>
@@ -3479,7 +3520,7 @@
         <w:t xml:space="preserve">meta-auxdat-ar</w:t>
       </w:r>
     </w:p>
-    <w:bookmarkStart w:id="95" w:name="threshold-requirements-15"/>
+    <w:bookmarkStart w:id="97" w:name="threshold-requirements-15"/>
     <w:p>
       <w:pPr>
         <w:pStyle w:val="berschrift5"/>
@@ -3496,8 +3537,8 @@
         <w:t xml:space="preserve">Lists the sources of auxiliary data used in the generation process.</w:t>
       </w:r>
     </w:p>
-    <w:bookmarkEnd w:id="95"/>
-    <w:bookmarkStart w:id="96" w:name="goal-requirements-15"/>
+    <w:bookmarkEnd w:id="97"/>
+    <w:bookmarkStart w:id="98" w:name="goal-requirements-15"/>
     <w:p>
       <w:pPr>
         <w:pStyle w:val="berschrift5"/>
@@ -3514,8 +3555,8 @@
         <w:t xml:space="preserve">As threshold, but information on auxiliary data should be available for free online download, contemporaneously with the product or through a link to the source.</w:t>
       </w:r>
     </w:p>
-    <w:bookmarkEnd w:id="96"/>
-    <w:bookmarkStart w:id="97" w:name="assessment-15"/>
+    <w:bookmarkEnd w:id="98"/>
+    <w:bookmarkStart w:id="99" w:name="assessment-15"/>
     <w:p>
       <w:pPr>
         <w:pStyle w:val="berschrift5"/>
@@ -3579,9 +3620,9 @@
         </w:pict>
       </w:r>
     </w:p>
-    <w:bookmarkEnd w:id="97"/>
-    <w:bookmarkEnd w:id="98"/>
-    <w:bookmarkStart w:id="102" w:name="sec:meta-proprov-ar"/>
+    <w:bookmarkEnd w:id="99"/>
+    <w:bookmarkEnd w:id="100"/>
+    <w:bookmarkStart w:id="104" w:name="sec:meta-proprov-ar"/>
     <w:p>
       <w:pPr>
         <w:pStyle w:val="berschrift4"/>
@@ -3616,7 +3657,7 @@
         <w:t xml:space="preserve">meta-proprov-ar</w:t>
       </w:r>
     </w:p>
-    <w:bookmarkStart w:id="99" w:name="threshold-requirements-16"/>
+    <w:bookmarkStart w:id="101" w:name="threshold-requirements-16"/>
     <w:p>
       <w:pPr>
         <w:pStyle w:val="berschrift5"/>
@@ -3636,8 +3677,8 @@
         <w:t xml:space="preserve"> </w:t>
       </w:r>
     </w:p>
-    <w:bookmarkEnd w:id="99"/>
-    <w:bookmarkStart w:id="100" w:name="goal-requirements-16"/>
+    <w:bookmarkEnd w:id="101"/>
+    <w:bookmarkStart w:id="102" w:name="goal-requirements-16"/>
     <w:p>
       <w:pPr>
         <w:pStyle w:val="berschrift5"/>
@@ -3654,8 +3695,8 @@
         <w:t xml:space="preserve">Information on processing chain provenance should be available with a detailed description of the processing steps used to generate the product, including the versions of software used, giving full transparency to the users.</w:t>
       </w:r>
     </w:p>
-    <w:bookmarkEnd w:id="100"/>
-    <w:bookmarkStart w:id="101" w:name="assessment-16"/>
+    <w:bookmarkEnd w:id="102"/>
+    <w:bookmarkStart w:id="103" w:name="assessment-16"/>
     <w:p>
       <w:pPr>
         <w:pStyle w:val="berschrift5"/>
@@ -3719,9 +3760,9 @@
         </w:pict>
       </w:r>
     </w:p>
-    <w:bookmarkEnd w:id="101"/>
-    <w:bookmarkEnd w:id="102"/>
-    <w:bookmarkStart w:id="106" w:name="sec:meta-daccess"/>
+    <w:bookmarkEnd w:id="103"/>
+    <w:bookmarkEnd w:id="104"/>
+    <w:bookmarkStart w:id="108" w:name="sec:meta-daccess"/>
     <w:p>
       <w:pPr>
         <w:pStyle w:val="berschrift4"/>
@@ -3756,7 +3797,7 @@
         <w:t xml:space="preserve">meta-daccess</w:t>
       </w:r>
     </w:p>
-    <w:bookmarkStart w:id="103" w:name="threshold-requirements-17"/>
+    <w:bookmarkStart w:id="105" w:name="threshold-requirements-17"/>
     <w:p>
       <w:pPr>
         <w:pStyle w:val="berschrift5"/>
@@ -3793,8 +3834,8 @@
         <w:t xml:space="preserve">Manual and offline interaction action (e.g., login) may be required.</w:t>
       </w:r>
     </w:p>
-    <w:bookmarkEnd w:id="103"/>
-    <w:bookmarkStart w:id="104" w:name="goal-requirements-17"/>
+    <w:bookmarkEnd w:id="105"/>
+    <w:bookmarkStart w:id="106" w:name="goal-requirements-17"/>
     <w:p>
       <w:pPr>
         <w:pStyle w:val="berschrift5"/>
@@ -3814,8 +3855,8 @@
         <w:t xml:space="preserve"> </w:t>
       </w:r>
     </w:p>
-    <w:bookmarkEnd w:id="104"/>
-    <w:bookmarkStart w:id="105" w:name="assessment-17"/>
+    <w:bookmarkEnd w:id="106"/>
+    <w:bookmarkStart w:id="107" w:name="assessment-17"/>
     <w:p>
       <w:pPr>
         <w:pStyle w:val="berschrift5"/>
@@ -3879,9 +3920,9 @@
         </w:pict>
       </w:r>
     </w:p>
-    <w:bookmarkEnd w:id="105"/>
-    <w:bookmarkEnd w:id="106"/>
-    <w:bookmarkStart w:id="110" w:name="sec:meta-valpix"/>
+    <w:bookmarkEnd w:id="107"/>
+    <w:bookmarkEnd w:id="108"/>
+    <w:bookmarkStart w:id="112" w:name="sec:meta-valpix"/>
     <w:p>
       <w:pPr>
         <w:pStyle w:val="berschrift4"/>
@@ -3916,7 +3957,7 @@
         <w:t xml:space="preserve">meta-valpix</w:t>
       </w:r>
     </w:p>
-    <w:bookmarkStart w:id="107" w:name="threshold-requirements-18"/>
+    <w:bookmarkStart w:id="109" w:name="threshold-requirements-18"/>
     <w:p>
       <w:pPr>
         <w:pStyle w:val="berschrift5"/>
@@ -3950,8 +3991,8 @@
         <w:t xml:space="preserve">.</w:t>
       </w:r>
     </w:p>
-    <w:bookmarkEnd w:id="107"/>
-    <w:bookmarkStart w:id="108" w:name="goal-requirements-18"/>
+    <w:bookmarkEnd w:id="109"/>
+    <w:bookmarkStart w:id="110" w:name="goal-requirements-18"/>
     <w:p>
       <w:pPr>
         <w:pStyle w:val="berschrift5"/>
@@ -3971,8 +4012,8 @@
         <w:t xml:space="preserve"> </w:t>
       </w:r>
     </w:p>
-    <w:bookmarkEnd w:id="108"/>
-    <w:bookmarkStart w:id="109" w:name="assessment-18"/>
+    <w:bookmarkEnd w:id="110"/>
+    <w:bookmarkStart w:id="111" w:name="assessment-18"/>
     <w:p>
       <w:pPr>
         <w:pStyle w:val="berschrift5"/>
@@ -4029,10 +4070,10 @@
         <w:t xml:space="preserve">Recommended Requirement Modification:</w:t>
       </w:r>
     </w:p>
-    <w:bookmarkEnd w:id="109"/>
-    <w:bookmarkEnd w:id="110"/>
     <w:bookmarkEnd w:id="111"/>
-    <w:bookmarkStart w:id="192" w:name="sec:pxl"/>
+    <w:bookmarkEnd w:id="112"/>
+    <w:bookmarkEnd w:id="113"/>
+    <w:bookmarkStart w:id="194" w:name="sec:pxl"/>
     <w:p>
       <w:pPr>
         <w:pStyle w:val="berschrift3"/>
@@ -4094,7 +4135,7 @@
         <w:t xml:space="preserve">Information should be available in the metadata as a single DOI landing page, which may include links to further detailed documents and references to citable peer-reviewed algorithms or technical documentation.</w:t>
       </w:r>
     </w:p>
-    <w:bookmarkStart w:id="115" w:name="sec:pxl-pimemare"/>
+    <w:bookmarkStart w:id="117" w:name="sec:pxl-pimemare"/>
     <w:p>
       <w:pPr>
         <w:pStyle w:val="berschrift4"/>
@@ -4129,7 +4170,7 @@
         <w:t xml:space="preserve">pxl-pimemare</w:t>
       </w:r>
     </w:p>
-    <w:bookmarkStart w:id="112" w:name="threshold-requirements-19"/>
+    <w:bookmarkStart w:id="114" w:name="threshold-requirements-19"/>
     <w:p>
       <w:pPr>
         <w:pStyle w:val="berschrift5"/>
@@ -4146,8 +4187,8 @@
         <w:t xml:space="preserve">Metadata is provided in a structure that enables a computer algorithm to be used to consistently and automatically identify and extract each component part for further use.</w:t>
       </w:r>
     </w:p>
-    <w:bookmarkEnd w:id="112"/>
-    <w:bookmarkStart w:id="113" w:name="goal-requirements-19"/>
+    <w:bookmarkEnd w:id="114"/>
+    <w:bookmarkStart w:id="115" w:name="goal-requirements-19"/>
     <w:p>
       <w:pPr>
         <w:pStyle w:val="berschrift5"/>
@@ -4167,8 +4208,8 @@
         <w:t xml:space="preserve"> </w:t>
       </w:r>
     </w:p>
-    <w:bookmarkEnd w:id="113"/>
-    <w:bookmarkStart w:id="114" w:name="assessment-19"/>
+    <w:bookmarkEnd w:id="115"/>
+    <w:bookmarkStart w:id="116" w:name="assessment-19"/>
     <w:p>
       <w:pPr>
         <w:pStyle w:val="berschrift5"/>
@@ -4232,9 +4273,9 @@
         </w:pict>
       </w:r>
     </w:p>
-    <w:bookmarkEnd w:id="114"/>
-    <w:bookmarkEnd w:id="115"/>
-    <w:bookmarkStart w:id="119" w:name="sec:pxl-pinodat-ar"/>
+    <w:bookmarkEnd w:id="116"/>
+    <w:bookmarkEnd w:id="117"/>
+    <w:bookmarkStart w:id="121" w:name="sec:pxl-pinodat-ar"/>
     <w:p>
       <w:pPr>
         <w:pStyle w:val="berschrift4"/>
@@ -4269,7 +4310,7 @@
         <w:t xml:space="preserve">pxl-pinodat-ar</w:t>
       </w:r>
     </w:p>
-    <w:bookmarkStart w:id="116" w:name="threshold-requirements-20"/>
+    <w:bookmarkStart w:id="118" w:name="threshold-requirements-20"/>
     <w:p>
       <w:pPr>
         <w:pStyle w:val="berschrift5"/>
@@ -4286,8 +4327,8 @@
         <w:t xml:space="preserve">Pixels that do not correspond to an observation (e.g., empty pixels / invalid observations / below noise floor) are masked.</w:t>
       </w:r>
     </w:p>
-    <w:bookmarkEnd w:id="116"/>
-    <w:bookmarkStart w:id="117" w:name="goal-requirements-20"/>
+    <w:bookmarkEnd w:id="118"/>
+    <w:bookmarkStart w:id="119" w:name="goal-requirements-20"/>
     <w:p>
       <w:pPr>
         <w:pStyle w:val="berschrift5"/>
@@ -4307,8 +4348,8 @@
         <w:t xml:space="preserve"> </w:t>
       </w:r>
     </w:p>
-    <w:bookmarkEnd w:id="117"/>
-    <w:bookmarkStart w:id="118" w:name="assessment-20"/>
+    <w:bookmarkEnd w:id="119"/>
+    <w:bookmarkStart w:id="120" w:name="assessment-20"/>
     <w:p>
       <w:pPr>
         <w:pStyle w:val="berschrift5"/>
@@ -4372,9 +4413,9 @@
         </w:pict>
       </w:r>
     </w:p>
-    <w:bookmarkEnd w:id="118"/>
-    <w:bookmarkEnd w:id="119"/>
-    <w:bookmarkStart w:id="123" w:name="sec:pxl-pixass"/>
+    <w:bookmarkEnd w:id="120"/>
+    <w:bookmarkEnd w:id="121"/>
+    <w:bookmarkStart w:id="125" w:name="sec:pxl-pixass"/>
     <w:p>
       <w:pPr>
         <w:pStyle w:val="berschrift4"/>
@@ -4409,7 +4450,7 @@
         <w:t xml:space="preserve">pxl-pixass</w:t>
       </w:r>
     </w:p>
-    <w:bookmarkStart w:id="120" w:name="threshold-requirements-21"/>
+    <w:bookmarkStart w:id="122" w:name="threshold-requirements-21"/>
     <w:p>
       <w:pPr>
         <w:pStyle w:val="berschrift5"/>
@@ -4446,8 +4487,8 @@
         <w:t xml:space="preserve">This may be the result of missing ancillary data for a subset of the pixels.</w:t>
       </w:r>
     </w:p>
-    <w:bookmarkEnd w:id="120"/>
-    <w:bookmarkStart w:id="121" w:name="goal-requirements-21"/>
+    <w:bookmarkEnd w:id="122"/>
+    <w:bookmarkStart w:id="123" w:name="goal-requirements-21"/>
     <w:p>
       <w:pPr>
         <w:pStyle w:val="berschrift5"/>
@@ -4464,8 +4505,8 @@
         <w:t xml:space="preserve">Identifies which tests have and have not been successfully completed for each pixel.</w:t>
       </w:r>
     </w:p>
-    <w:bookmarkEnd w:id="121"/>
-    <w:bookmarkStart w:id="122" w:name="assessment-21"/>
+    <w:bookmarkEnd w:id="123"/>
+    <w:bookmarkStart w:id="124" w:name="assessment-21"/>
     <w:p>
       <w:pPr>
         <w:pStyle w:val="berschrift5"/>
@@ -4529,9 +4570,9 @@
         </w:pict>
       </w:r>
     </w:p>
-    <w:bookmarkEnd w:id="122"/>
-    <w:bookmarkEnd w:id="123"/>
-    <w:bookmarkStart w:id="127" w:name="sec:pxl-pisatur-ar"/>
+    <w:bookmarkEnd w:id="124"/>
+    <w:bookmarkEnd w:id="125"/>
+    <w:bookmarkStart w:id="129" w:name="sec:pxl-pisatur-ar"/>
     <w:p>
       <w:pPr>
         <w:pStyle w:val="berschrift4"/>
@@ -4566,7 +4607,7 @@
         <w:t xml:space="preserve">pxl-pisatur-ar</w:t>
       </w:r>
     </w:p>
-    <w:bookmarkStart w:id="124" w:name="threshold-requirements-22"/>
+    <w:bookmarkStart w:id="126" w:name="threshold-requirements-22"/>
     <w:p>
       <w:pPr>
         <w:pStyle w:val="berschrift5"/>
@@ -4583,8 +4624,8 @@
         <w:t xml:space="preserve">Specification of whether there is pixel radiometric saturation at Level 1 in one or more spectral bands.</w:t>
       </w:r>
     </w:p>
-    <w:bookmarkEnd w:id="124"/>
-    <w:bookmarkStart w:id="125" w:name="goal-requirements-22"/>
+    <w:bookmarkEnd w:id="126"/>
+    <w:bookmarkStart w:id="127" w:name="goal-requirements-22"/>
     <w:p>
       <w:pPr>
         <w:pStyle w:val="berschrift5"/>
@@ -4601,8 +4642,8 @@
         <w:t xml:space="preserve">As threshold, with specification of which pixels are radiometrically saturated for each spectral band.</w:t>
       </w:r>
     </w:p>
-    <w:bookmarkEnd w:id="125"/>
-    <w:bookmarkStart w:id="126" w:name="assessment-22"/>
+    <w:bookmarkEnd w:id="127"/>
+    <w:bookmarkStart w:id="128" w:name="assessment-22"/>
     <w:p>
       <w:pPr>
         <w:pStyle w:val="berschrift5"/>
@@ -4666,9 +4707,9 @@
         </w:pict>
       </w:r>
     </w:p>
-    <w:bookmarkEnd w:id="126"/>
-    <w:bookmarkEnd w:id="127"/>
-    <w:bookmarkStart w:id="131" w:name="sec:pxl-picloud-ar"/>
+    <w:bookmarkEnd w:id="128"/>
+    <w:bookmarkEnd w:id="129"/>
+    <w:bookmarkStart w:id="133" w:name="sec:pxl-picloud-ar"/>
     <w:p>
       <w:pPr>
         <w:pStyle w:val="berschrift4"/>
@@ -4703,7 +4744,7 @@
         <w:t xml:space="preserve">pxl-picloud-ar</w:t>
       </w:r>
     </w:p>
-    <w:bookmarkStart w:id="128" w:name="threshold-requirements-23"/>
+    <w:bookmarkStart w:id="130" w:name="threshold-requirements-23"/>
     <w:p>
       <w:pPr>
         <w:pStyle w:val="berschrift5"/>
@@ -4720,8 +4761,8 @@
         <w:t xml:space="preserve">Specification of whether a pixel is cloud or cloud-affected.</w:t>
       </w:r>
     </w:p>
-    <w:bookmarkEnd w:id="128"/>
-    <w:bookmarkStart w:id="129" w:name="goal-requirements-23"/>
+    <w:bookmarkEnd w:id="130"/>
+    <w:bookmarkStart w:id="131" w:name="goal-requirements-23"/>
     <w:p>
       <w:pPr>
         <w:pStyle w:val="berschrift5"/>
@@ -4838,8 +4879,8 @@
         <w:t xml:space="preserve">.</w:t>
       </w:r>
     </w:p>
-    <w:bookmarkEnd w:id="129"/>
-    <w:bookmarkStart w:id="130" w:name="assessment-23"/>
+    <w:bookmarkEnd w:id="131"/>
+    <w:bookmarkStart w:id="132" w:name="assessment-23"/>
     <w:p>
       <w:pPr>
         <w:pStyle w:val="berschrift5"/>
@@ -4903,9 +4944,9 @@
         </w:pict>
       </w:r>
     </w:p>
-    <w:bookmarkEnd w:id="130"/>
-    <w:bookmarkEnd w:id="131"/>
-    <w:bookmarkStart w:id="135" w:name="sec:pxl-picloudsh-ar"/>
+    <w:bookmarkEnd w:id="132"/>
+    <w:bookmarkEnd w:id="133"/>
+    <w:bookmarkStart w:id="137" w:name="sec:pxl-picloudsh-ar"/>
     <w:p>
       <w:pPr>
         <w:pStyle w:val="berschrift4"/>
@@ -4940,7 +4981,7 @@
         <w:t xml:space="preserve">pxl-picloudsh-ar</w:t>
       </w:r>
     </w:p>
-    <w:bookmarkStart w:id="132" w:name="threshold-requirements-24"/>
+    <w:bookmarkStart w:id="134" w:name="threshold-requirements-24"/>
     <w:p>
       <w:pPr>
         <w:pStyle w:val="berschrift5"/>
@@ -4957,8 +4998,8 @@
         <w:t xml:space="preserve">Specification of whether a pixel is cloud shadow or cloud shadow-affected.</w:t>
       </w:r>
     </w:p>
-    <w:bookmarkEnd w:id="132"/>
-    <w:bookmarkStart w:id="133" w:name="goal-requirements-24"/>
+    <w:bookmarkEnd w:id="134"/>
+    <w:bookmarkStart w:id="135" w:name="goal-requirements-24"/>
     <w:p>
       <w:pPr>
         <w:pStyle w:val="berschrift5"/>
@@ -4978,8 +5019,8 @@
         <w:t xml:space="preserve"> </w:t>
       </w:r>
     </w:p>
-    <w:bookmarkEnd w:id="133"/>
-    <w:bookmarkStart w:id="134" w:name="assessment-24"/>
+    <w:bookmarkEnd w:id="135"/>
+    <w:bookmarkStart w:id="136" w:name="assessment-24"/>
     <w:p>
       <w:pPr>
         <w:pStyle w:val="berschrift5"/>
@@ -5043,9 +5084,9 @@
         </w:pict>
       </w:r>
     </w:p>
-    <w:bookmarkEnd w:id="134"/>
-    <w:bookmarkEnd w:id="135"/>
-    <w:bookmarkStart w:id="139" w:name="sec:pxl-lawama-ar"/>
+    <w:bookmarkEnd w:id="136"/>
+    <w:bookmarkEnd w:id="137"/>
+    <w:bookmarkStart w:id="141" w:name="sec:pxl-lawama-ar"/>
     <w:p>
       <w:pPr>
         <w:pStyle w:val="berschrift4"/>
@@ -5080,7 +5121,7 @@
         <w:t xml:space="preserve">pxl-lawama-ar</w:t>
       </w:r>
     </w:p>
-    <w:bookmarkStart w:id="136" w:name="threshold-requirements-25"/>
+    <w:bookmarkStart w:id="138" w:name="threshold-requirements-25"/>
     <w:p>
       <w:pPr>
         <w:pStyle w:val="berschrift5"/>
@@ -5177,8 +5218,8 @@
         <w:t xml:space="preserve">.</w:t>
       </w:r>
     </w:p>
-    <w:bookmarkEnd w:id="136"/>
-    <w:bookmarkStart w:id="137" w:name="goal-requirements-25"/>
+    <w:bookmarkEnd w:id="138"/>
+    <w:bookmarkStart w:id="139" w:name="goal-requirements-25"/>
     <w:p>
       <w:pPr>
         <w:pStyle w:val="berschrift5"/>
@@ -5198,8 +5239,8 @@
         <w:t xml:space="preserve"> </w:t>
       </w:r>
     </w:p>
-    <w:bookmarkEnd w:id="137"/>
-    <w:bookmarkStart w:id="138" w:name="assessment-25"/>
+    <w:bookmarkEnd w:id="139"/>
+    <w:bookmarkStart w:id="140" w:name="assessment-25"/>
     <w:p>
       <w:pPr>
         <w:pStyle w:val="berschrift5"/>
@@ -5263,9 +5304,9 @@
         </w:pict>
       </w:r>
     </w:p>
-    <w:bookmarkEnd w:id="138"/>
-    <w:bookmarkEnd w:id="139"/>
-    <w:bookmarkStart w:id="143" w:name="sec:pxl-pice"/>
+    <w:bookmarkEnd w:id="140"/>
+    <w:bookmarkEnd w:id="141"/>
+    <w:bookmarkStart w:id="145" w:name="sec:pxl-pice"/>
     <w:p>
       <w:pPr>
         <w:pStyle w:val="berschrift4"/>
@@ -5300,7 +5341,7 @@
         <w:t xml:space="preserve">pxl-pice</w:t>
       </w:r>
     </w:p>
-    <w:bookmarkStart w:id="140" w:name="threshold-requirements-26"/>
+    <w:bookmarkStart w:id="142" w:name="threshold-requirements-26"/>
     <w:p>
       <w:pPr>
         <w:pStyle w:val="berschrift5"/>
@@ -5457,8 +5498,8 @@
         <w:t xml:space="preserve">.</w:t>
       </w:r>
     </w:p>
-    <w:bookmarkEnd w:id="140"/>
-    <w:bookmarkStart w:id="141" w:name="goal-requirements-26"/>
+    <w:bookmarkEnd w:id="142"/>
+    <w:bookmarkStart w:id="143" w:name="goal-requirements-26"/>
     <w:p>
       <w:pPr>
         <w:pStyle w:val="berschrift5"/>
@@ -5478,8 +5519,8 @@
         <w:t xml:space="preserve"> </w:t>
       </w:r>
     </w:p>
-    <w:bookmarkEnd w:id="141"/>
-    <w:bookmarkStart w:id="142" w:name="assessment-26"/>
+    <w:bookmarkEnd w:id="143"/>
+    <w:bookmarkStart w:id="144" w:name="assessment-26"/>
     <w:p>
       <w:pPr>
         <w:pStyle w:val="berschrift5"/>
@@ -5543,9 +5584,9 @@
         </w:pict>
       </w:r>
     </w:p>
-    <w:bookmarkEnd w:id="142"/>
-    <w:bookmarkEnd w:id="143"/>
-    <w:bookmarkStart w:id="147" w:name="sec:pxl-pisungli"/>
+    <w:bookmarkEnd w:id="144"/>
+    <w:bookmarkEnd w:id="145"/>
+    <w:bookmarkStart w:id="149" w:name="sec:pxl-pisungli"/>
     <w:p>
       <w:pPr>
         <w:pStyle w:val="berschrift4"/>
@@ -5580,7 +5621,7 @@
         <w:t xml:space="preserve">pxl-pisungli</w:t>
       </w:r>
     </w:p>
-    <w:bookmarkStart w:id="144" w:name="threshold-requirements-27"/>
+    <w:bookmarkStart w:id="146" w:name="threshold-requirements-27"/>
     <w:p>
       <w:pPr>
         <w:pStyle w:val="berschrift5"/>
@@ -5689,8 +5730,8 @@
         <w:t xml:space="preserve">.</w:t>
       </w:r>
     </w:p>
-    <w:bookmarkEnd w:id="144"/>
-    <w:bookmarkStart w:id="145" w:name="goal-requirements-27"/>
+    <w:bookmarkEnd w:id="146"/>
+    <w:bookmarkStart w:id="147" w:name="goal-requirements-27"/>
     <w:p>
       <w:pPr>
         <w:pStyle w:val="berschrift5"/>
@@ -5779,8 +5820,8 @@
         <w:t xml:space="preserve">.</w:t>
       </w:r>
     </w:p>
-    <w:bookmarkEnd w:id="145"/>
-    <w:bookmarkStart w:id="146" w:name="assessment-27"/>
+    <w:bookmarkEnd w:id="147"/>
+    <w:bookmarkStart w:id="148" w:name="assessment-27"/>
     <w:p>
       <w:pPr>
         <w:pStyle w:val="berschrift5"/>
@@ -5844,9 +5885,9 @@
         </w:pict>
       </w:r>
     </w:p>
-    <w:bookmarkEnd w:id="146"/>
-    <w:bookmarkEnd w:id="147"/>
-    <w:bookmarkStart w:id="151" w:name="sec:pxl-piskygli"/>
+    <w:bookmarkEnd w:id="148"/>
+    <w:bookmarkEnd w:id="149"/>
+    <w:bookmarkStart w:id="153" w:name="sec:pxl-piskygli"/>
     <w:p>
       <w:pPr>
         <w:pStyle w:val="berschrift4"/>
@@ -5881,7 +5922,7 @@
         <w:t xml:space="preserve">pxl-piskygli</w:t>
       </w:r>
     </w:p>
-    <w:bookmarkStart w:id="148" w:name="threshold-requirements-28"/>
+    <w:bookmarkStart w:id="150" w:name="threshold-requirements-28"/>
     <w:p>
       <w:pPr>
         <w:pStyle w:val="berschrift5"/>
@@ -5901,8 +5942,8 @@
         <w:t xml:space="preserve"> </w:t>
       </w:r>
     </w:p>
-    <w:bookmarkEnd w:id="148"/>
-    <w:bookmarkStart w:id="149" w:name="goal-requirements-28"/>
+    <w:bookmarkEnd w:id="150"/>
+    <w:bookmarkStart w:id="151" w:name="goal-requirements-28"/>
     <w:p>
       <w:pPr>
         <w:pStyle w:val="berschrift5"/>
@@ -6020,8 +6061,8 @@
         <w:t xml:space="preserve">.</w:t>
       </w:r>
     </w:p>
-    <w:bookmarkEnd w:id="149"/>
-    <w:bookmarkStart w:id="150" w:name="assessment-28"/>
+    <w:bookmarkEnd w:id="151"/>
+    <w:bookmarkStart w:id="152" w:name="assessment-28"/>
     <w:p>
       <w:pPr>
         <w:pStyle w:val="berschrift5"/>
@@ -6085,9 +6126,9 @@
         </w:pict>
       </w:r>
     </w:p>
-    <w:bookmarkEnd w:id="150"/>
-    <w:bookmarkEnd w:id="151"/>
-    <w:bookmarkStart w:id="155" w:name="sec:pxl-vigeso-ar"/>
+    <w:bookmarkEnd w:id="152"/>
+    <w:bookmarkEnd w:id="153"/>
+    <w:bookmarkStart w:id="157" w:name="sec:pxl-vigeso-ar"/>
     <w:p>
       <w:pPr>
         <w:pStyle w:val="berschrift4"/>
@@ -6122,7 +6163,7 @@
         <w:t xml:space="preserve">pxl-vigeso-ar</w:t>
       </w:r>
     </w:p>
-    <w:bookmarkStart w:id="152" w:name="threshold-requirements-29"/>
+    <w:bookmarkStart w:id="154" w:name="threshold-requirements-29"/>
     <w:p>
       <w:pPr>
         <w:pStyle w:val="berschrift5"/>
@@ -6139,8 +6180,8 @@
         <w:t xml:space="preserve">Specification of the solar and sensor viewing azimuth and zenith angles.</w:t>
       </w:r>
     </w:p>
-    <w:bookmarkEnd w:id="152"/>
-    <w:bookmarkStart w:id="153" w:name="goal-requirements-29"/>
+    <w:bookmarkEnd w:id="154"/>
+    <w:bookmarkStart w:id="155" w:name="goal-requirements-29"/>
     <w:p>
       <w:pPr>
         <w:pStyle w:val="berschrift5"/>
@@ -6160,8 +6201,8 @@
         <w:t xml:space="preserve"> </w:t>
       </w:r>
     </w:p>
-    <w:bookmarkEnd w:id="153"/>
-    <w:bookmarkStart w:id="154" w:name="assessment-29"/>
+    <w:bookmarkEnd w:id="155"/>
+    <w:bookmarkStart w:id="156" w:name="assessment-29"/>
     <w:p>
       <w:pPr>
         <w:pStyle w:val="berschrift5"/>
@@ -6225,9 +6266,9 @@
         </w:pict>
       </w:r>
     </w:p>
-    <w:bookmarkEnd w:id="154"/>
-    <w:bookmarkEnd w:id="155"/>
-    <w:bookmarkStart w:id="159" w:name="sec:pxl-piwhifo"/>
+    <w:bookmarkEnd w:id="156"/>
+    <w:bookmarkEnd w:id="157"/>
+    <w:bookmarkStart w:id="161" w:name="sec:pxl-piwhifo"/>
     <w:p>
       <w:pPr>
         <w:pStyle w:val="berschrift4"/>
@@ -6262,7 +6303,7 @@
         <w:t xml:space="preserve">pxl-piwhifo</w:t>
       </w:r>
     </w:p>
-    <w:bookmarkStart w:id="156" w:name="threshold-requirements-30"/>
+    <w:bookmarkStart w:id="158" w:name="threshold-requirements-30"/>
     <w:p>
       <w:pPr>
         <w:pStyle w:val="berschrift5"/>
@@ -6282,8 +6323,8 @@
         <w:t xml:space="preserve"> </w:t>
       </w:r>
     </w:p>
-    <w:bookmarkEnd w:id="156"/>
-    <w:bookmarkStart w:id="157" w:name="goal-requirements-30"/>
+    <w:bookmarkEnd w:id="158"/>
+    <w:bookmarkStart w:id="159" w:name="goal-requirements-30"/>
     <w:p>
       <w:pPr>
         <w:pStyle w:val="berschrift5"/>
@@ -6483,8 +6524,8 @@
         <w:t xml:space="preserve">.</w:t>
       </w:r>
     </w:p>
-    <w:bookmarkEnd w:id="157"/>
-    <w:bookmarkStart w:id="158" w:name="assessment-30"/>
+    <w:bookmarkEnd w:id="159"/>
+    <w:bookmarkStart w:id="160" w:name="assessment-30"/>
     <w:p>
       <w:pPr>
         <w:pStyle w:val="berschrift5"/>
@@ -6548,9 +6589,9 @@
         </w:pict>
       </w:r>
     </w:p>
-    <w:bookmarkEnd w:id="158"/>
-    <w:bookmarkEnd w:id="159"/>
-    <w:bookmarkStart w:id="163" w:name="sec:pxl-paodpara"/>
+    <w:bookmarkEnd w:id="160"/>
+    <w:bookmarkEnd w:id="161"/>
+    <w:bookmarkStart w:id="165" w:name="sec:pxl-paodpara"/>
     <w:p>
       <w:pPr>
         <w:pStyle w:val="berschrift4"/>
@@ -6585,7 +6626,7 @@
         <w:t xml:space="preserve">pxl-paodpara</w:t>
       </w:r>
     </w:p>
-    <w:bookmarkStart w:id="160" w:name="threshold-requirements-31"/>
+    <w:bookmarkStart w:id="162" w:name="threshold-requirements-31"/>
     <w:p>
       <w:pPr>
         <w:pStyle w:val="berschrift5"/>
@@ -6605,8 +6646,8 @@
         <w:t xml:space="preserve"> </w:t>
       </w:r>
     </w:p>
-    <w:bookmarkEnd w:id="160"/>
-    <w:bookmarkStart w:id="161" w:name="goal-requirements-31"/>
+    <w:bookmarkEnd w:id="162"/>
+    <w:bookmarkStart w:id="163" w:name="goal-requirements-31"/>
     <w:p>
       <w:pPr>
         <w:pStyle w:val="berschrift5"/>
@@ -6643,8 +6684,8 @@
         <w:t xml:space="preserve">This might be an input or an output parameter.</w:t>
       </w:r>
     </w:p>
-    <w:bookmarkEnd w:id="161"/>
-    <w:bookmarkStart w:id="162" w:name="assessment-31"/>
+    <w:bookmarkEnd w:id="163"/>
+    <w:bookmarkStart w:id="164" w:name="assessment-31"/>
     <w:p>
       <w:pPr>
         <w:pStyle w:val="berschrift5"/>
@@ -6708,9 +6749,9 @@
         </w:pict>
       </w:r>
     </w:p>
-    <w:bookmarkEnd w:id="162"/>
-    <w:bookmarkEnd w:id="163"/>
-    <w:bookmarkStart w:id="167" w:name="sec:pxl-pajdeff"/>
+    <w:bookmarkEnd w:id="164"/>
+    <w:bookmarkEnd w:id="165"/>
+    <w:bookmarkStart w:id="169" w:name="sec:pxl-pajdeff"/>
     <w:p>
       <w:pPr>
         <w:pStyle w:val="berschrift4"/>
@@ -6745,7 +6786,7 @@
         <w:t xml:space="preserve">pxl-pajdeff</w:t>
       </w:r>
     </w:p>
-    <w:bookmarkStart w:id="164" w:name="threshold-requirements-32"/>
+    <w:bookmarkStart w:id="166" w:name="threshold-requirements-32"/>
     <w:p>
       <w:pPr>
         <w:pStyle w:val="berschrift5"/>
@@ -6765,8 +6806,8 @@
         <w:t xml:space="preserve"> </w:t>
       </w:r>
     </w:p>
-    <w:bookmarkEnd w:id="164"/>
-    <w:bookmarkStart w:id="165" w:name="goal-requirements-32"/>
+    <w:bookmarkEnd w:id="166"/>
+    <w:bookmarkStart w:id="167" w:name="goal-requirements-32"/>
     <w:p>
       <w:pPr>
         <w:pStyle w:val="berschrift5"/>
@@ -6915,8 +6956,8 @@
         <w:t xml:space="preserve">.</w:t>
       </w:r>
     </w:p>
-    <w:bookmarkEnd w:id="165"/>
-    <w:bookmarkStart w:id="166" w:name="assessment-32"/>
+    <w:bookmarkEnd w:id="167"/>
+    <w:bookmarkStart w:id="168" w:name="assessment-32"/>
     <w:p>
       <w:pPr>
         <w:pStyle w:val="berschrift5"/>
@@ -6980,9 +7021,9 @@
         </w:pict>
       </w:r>
     </w:p>
-    <w:bookmarkEnd w:id="166"/>
-    <w:bookmarkEnd w:id="167"/>
-    <w:bookmarkStart w:id="171" w:name="sec:pxl-floatveg"/>
+    <w:bookmarkEnd w:id="168"/>
+    <w:bookmarkEnd w:id="169"/>
+    <w:bookmarkStart w:id="173" w:name="sec:pxl-floatveg"/>
     <w:p>
       <w:pPr>
         <w:pStyle w:val="berschrift4"/>
@@ -7017,7 +7058,7 @@
         <w:t xml:space="preserve">pxl-floatveg</w:t>
       </w:r>
     </w:p>
-    <w:bookmarkStart w:id="168" w:name="threshold-requirements-33"/>
+    <w:bookmarkStart w:id="170" w:name="threshold-requirements-33"/>
     <w:p>
       <w:pPr>
         <w:pStyle w:val="berschrift5"/>
@@ -7174,8 +7215,8 @@
         <w:t xml:space="preserve">.</w:t>
       </w:r>
     </w:p>
-    <w:bookmarkEnd w:id="168"/>
-    <w:bookmarkStart w:id="169" w:name="goal-requirements-33"/>
+    <w:bookmarkEnd w:id="170"/>
+    <w:bookmarkStart w:id="171" w:name="goal-requirements-33"/>
     <w:p>
       <w:pPr>
         <w:pStyle w:val="berschrift5"/>
@@ -7195,8 +7236,8 @@
         <w:t xml:space="preserve"> </w:t>
       </w:r>
     </w:p>
-    <w:bookmarkEnd w:id="169"/>
-    <w:bookmarkStart w:id="170" w:name="assessment-33"/>
+    <w:bookmarkEnd w:id="171"/>
+    <w:bookmarkStart w:id="172" w:name="assessment-33"/>
     <w:p>
       <w:pPr>
         <w:pStyle w:val="berschrift5"/>
@@ -7260,9 +7301,9 @@
         </w:pict>
       </w:r>
     </w:p>
-    <w:bookmarkEnd w:id="170"/>
-    <w:bookmarkEnd w:id="171"/>
-    <w:bookmarkStart w:id="175" w:name="sec:pxl-pibathy"/>
+    <w:bookmarkEnd w:id="172"/>
+    <w:bookmarkEnd w:id="173"/>
+    <w:bookmarkStart w:id="177" w:name="sec:pxl-pibathy"/>
     <w:p>
       <w:pPr>
         <w:pStyle w:val="berschrift4"/>
@@ -7297,7 +7338,7 @@
         <w:t xml:space="preserve">pxl-pibathy</w:t>
       </w:r>
     </w:p>
-    <w:bookmarkStart w:id="172" w:name="threshold-requirements-34"/>
+    <w:bookmarkStart w:id="174" w:name="threshold-requirements-34"/>
     <w:p>
       <w:pPr>
         <w:pStyle w:val="berschrift5"/>
@@ -7317,8 +7358,8 @@
         <w:t xml:space="preserve"> </w:t>
       </w:r>
     </w:p>
-    <w:bookmarkEnd w:id="172"/>
-    <w:bookmarkStart w:id="173" w:name="goal-requirements-34"/>
+    <w:bookmarkEnd w:id="174"/>
+    <w:bookmarkStart w:id="175" w:name="goal-requirements-34"/>
     <w:p>
       <w:pPr>
         <w:pStyle w:val="berschrift5"/>
@@ -7499,8 +7540,8 @@
         <w:t xml:space="preserve">.</w:t>
       </w:r>
     </w:p>
-    <w:bookmarkEnd w:id="173"/>
-    <w:bookmarkStart w:id="174" w:name="assessment-34"/>
+    <w:bookmarkEnd w:id="175"/>
+    <w:bookmarkStart w:id="176" w:name="assessment-34"/>
     <w:p>
       <w:pPr>
         <w:pStyle w:val="berschrift5"/>
@@ -7564,9 +7605,9 @@
         </w:pict>
       </w:r>
     </w:p>
-    <w:bookmarkEnd w:id="174"/>
-    <w:bookmarkEnd w:id="175"/>
-    <w:bookmarkStart w:id="179" w:name="sec:pxl-podosas"/>
+    <w:bookmarkEnd w:id="176"/>
+    <w:bookmarkEnd w:id="177"/>
+    <w:bookmarkStart w:id="181" w:name="sec:pxl-podosas"/>
     <w:p>
       <w:pPr>
         <w:pStyle w:val="berschrift4"/>
@@ -7601,7 +7642,7 @@
         <w:t xml:space="preserve">pxl-podosas</w:t>
       </w:r>
     </w:p>
-    <w:bookmarkStart w:id="176" w:name="threshold-requirements-35"/>
+    <w:bookmarkStart w:id="178" w:name="threshold-requirements-35"/>
     <w:p>
       <w:pPr>
         <w:pStyle w:val="berschrift5"/>
@@ -7658,8 +7699,8 @@
         <w:t xml:space="preserve">.</w:t>
       </w:r>
     </w:p>
-    <w:bookmarkEnd w:id="176"/>
-    <w:bookmarkStart w:id="177" w:name="goal-requirements-35"/>
+    <w:bookmarkEnd w:id="178"/>
+    <w:bookmarkStart w:id="179" w:name="goal-requirements-35"/>
     <w:p>
       <w:pPr>
         <w:pStyle w:val="berschrift5"/>
@@ -7756,8 +7797,8 @@
         <w:t xml:space="preserve">.</w:t>
       </w:r>
     </w:p>
-    <w:bookmarkEnd w:id="177"/>
-    <w:bookmarkStart w:id="178" w:name="assessment-35"/>
+    <w:bookmarkEnd w:id="179"/>
+    <w:bookmarkStart w:id="180" w:name="assessment-35"/>
     <w:p>
       <w:pPr>
         <w:pStyle w:val="berschrift5"/>
@@ -7821,9 +7862,9 @@
         </w:pict>
       </w:r>
     </w:p>
-    <w:bookmarkEnd w:id="178"/>
-    <w:bookmarkEnd w:id="179"/>
-    <w:bookmarkStart w:id="183" w:name="sec:pxl-powaty"/>
+    <w:bookmarkEnd w:id="180"/>
+    <w:bookmarkEnd w:id="181"/>
+    <w:bookmarkStart w:id="185" w:name="sec:pxl-powaty"/>
     <w:p>
       <w:pPr>
         <w:pStyle w:val="berschrift4"/>
@@ -7858,7 +7899,7 @@
         <w:t xml:space="preserve">pxl-powaty</w:t>
       </w:r>
     </w:p>
-    <w:bookmarkStart w:id="180" w:name="threshold-requirements-36"/>
+    <w:bookmarkStart w:id="182" w:name="threshold-requirements-36"/>
     <w:p>
       <w:pPr>
         <w:pStyle w:val="berschrift5"/>
@@ -7915,8 +7956,8 @@
         <w:t xml:space="preserve">.</w:t>
       </w:r>
     </w:p>
-    <w:bookmarkEnd w:id="180"/>
-    <w:bookmarkStart w:id="181" w:name="goal-requirements-36"/>
+    <w:bookmarkEnd w:id="182"/>
+    <w:bookmarkStart w:id="183" w:name="goal-requirements-36"/>
     <w:p>
       <w:pPr>
         <w:pStyle w:val="berschrift5"/>
@@ -7936,8 +7977,8 @@
         <w:t xml:space="preserve"> </w:t>
       </w:r>
     </w:p>
-    <w:bookmarkEnd w:id="181"/>
-    <w:bookmarkStart w:id="182" w:name="assessment-36"/>
+    <w:bookmarkEnd w:id="183"/>
+    <w:bookmarkStart w:id="184" w:name="assessment-36"/>
     <w:p>
       <w:pPr>
         <w:pStyle w:val="berschrift5"/>
@@ -8001,9 +8042,9 @@
         </w:pict>
       </w:r>
     </w:p>
-    <w:bookmarkEnd w:id="182"/>
-    <w:bookmarkEnd w:id="183"/>
-    <w:bookmarkStart w:id="187" w:name="sec:pxl-pituwa"/>
+    <w:bookmarkEnd w:id="184"/>
+    <w:bookmarkEnd w:id="185"/>
+    <w:bookmarkStart w:id="189" w:name="sec:pxl-pituwa"/>
     <w:p>
       <w:pPr>
         <w:pStyle w:val="berschrift4"/>
@@ -8038,7 +8079,7 @@
         <w:t xml:space="preserve">pxl-pituwa</w:t>
       </w:r>
     </w:p>
-    <w:bookmarkStart w:id="184" w:name="threshold-requirements-37"/>
+    <w:bookmarkStart w:id="186" w:name="threshold-requirements-37"/>
     <w:p>
       <w:pPr>
         <w:pStyle w:val="berschrift5"/>
@@ -8190,8 +8231,8 @@
         <w:t xml:space="preserve">, respectively.</w:t>
       </w:r>
     </w:p>
-    <w:bookmarkEnd w:id="184"/>
-    <w:bookmarkStart w:id="185" w:name="goal-requirements-37"/>
+    <w:bookmarkEnd w:id="186"/>
+    <w:bookmarkStart w:id="187" w:name="goal-requirements-37"/>
     <w:p>
       <w:pPr>
         <w:pStyle w:val="berschrift5"/>
@@ -8211,8 +8252,8 @@
         <w:t xml:space="preserve"> </w:t>
       </w:r>
     </w:p>
-    <w:bookmarkEnd w:id="185"/>
-    <w:bookmarkStart w:id="186" w:name="assessment-37"/>
+    <w:bookmarkEnd w:id="187"/>
+    <w:bookmarkStart w:id="188" w:name="assessment-37"/>
     <w:p>
       <w:pPr>
         <w:pStyle w:val="berschrift5"/>
@@ -8276,9 +8317,9 @@
         </w:pict>
       </w:r>
     </w:p>
-    <w:bookmarkEnd w:id="186"/>
-    <w:bookmarkEnd w:id="187"/>
-    <w:bookmarkStart w:id="191" w:name="sec:pxl-piwaele"/>
+    <w:bookmarkEnd w:id="188"/>
+    <w:bookmarkEnd w:id="189"/>
+    <w:bookmarkStart w:id="193" w:name="sec:pxl-piwaele"/>
     <w:p>
       <w:pPr>
         <w:pStyle w:val="berschrift4"/>
@@ -8313,7 +8354,7 @@
         <w:t xml:space="preserve">pxl-piwaele</w:t>
       </w:r>
     </w:p>
-    <w:bookmarkStart w:id="188" w:name="threshold-requirements-38"/>
+    <w:bookmarkStart w:id="190" w:name="threshold-requirements-38"/>
     <w:p>
       <w:pPr>
         <w:pStyle w:val="berschrift5"/>
@@ -8370,8 +8411,8 @@
         <w:t xml:space="preserve">.</w:t>
       </w:r>
     </w:p>
-    <w:bookmarkEnd w:id="188"/>
-    <w:bookmarkStart w:id="189" w:name="goal-requirements-38"/>
+    <w:bookmarkEnd w:id="190"/>
+    <w:bookmarkStart w:id="191" w:name="goal-requirements-38"/>
     <w:p>
       <w:pPr>
         <w:pStyle w:val="berschrift5"/>
@@ -8391,8 +8432,8 @@
         <w:t xml:space="preserve"> </w:t>
       </w:r>
     </w:p>
-    <w:bookmarkEnd w:id="189"/>
-    <w:bookmarkStart w:id="190" w:name="assessment-38"/>
+    <w:bookmarkEnd w:id="191"/>
+    <w:bookmarkStart w:id="192" w:name="assessment-38"/>
     <w:p>
       <w:pPr>
         <w:pStyle w:val="berschrift5"/>
@@ -8449,10 +8490,10 @@
         <w:t xml:space="preserve">Recommended Requirement Modification:</w:t>
       </w:r>
     </w:p>
-    <w:bookmarkEnd w:id="190"/>
-    <w:bookmarkEnd w:id="191"/>
     <w:bookmarkEnd w:id="192"/>
-    <w:bookmarkStart w:id="241" w:name="sec:pral"/>
+    <w:bookmarkEnd w:id="193"/>
+    <w:bookmarkEnd w:id="194"/>
+    <w:bookmarkStart w:id="243" w:name="sec:pral"/>
     <w:p>
       <w:pPr>
         <w:pStyle w:val="berschrift3"/>
@@ -8486,7 +8527,7 @@
         <w:t xml:space="preserve">Metadata must contain a single DOI landing page with relevant information to support each requirement. For corrections, references to a citable peer-reviewed algorithm or technical documentation regarding the implementation of that algorithm and the sources of ancillary data used to make corrections/provision of parameterisation data are required. Examples of technical documentation include an Algorithm Theoretical Basis Document, product user guide, etc.</w:t>
       </w:r>
     </w:p>
-    <w:bookmarkStart w:id="196" w:name="sec:pral-measur-ar"/>
+    <w:bookmarkStart w:id="198" w:name="sec:pral-measur-ar"/>
     <w:p>
       <w:pPr>
         <w:pStyle w:val="berschrift4"/>
@@ -8521,7 +8562,7 @@
         <w:t xml:space="preserve">pral-measur-ar</w:t>
       </w:r>
     </w:p>
-    <w:bookmarkStart w:id="193" w:name="threshold-requirements-39"/>
+    <w:bookmarkStart w:id="195" w:name="threshold-requirements-39"/>
     <w:p>
       <w:pPr>
         <w:pStyle w:val="berschrift5"/>
@@ -8625,8 +8666,8 @@
         <w:t xml:space="preserve">Radiometric corrections must lead to a valid measurement of aquatic reflectance.</w:t>
       </w:r>
     </w:p>
-    <w:bookmarkEnd w:id="193"/>
-    <w:bookmarkStart w:id="194" w:name="goal-requirements-39"/>
+    <w:bookmarkEnd w:id="195"/>
+    <w:bookmarkStart w:id="196" w:name="goal-requirements-39"/>
     <w:p>
       <w:pPr>
         <w:pStyle w:val="berschrift5"/>
@@ -8697,8 +8738,8 @@
         <w:t xml:space="preserve">”</w:t>
       </w:r>
     </w:p>
-    <w:bookmarkEnd w:id="194"/>
-    <w:bookmarkStart w:id="195" w:name="assessment-39"/>
+    <w:bookmarkEnd w:id="196"/>
+    <w:bookmarkStart w:id="197" w:name="assessment-39"/>
     <w:p>
       <w:pPr>
         <w:pStyle w:val="berschrift5"/>
@@ -8762,9 +8803,9 @@
         </w:pict>
       </w:r>
     </w:p>
-    <w:bookmarkEnd w:id="195"/>
-    <w:bookmarkEnd w:id="196"/>
-    <w:bookmarkStart w:id="200" w:name="sec:pral-muncer-ar"/>
+    <w:bookmarkEnd w:id="197"/>
+    <w:bookmarkEnd w:id="198"/>
+    <w:bookmarkStart w:id="202" w:name="sec:pral-muncer-ar"/>
     <w:p>
       <w:pPr>
         <w:pStyle w:val="berschrift4"/>
@@ -8799,7 +8840,7 @@
         <w:t xml:space="preserve">pral-muncer-ar</w:t>
       </w:r>
     </w:p>
-    <w:bookmarkStart w:id="197" w:name="threshold-requirements-40"/>
+    <w:bookmarkStart w:id="199" w:name="threshold-requirements-40"/>
     <w:p>
       <w:pPr>
         <w:pStyle w:val="berschrift5"/>
@@ -8891,8 +8932,8 @@
         <w:t xml:space="preserve">.</w:t>
       </w:r>
     </w:p>
-    <w:bookmarkEnd w:id="197"/>
-    <w:bookmarkStart w:id="198" w:name="goal-requirements-40"/>
+    <w:bookmarkEnd w:id="199"/>
+    <w:bookmarkStart w:id="200" w:name="goal-requirements-40"/>
     <w:p>
       <w:pPr>
         <w:pStyle w:val="berschrift5"/>
@@ -8912,8 +8953,8 @@
         <w:t xml:space="preserve"> </w:t>
       </w:r>
     </w:p>
-    <w:bookmarkEnd w:id="198"/>
-    <w:bookmarkStart w:id="199" w:name="assessment-40"/>
+    <w:bookmarkEnd w:id="200"/>
+    <w:bookmarkStart w:id="201" w:name="assessment-40"/>
     <w:p>
       <w:pPr>
         <w:pStyle w:val="berschrift5"/>
@@ -8977,9 +9018,9 @@
         </w:pict>
       </w:r>
     </w:p>
-    <w:bookmarkEnd w:id="199"/>
-    <w:bookmarkEnd w:id="200"/>
-    <w:bookmarkStart w:id="204" w:name="sec:pral-mnormal-ar"/>
+    <w:bookmarkEnd w:id="201"/>
+    <w:bookmarkEnd w:id="202"/>
+    <w:bookmarkStart w:id="206" w:name="sec:pral-mnormal-ar"/>
     <w:p>
       <w:pPr>
         <w:pStyle w:val="berschrift4"/>
@@ -9014,7 +9055,7 @@
         <w:t xml:space="preserve">pral-mnormal-ar</w:t>
       </w:r>
     </w:p>
-    <w:bookmarkStart w:id="201" w:name="threshold-requirements-41"/>
+    <w:bookmarkStart w:id="203" w:name="threshold-requirements-41"/>
     <w:p>
       <w:pPr>
         <w:pStyle w:val="berschrift5"/>
@@ -9034,8 +9075,8 @@
         <w:t xml:space="preserve"> </w:t>
       </w:r>
     </w:p>
-    <w:bookmarkEnd w:id="201"/>
-    <w:bookmarkStart w:id="202" w:name="goal-requirements-41"/>
+    <w:bookmarkEnd w:id="203"/>
+    <w:bookmarkStart w:id="204" w:name="goal-requirements-41"/>
     <w:p>
       <w:pPr>
         <w:pStyle w:val="berschrift5"/>
@@ -9052,8 +9093,8 @@
         <w:t xml:space="preserve">Measurements are normalised (to nadir) to remove the effect of bidirectional dependence of the upwelling radiance on observation and solar-illumination geometries.</w:t>
       </w:r>
     </w:p>
-    <w:bookmarkEnd w:id="202"/>
-    <w:bookmarkStart w:id="203" w:name="assessment-41"/>
+    <w:bookmarkEnd w:id="204"/>
+    <w:bookmarkStart w:id="205" w:name="assessment-41"/>
     <w:p>
       <w:pPr>
         <w:pStyle w:val="berschrift5"/>
@@ -9117,9 +9158,9 @@
         </w:pict>
       </w:r>
     </w:p>
-    <w:bookmarkEnd w:id="203"/>
-    <w:bookmarkEnd w:id="204"/>
-    <w:bookmarkStart w:id="208" w:name="sec:pral-dirats-ar"/>
+    <w:bookmarkEnd w:id="205"/>
+    <w:bookmarkEnd w:id="206"/>
+    <w:bookmarkStart w:id="210" w:name="sec:pral-dirats-ar"/>
     <w:p>
       <w:pPr>
         <w:pStyle w:val="berschrift4"/>
@@ -9154,7 +9195,7 @@
         <w:t xml:space="preserve">pral-dirats-ar</w:t>
       </w:r>
     </w:p>
-    <w:bookmarkStart w:id="205" w:name="threshold-requirements-42"/>
+    <w:bookmarkStart w:id="207" w:name="threshold-requirements-42"/>
     <w:p>
       <w:pPr>
         <w:pStyle w:val="berschrift5"/>
@@ -9211,8 +9252,8 @@
         <w:t xml:space="preserve">.</w:t>
       </w:r>
     </w:p>
-    <w:bookmarkEnd w:id="205"/>
-    <w:bookmarkStart w:id="206" w:name="goal-requirements-42"/>
+    <w:bookmarkEnd w:id="207"/>
+    <w:bookmarkStart w:id="208" w:name="goal-requirements-42"/>
     <w:p>
       <w:pPr>
         <w:pStyle w:val="berschrift5"/>
@@ -9232,8 +9273,8 @@
         <w:t xml:space="preserve"> </w:t>
       </w:r>
     </w:p>
-    <w:bookmarkEnd w:id="206"/>
-    <w:bookmarkStart w:id="207" w:name="assessment-42"/>
+    <w:bookmarkEnd w:id="208"/>
+    <w:bookmarkStart w:id="209" w:name="assessment-42"/>
     <w:p>
       <w:pPr>
         <w:pStyle w:val="berschrift5"/>
@@ -9297,9 +9338,9 @@
         </w:pict>
       </w:r>
     </w:p>
-    <w:bookmarkEnd w:id="207"/>
-    <w:bookmarkEnd w:id="208"/>
-    <w:bookmarkStart w:id="212" w:name="sec:pral-wavap-ar"/>
+    <w:bookmarkEnd w:id="209"/>
+    <w:bookmarkEnd w:id="210"/>
+    <w:bookmarkStart w:id="214" w:name="sec:pral-wavap-ar"/>
     <w:p>
       <w:pPr>
         <w:pStyle w:val="berschrift4"/>
@@ -9334,7 +9375,7 @@
         <w:t xml:space="preserve">pral-wavap-ar</w:t>
       </w:r>
     </w:p>
-    <w:bookmarkStart w:id="209" w:name="threshold-requirements-43"/>
+    <w:bookmarkStart w:id="211" w:name="threshold-requirements-43"/>
     <w:p>
       <w:pPr>
         <w:pStyle w:val="berschrift5"/>
@@ -9351,8 +9392,8 @@
         <w:t xml:space="preserve">Corrections are applied for water vapour if spectral bands are affected.</w:t>
       </w:r>
     </w:p>
-    <w:bookmarkEnd w:id="209"/>
-    <w:bookmarkStart w:id="210" w:name="goal-requirements-43"/>
+    <w:bookmarkEnd w:id="211"/>
+    <w:bookmarkStart w:id="212" w:name="goal-requirements-43"/>
     <w:p>
       <w:pPr>
         <w:pStyle w:val="berschrift5"/>
@@ -9372,8 +9413,8 @@
         <w:t xml:space="preserve"> </w:t>
       </w:r>
     </w:p>
-    <w:bookmarkEnd w:id="210"/>
-    <w:bookmarkStart w:id="211" w:name="assessment-43"/>
+    <w:bookmarkEnd w:id="212"/>
+    <w:bookmarkStart w:id="213" w:name="assessment-43"/>
     <w:p>
       <w:pPr>
         <w:pStyle w:val="berschrift5"/>
@@ -9437,9 +9478,9 @@
         </w:pict>
       </w:r>
     </w:p>
-    <w:bookmarkEnd w:id="211"/>
-    <w:bookmarkEnd w:id="212"/>
-    <w:bookmarkStart w:id="216" w:name="sec:pral-cozone"/>
+    <w:bookmarkEnd w:id="213"/>
+    <w:bookmarkEnd w:id="214"/>
+    <w:bookmarkStart w:id="218" w:name="sec:pral-cozone"/>
     <w:p>
       <w:pPr>
         <w:pStyle w:val="berschrift4"/>
@@ -9474,7 +9515,7 @@
         <w:t xml:space="preserve">pral-cozone</w:t>
       </w:r>
     </w:p>
-    <w:bookmarkStart w:id="213" w:name="threshold-requirements-44"/>
+    <w:bookmarkStart w:id="215" w:name="threshold-requirements-44"/>
     <w:p>
       <w:pPr>
         <w:pStyle w:val="berschrift5"/>
@@ -9680,8 +9721,8 @@
         <w:t xml:space="preserve">.</w:t>
       </w:r>
     </w:p>
-    <w:bookmarkEnd w:id="213"/>
-    <w:bookmarkStart w:id="214" w:name="goal-requirements-44"/>
+    <w:bookmarkEnd w:id="215"/>
+    <w:bookmarkStart w:id="216" w:name="goal-requirements-44"/>
     <w:p>
       <w:pPr>
         <w:pStyle w:val="berschrift5"/>
@@ -9701,8 +9742,8 @@
         <w:t xml:space="preserve"> </w:t>
       </w:r>
     </w:p>
-    <w:bookmarkEnd w:id="214"/>
-    <w:bookmarkStart w:id="215" w:name="assessment-44"/>
+    <w:bookmarkEnd w:id="216"/>
+    <w:bookmarkStart w:id="217" w:name="assessment-44"/>
     <w:p>
       <w:pPr>
         <w:pStyle w:val="berschrift5"/>
@@ -9766,9 +9807,9 @@
         </w:pict>
       </w:r>
     </w:p>
-    <w:bookmarkEnd w:id="215"/>
-    <w:bookmarkEnd w:id="216"/>
-    <w:bookmarkStart w:id="220" w:name="sec:pral-ogasab"/>
+    <w:bookmarkEnd w:id="217"/>
+    <w:bookmarkEnd w:id="218"/>
+    <w:bookmarkStart w:id="222" w:name="sec:pral-ogasab"/>
     <w:p>
       <w:pPr>
         <w:pStyle w:val="berschrift4"/>
@@ -9803,7 +9844,7 @@
         <w:t xml:space="preserve">pral-ogasab</w:t>
       </w:r>
     </w:p>
-    <w:bookmarkStart w:id="217" w:name="threshold-requirements-45"/>
+    <w:bookmarkStart w:id="219" w:name="threshold-requirements-45"/>
     <w:p>
       <w:pPr>
         <w:pStyle w:val="berschrift5"/>
@@ -9823,8 +9864,8 @@
         <w:t xml:space="preserve"> </w:t>
       </w:r>
     </w:p>
-    <w:bookmarkEnd w:id="217"/>
-    <w:bookmarkStart w:id="218" w:name="goal-requirements-45"/>
+    <w:bookmarkEnd w:id="219"/>
+    <w:bookmarkStart w:id="220" w:name="goal-requirements-45"/>
     <w:p>
       <w:pPr>
         <w:pStyle w:val="berschrift5"/>
@@ -10010,8 +10051,8 @@
         <w:t xml:space="preserve">.</w:t>
       </w:r>
     </w:p>
-    <w:bookmarkEnd w:id="218"/>
-    <w:bookmarkStart w:id="219" w:name="assessment-45"/>
+    <w:bookmarkEnd w:id="220"/>
+    <w:bookmarkStart w:id="221" w:name="assessment-45"/>
     <w:p>
       <w:pPr>
         <w:pStyle w:val="berschrift5"/>
@@ -10075,9 +10116,9 @@
         </w:pict>
       </w:r>
     </w:p>
-    <w:bookmarkEnd w:id="219"/>
-    <w:bookmarkEnd w:id="220"/>
-    <w:bookmarkStart w:id="224" w:name="sec:pral-cosungli"/>
+    <w:bookmarkEnd w:id="221"/>
+    <w:bookmarkEnd w:id="222"/>
+    <w:bookmarkStart w:id="226" w:name="sec:pral-cosungli"/>
     <w:p>
       <w:pPr>
         <w:pStyle w:val="berschrift4"/>
@@ -10112,7 +10153,7 @@
         <w:t xml:space="preserve">pral-cosungli</w:t>
       </w:r>
     </w:p>
-    <w:bookmarkStart w:id="221" w:name="threshold-requirements-46"/>
+    <w:bookmarkStart w:id="223" w:name="threshold-requirements-46"/>
     <w:p>
       <w:pPr>
         <w:pStyle w:val="berschrift5"/>
@@ -10132,8 +10173,8 @@
         <w:t xml:space="preserve"> </w:t>
       </w:r>
     </w:p>
-    <w:bookmarkEnd w:id="221"/>
-    <w:bookmarkStart w:id="222" w:name="goal-requirements-46"/>
+    <w:bookmarkEnd w:id="223"/>
+    <w:bookmarkStart w:id="224" w:name="goal-requirements-46"/>
     <w:p>
       <w:pPr>
         <w:pStyle w:val="berschrift5"/>
@@ -10319,8 +10360,8 @@
         <w:t xml:space="preserve">.</w:t>
       </w:r>
     </w:p>
-    <w:bookmarkEnd w:id="222"/>
-    <w:bookmarkStart w:id="223" w:name="assessment-46"/>
+    <w:bookmarkEnd w:id="224"/>
+    <w:bookmarkStart w:id="225" w:name="assessment-46"/>
     <w:p>
       <w:pPr>
         <w:pStyle w:val="berschrift5"/>
@@ -10384,9 +10425,9 @@
         </w:pict>
       </w:r>
     </w:p>
-    <w:bookmarkEnd w:id="223"/>
-    <w:bookmarkEnd w:id="224"/>
-    <w:bookmarkStart w:id="228" w:name="sec:pral-coskygli"/>
+    <w:bookmarkEnd w:id="225"/>
+    <w:bookmarkEnd w:id="226"/>
+    <w:bookmarkStart w:id="230" w:name="sec:pral-coskygli"/>
     <w:p>
       <w:pPr>
         <w:pStyle w:val="berschrift4"/>
@@ -10421,7 +10462,7 @@
         <w:t xml:space="preserve">pral-coskygli</w:t>
       </w:r>
     </w:p>
-    <w:bookmarkStart w:id="225" w:name="threshold-requirements-47"/>
+    <w:bookmarkStart w:id="227" w:name="threshold-requirements-47"/>
     <w:p>
       <w:pPr>
         <w:pStyle w:val="berschrift5"/>
@@ -10547,8 +10588,8 @@
         <w:t xml:space="preserve">.</w:t>
       </w:r>
     </w:p>
-    <w:bookmarkEnd w:id="225"/>
-    <w:bookmarkStart w:id="226" w:name="goal-requirements-47"/>
+    <w:bookmarkEnd w:id="227"/>
+    <w:bookmarkStart w:id="228" w:name="goal-requirements-47"/>
     <w:p>
       <w:pPr>
         <w:pStyle w:val="berschrift5"/>
@@ -10565,8 +10606,8 @@
         <w:t xml:space="preserve">Sky glint is separately assessed and corrected for in the data processing. The metadata indicates the surface contributions from sky glint removed from the data.</w:t>
       </w:r>
     </w:p>
-    <w:bookmarkEnd w:id="226"/>
-    <w:bookmarkStart w:id="227" w:name="assessment-47"/>
+    <w:bookmarkEnd w:id="228"/>
+    <w:bookmarkStart w:id="229" w:name="assessment-47"/>
     <w:p>
       <w:pPr>
         <w:pStyle w:val="berschrift5"/>
@@ -10630,9 +10671,9 @@
         </w:pict>
       </w:r>
     </w:p>
-    <w:bookmarkEnd w:id="227"/>
-    <w:bookmarkEnd w:id="228"/>
-    <w:bookmarkStart w:id="232" w:name="sec:pral-cowhifo"/>
+    <w:bookmarkEnd w:id="229"/>
+    <w:bookmarkEnd w:id="230"/>
+    <w:bookmarkStart w:id="234" w:name="sec:pral-cowhifo"/>
     <w:p>
       <w:pPr>
         <w:pStyle w:val="berschrift4"/>
@@ -10667,7 +10708,7 @@
         <w:t xml:space="preserve">pral-cowhifo</w:t>
       </w:r>
     </w:p>
-    <w:bookmarkStart w:id="229" w:name="threshold-requirements-48"/>
+    <w:bookmarkStart w:id="231" w:name="threshold-requirements-48"/>
     <w:p>
       <w:pPr>
         <w:pStyle w:val="berschrift5"/>
@@ -10864,8 +10905,8 @@
         <w:t xml:space="preserve">.</w:t>
       </w:r>
     </w:p>
-    <w:bookmarkEnd w:id="229"/>
-    <w:bookmarkStart w:id="230" w:name="goal-requirements-48"/>
+    <w:bookmarkEnd w:id="231"/>
+    <w:bookmarkStart w:id="232" w:name="goal-requirements-48"/>
     <w:p>
       <w:pPr>
         <w:pStyle w:val="berschrift5"/>
@@ -10919,8 +10960,8 @@
         <w:t xml:space="preserve">.</w:t>
       </w:r>
     </w:p>
-    <w:bookmarkEnd w:id="230"/>
-    <w:bookmarkStart w:id="231" w:name="assessment-48"/>
+    <w:bookmarkEnd w:id="232"/>
+    <w:bookmarkStart w:id="233" w:name="assessment-48"/>
     <w:p>
       <w:pPr>
         <w:pStyle w:val="berschrift5"/>
@@ -10984,9 +11025,9 @@
         </w:pict>
       </w:r>
     </w:p>
-    <w:bookmarkEnd w:id="231"/>
-    <w:bookmarkEnd w:id="232"/>
-    <w:bookmarkStart w:id="236" w:name="sec:pral-cajdeff"/>
+    <w:bookmarkEnd w:id="233"/>
+    <w:bookmarkEnd w:id="234"/>
+    <w:bookmarkStart w:id="238" w:name="sec:pral-cajdeff"/>
     <w:p>
       <w:pPr>
         <w:pStyle w:val="berschrift4"/>
@@ -11021,7 +11062,7 @@
         <w:t xml:space="preserve">pral-cajdeff</w:t>
       </w:r>
     </w:p>
-    <w:bookmarkStart w:id="233" w:name="threshold-requirements-49"/>
+    <w:bookmarkStart w:id="235" w:name="threshold-requirements-49"/>
     <w:p>
       <w:pPr>
         <w:pStyle w:val="berschrift5"/>
@@ -11041,8 +11082,8 @@
         <w:t xml:space="preserve"> </w:t>
       </w:r>
     </w:p>
-    <w:bookmarkEnd w:id="233"/>
-    <w:bookmarkStart w:id="234" w:name="goal-requirements-49"/>
+    <w:bookmarkEnd w:id="235"/>
+    <w:bookmarkStart w:id="236" w:name="goal-requirements-49"/>
     <w:p>
       <w:pPr>
         <w:pStyle w:val="berschrift5"/>
@@ -11179,8 +11220,8 @@
         <w:t xml:space="preserve">.</w:t>
       </w:r>
     </w:p>
-    <w:bookmarkEnd w:id="234"/>
-    <w:bookmarkStart w:id="235" w:name="assessment-49"/>
+    <w:bookmarkEnd w:id="236"/>
+    <w:bookmarkStart w:id="237" w:name="assessment-49"/>
     <w:p>
       <w:pPr>
         <w:pStyle w:val="berschrift5"/>
@@ -11244,9 +11285,9 @@
         </w:pict>
       </w:r>
     </w:p>
-    <w:bookmarkEnd w:id="235"/>
-    <w:bookmarkEnd w:id="236"/>
-    <w:bookmarkStart w:id="240" w:name="sec:pral-cotuwa"/>
+    <w:bookmarkEnd w:id="237"/>
+    <w:bookmarkEnd w:id="238"/>
+    <w:bookmarkStart w:id="242" w:name="sec:pral-cotuwa"/>
     <w:p>
       <w:pPr>
         <w:pStyle w:val="berschrift4"/>
@@ -11281,7 +11322,7 @@
         <w:t xml:space="preserve">pral-cotuwa</w:t>
       </w:r>
     </w:p>
-    <w:bookmarkStart w:id="237" w:name="threshold-requirements-50"/>
+    <w:bookmarkStart w:id="239" w:name="threshold-requirements-50"/>
     <w:p>
       <w:pPr>
         <w:pStyle w:val="berschrift5"/>
@@ -11378,8 +11419,8 @@
         <w:t xml:space="preserve">.</w:t>
       </w:r>
     </w:p>
-    <w:bookmarkEnd w:id="237"/>
-    <w:bookmarkStart w:id="238" w:name="goal-requirements-50"/>
+    <w:bookmarkEnd w:id="239"/>
+    <w:bookmarkStart w:id="240" w:name="goal-requirements-50"/>
     <w:p>
       <w:pPr>
         <w:pStyle w:val="berschrift5"/>
@@ -11399,8 +11440,8 @@
         <w:t xml:space="preserve"> </w:t>
       </w:r>
     </w:p>
-    <w:bookmarkEnd w:id="238"/>
-    <w:bookmarkStart w:id="239" w:name="assessment-50"/>
+    <w:bookmarkEnd w:id="240"/>
+    <w:bookmarkStart w:id="241" w:name="assessment-50"/>
     <w:p>
       <w:pPr>
         <w:pStyle w:val="berschrift5"/>
@@ -11457,10 +11498,10 @@
         <w:t xml:space="preserve">Recommended Requirement Modification:</w:t>
       </w:r>
     </w:p>
-    <w:bookmarkEnd w:id="239"/>
-    <w:bookmarkEnd w:id="240"/>
     <w:bookmarkEnd w:id="241"/>
-    <w:bookmarkStart w:id="250" w:name="sec:gcom"/>
+    <w:bookmarkEnd w:id="242"/>
+    <w:bookmarkEnd w:id="243"/>
+    <w:bookmarkStart w:id="252" w:name="sec:gcom"/>
     <w:p>
       <w:pPr>
         <w:pStyle w:val="berschrift3"/>
@@ -11506,7 +11547,7 @@
         <w:t xml:space="preserve">applies to that imagery.</w:t>
       </w:r>
     </w:p>
-    <w:bookmarkStart w:id="245" w:name="sec:gcom-geocorr-ar"/>
+    <w:bookmarkStart w:id="247" w:name="sec:gcom-geocorr-ar"/>
     <w:p>
       <w:pPr>
         <w:pStyle w:val="berschrift4"/>
@@ -11573,7 +11614,7 @@
         <w:t xml:space="preserve">inland waters where an independent terrestrial referencing system is available</w:t>
       </w:r>
     </w:p>
-    <w:bookmarkStart w:id="242" w:name="threshold-requirements-51"/>
+    <w:bookmarkStart w:id="244" w:name="threshold-requirements-51"/>
     <w:p>
       <w:pPr>
         <w:pStyle w:val="berschrift5"/>
@@ -11715,8 +11756,8 @@
         <w:t xml:space="preserve">It is useful to note if the sensor is used at its native resolution before geometric correction or that some resampling must be done.</w:t>
       </w:r>
     </w:p>
-    <w:bookmarkEnd w:id="242"/>
-    <w:bookmarkStart w:id="243" w:name="goal-requirements-51"/>
+    <w:bookmarkEnd w:id="244"/>
+    <w:bookmarkStart w:id="245" w:name="goal-requirements-51"/>
     <w:p>
       <w:pPr>
         <w:pStyle w:val="berschrift5"/>
@@ -11798,8 +11839,8 @@
         <w:t xml:space="preserve">This requirement is intended to enable interoperability between imagery from different platforms that meet this level of correction and with non-image spatial data such as GIS layers and terrain models.</w:t>
       </w:r>
     </w:p>
-    <w:bookmarkEnd w:id="243"/>
-    <w:bookmarkStart w:id="244" w:name="assessment-51"/>
+    <w:bookmarkEnd w:id="245"/>
+    <w:bookmarkStart w:id="246" w:name="assessment-51"/>
     <w:p>
       <w:pPr>
         <w:pStyle w:val="berschrift5"/>
@@ -11863,9 +11904,9 @@
         </w:pict>
       </w:r>
     </w:p>
-    <w:bookmarkEnd w:id="244"/>
-    <w:bookmarkEnd w:id="245"/>
-    <w:bookmarkStart w:id="249" w:name="sec:gcom-corore"/>
+    <w:bookmarkEnd w:id="246"/>
+    <w:bookmarkEnd w:id="247"/>
+    <w:bookmarkStart w:id="251" w:name="sec:gcom-corore"/>
     <w:p>
       <w:pPr>
         <w:pStyle w:val="berschrift4"/>
@@ -11900,7 +11941,7 @@
         <w:t xml:space="preserve">gcom-corore</w:t>
       </w:r>
     </w:p>
-    <w:bookmarkStart w:id="246" w:name="threshold-requirements-52"/>
+    <w:bookmarkStart w:id="248" w:name="threshold-requirements-52"/>
     <w:p>
       <w:pPr>
         <w:pStyle w:val="berschrift5"/>
@@ -11953,8 +11994,8 @@
         <w:t xml:space="preserve">Including but not limited to ocean-to-sea to coastal, estuarine, deltaic, lagoonal waters and inland water bodies such as canals, rivers, lakes and reservoirs.</w:t>
       </w:r>
     </w:p>
-    <w:bookmarkEnd w:id="246"/>
-    <w:bookmarkStart w:id="247" w:name="goal-requirements-52"/>
+    <w:bookmarkEnd w:id="248"/>
+    <w:bookmarkStart w:id="249" w:name="goal-requirements-52"/>
     <w:p>
       <w:pPr>
         <w:pStyle w:val="berschrift5"/>
@@ -11987,8 +12028,8 @@
         <w:t xml:space="preserve">The specifications of the co-registration and ortho-rectification processing (including parameterisation data) must be provided, including the estimated uncertainty of each processing, in publicly available documentation.</w:t>
       </w:r>
     </w:p>
-    <w:bookmarkEnd w:id="247"/>
-    <w:bookmarkStart w:id="248" w:name="assessment-52"/>
+    <w:bookmarkEnd w:id="249"/>
+    <w:bookmarkStart w:id="250" w:name="assessment-52"/>
     <w:p>
       <w:pPr>
         <w:pStyle w:val="berschrift5"/>
@@ -12050,11 +12091,11 @@
         <w:br w:type="page"/>
       </w:r>
     </w:p>
-    <w:bookmarkEnd w:id="248"/>
-    <w:bookmarkEnd w:id="249"/>
     <w:bookmarkEnd w:id="250"/>
     <w:bookmarkEnd w:id="251"/>
-    <w:bookmarkStart w:id="256" w:name="summary-self-assessment-table"/>
+    <w:bookmarkEnd w:id="252"/>
+    <w:bookmarkEnd w:id="253"/>
+    <w:bookmarkStart w:id="258" w:name="summary-self-assessment-table"/>
     <w:p>
       <w:pPr>
         <w:pStyle w:val="berschrift2"/>
@@ -12063,7 +12104,7 @@
         <w:t xml:space="preserve">Summary Self-Assessment Table</w:t>
       </w:r>
     </w:p>
-    <w:bookmarkStart w:id="252" w:name="general-metadata"/>
+    <w:bookmarkStart w:id="254" w:name="general-metadata"/>
     <w:p>
       <w:pPr>
         <w:pStyle w:val="berschrift3"/>
@@ -13042,8 +13083,8 @@
         </w:tc>
       </w:tr>
     </w:tbl>
-    <w:bookmarkEnd w:id="252"/>
-    <w:bookmarkStart w:id="253" w:name="per-pixel-metadata"/>
+    <w:bookmarkEnd w:id="254"/>
+    <w:bookmarkStart w:id="255" w:name="per-pixel-metadata"/>
     <w:p>
       <w:pPr>
         <w:pStyle w:val="berschrift3"/>
@@ -14097,8 +14138,8 @@
         </w:tc>
       </w:tr>
     </w:tbl>
-    <w:bookmarkEnd w:id="253"/>
-    <w:bookmarkStart w:id="254" w:name="products-and-algorithms"/>
+    <w:bookmarkEnd w:id="255"/>
+    <w:bookmarkStart w:id="256" w:name="products-and-algorithms"/>
     <w:p>
       <w:pPr>
         <w:pStyle w:val="berschrift3"/>
@@ -14760,8 +14801,8 @@
         </w:tc>
       </w:tr>
     </w:tbl>
-    <w:bookmarkEnd w:id="254"/>
-    <w:bookmarkStart w:id="255" w:name="Xc6e26d369529cdba33c511a7fba4df43485f09c"/>
+    <w:bookmarkEnd w:id="256"/>
+    <w:bookmarkStart w:id="257" w:name="Xc6e26d369529cdba33c511a7fba4df43485f09c"/>
     <w:p>
       <w:pPr>
         <w:pStyle w:val="berschrift3"/>
@@ -14925,9 +14966,9 @@
         <w:br w:type="page"/>
       </w:r>
     </w:p>
-    <w:bookmarkEnd w:id="255"/>
-    <w:bookmarkEnd w:id="256"/>
-    <w:bookmarkStart w:id="261" w:name="introduction"/>
+    <w:bookmarkEnd w:id="257"/>
+    <w:bookmarkEnd w:id="258"/>
+    <w:bookmarkStart w:id="263" w:name="introduction"/>
     <w:p>
       <w:pPr>
         <w:pStyle w:val="berschrift2"/>
@@ -14956,7 +14997,7 @@
         <w:t xml:space="preserve">This Guidance material does not replace or override the specifications.</w:t>
       </w:r>
     </w:p>
-    <w:bookmarkStart w:id="257" w:name="sec:intro-what-are-ceos-ard-products"/>
+    <w:bookmarkStart w:id="259" w:name="sec:intro-what-are-ceos-ard-products"/>
     <w:p>
       <w:pPr>
         <w:pStyle w:val="berschrift3"/>
@@ -15015,8 +15056,8 @@
         <w:t xml:space="preserve">for other types of satellite products.</w:t>
       </w:r>
     </w:p>
-    <w:bookmarkEnd w:id="257"/>
-    <w:bookmarkStart w:id="259" w:name="sec:intro-when-is-a-product-ceos-ard"/>
+    <w:bookmarkEnd w:id="259"/>
+    <w:bookmarkStart w:id="261" w:name="sec:intro-when-is-a-product-ceos-ard"/>
     <w:p>
       <w:pPr>
         <w:pStyle w:val="berschrift3"/>
@@ -15067,7 +15108,7 @@
       <w:r>
         <w:t xml:space="preserve"> </w:t>
       </w:r>
-      <w:hyperlink r:id="rId258">
+      <w:hyperlink r:id="rId260">
         <w:r>
           <w:rPr>
             <w:rStyle w:val="Hyperlink"/>
@@ -15087,8 +15128,8 @@
         <w:t xml:space="preserve">A product can continue to use CEOS-ARD branding as long as its generation and distribution remain consistent with the peer-reviewed assessment.</w:t>
       </w:r>
     </w:p>
-    <w:bookmarkEnd w:id="259"/>
-    <w:bookmarkStart w:id="260" w:name="sec:intro-difference-threshold-goal"/>
+    <w:bookmarkEnd w:id="261"/>
+    <w:bookmarkStart w:id="262" w:name="sec:intro-difference-threshold-goal"/>
     <w:p>
       <w:pPr>
         <w:pStyle w:val="berschrift3"/>
@@ -15291,9 +15332,9 @@
         <w:br w:type="page"/>
       </w:r>
     </w:p>
-    <w:bookmarkEnd w:id="260"/>
-    <w:bookmarkEnd w:id="261"/>
-    <w:bookmarkStart w:id="420" w:name="references"/>
+    <w:bookmarkEnd w:id="262"/>
+    <w:bookmarkEnd w:id="263"/>
+    <w:bookmarkStart w:id="422" w:name="references"/>
     <w:p>
       <w:pPr>
         <w:pStyle w:val="berschrift2"/>
@@ -15302,8 +15343,8 @@
         <w:t xml:space="preserve">References</w:t>
       </w:r>
     </w:p>
-    <w:bookmarkStart w:id="419" w:name="refs"/>
-    <w:bookmarkStart w:id="263" w:name="ref-bell2023"/>
+    <w:bookmarkStart w:id="421" w:name="refs"/>
+    <w:bookmarkStart w:id="265" w:name="ref-bell2023"/>
     <w:p>
       <w:pPr>
         <w:pStyle w:val="Literaturverzeichnis"/>
@@ -15336,7 +15377,7 @@
       <w:r>
         <w:t xml:space="preserve"> </w:t>
       </w:r>
-      <w:hyperlink r:id="rId262">
+      <w:hyperlink r:id="rId264">
         <w:r>
           <w:rPr>
             <w:rStyle w:val="Hyperlink"/>
@@ -15348,8 +15389,8 @@
         <w:t xml:space="preserve">.</w:t>
       </w:r>
     </w:p>
-    <w:bookmarkEnd w:id="263"/>
-    <w:bookmarkStart w:id="265" w:name="ref-hieronymi2024"/>
+    <w:bookmarkEnd w:id="265"/>
+    <w:bookmarkStart w:id="267" w:name="ref-hieronymi2024"/>
     <w:p>
       <w:pPr>
         <w:pStyle w:val="Literaturverzeichnis"/>
@@ -15379,7 +15420,7 @@
       <w:r>
         <w:t xml:space="preserve">69 (7): 1547–61. https://doi.org/</w:t>
       </w:r>
-      <w:hyperlink r:id="rId264">
+      <w:hyperlink r:id="rId266">
         <w:r>
           <w:rPr>
             <w:rStyle w:val="Hyperlink"/>
@@ -15391,8 +15432,8 @@
         <w:t xml:space="preserve">.</w:t>
       </w:r>
     </w:p>
-    <w:bookmarkEnd w:id="265"/>
-    <w:bookmarkStart w:id="267" w:name="ref-botha2016"/>
+    <w:bookmarkEnd w:id="267"/>
+    <w:bookmarkStart w:id="269" w:name="ref-botha2016"/>
     <w:p>
       <w:pPr>
         <w:pStyle w:val="Literaturverzeichnis"/>
@@ -15425,7 +15466,7 @@
       <w:r>
         <w:t xml:space="preserve"> </w:t>
       </w:r>
-      <w:hyperlink r:id="rId266">
+      <w:hyperlink r:id="rId268">
         <w:r>
           <w:rPr>
             <w:rStyle w:val="Hyperlink"/>
@@ -15437,8 +15478,8 @@
         <w:t xml:space="preserve">.</w:t>
       </w:r>
     </w:p>
-    <w:bookmarkEnd w:id="267"/>
-    <w:bookmarkStart w:id="269" w:name="ref-bourg2014"/>
+    <w:bookmarkEnd w:id="269"/>
+    <w:bookmarkStart w:id="271" w:name="ref-bourg2014"/>
     <w:p>
       <w:pPr>
         <w:pStyle w:val="Literaturverzeichnis"/>
@@ -15461,7 +15502,7 @@
       <w:r>
         <w:t xml:space="preserve"> </w:t>
       </w:r>
-      <w:hyperlink r:id="rId268">
+      <w:hyperlink r:id="rId270">
         <w:r>
           <w:rPr>
             <w:rStyle w:val="Hyperlink"/>
@@ -15473,8 +15514,8 @@
         <w:t xml:space="preserve">.</w:t>
       </w:r>
     </w:p>
-    <w:bookmarkEnd w:id="269"/>
-    <w:bookmarkStart w:id="271" w:name="ref-brando2009"/>
+    <w:bookmarkEnd w:id="271"/>
+    <w:bookmarkStart w:id="273" w:name="ref-brando2009"/>
     <w:p>
       <w:pPr>
         <w:pStyle w:val="Literaturverzeichnis"/>
@@ -15504,7 +15545,7 @@
       <w:r>
         <w:t xml:space="preserve">113 (4): 755–70. https://doi.org/</w:t>
       </w:r>
-      <w:hyperlink r:id="rId270">
+      <w:hyperlink r:id="rId272">
         <w:r>
           <w:rPr>
             <w:rStyle w:val="Hyperlink"/>
@@ -15516,8 +15557,8 @@
         <w:t xml:space="preserve">.</w:t>
       </w:r>
     </w:p>
-    <w:bookmarkEnd w:id="271"/>
-    <w:bookmarkStart w:id="273" w:name="ref-bresciani2014"/>
+    <w:bookmarkEnd w:id="273"/>
+    <w:bookmarkStart w:id="275" w:name="ref-bresciani2014"/>
     <w:p>
       <w:pPr>
         <w:pStyle w:val="Literaturverzeichnis"/>
@@ -15547,7 +15588,7 @@
       <w:r>
         <w:t xml:space="preserve">146: 124–35. https://doi.org/</w:t>
       </w:r>
-      <w:hyperlink r:id="rId272">
+      <w:hyperlink r:id="rId274">
         <w:r>
           <w:rPr>
             <w:rStyle w:val="Hyperlink"/>
@@ -15559,8 +15600,8 @@
         <w:t xml:space="preserve">.</w:t>
       </w:r>
     </w:p>
-    <w:bookmarkEnd w:id="273"/>
-    <w:bookmarkStart w:id="275" w:name="ref-bulgarelli2014"/>
+    <w:bookmarkEnd w:id="275"/>
+    <w:bookmarkStart w:id="277" w:name="ref-bulgarelli2014"/>
     <w:p>
       <w:pPr>
         <w:pStyle w:val="Literaturverzeichnis"/>
@@ -15593,7 +15634,7 @@
       <w:r>
         <w:t xml:space="preserve"> </w:t>
       </w:r>
-      <w:hyperlink r:id="rId274">
+      <w:hyperlink r:id="rId276">
         <w:r>
           <w:rPr>
             <w:rStyle w:val="Hyperlink"/>
@@ -15605,8 +15646,8 @@
         <w:t xml:space="preserve">.</w:t>
       </w:r>
     </w:p>
-    <w:bookmarkEnd w:id="275"/>
-    <w:bookmarkStart w:id="277" w:name="ref-bulgarelli2018"/>
+    <w:bookmarkEnd w:id="277"/>
+    <w:bookmarkStart w:id="279" w:name="ref-bulgarelli2018"/>
     <w:p>
       <w:pPr>
         <w:pStyle w:val="Literaturverzeichnis"/>
@@ -15636,7 +15677,7 @@
       <w:r>
         <w:t xml:space="preserve">209: 423–38. https://doi.org/</w:t>
       </w:r>
-      <w:hyperlink r:id="rId276">
+      <w:hyperlink r:id="rId278">
         <w:r>
           <w:rPr>
             <w:rStyle w:val="Hyperlink"/>
@@ -15648,8 +15689,8 @@
         <w:t xml:space="preserve">.</w:t>
       </w:r>
     </w:p>
-    <w:bookmarkEnd w:id="277"/>
-    <w:bookmarkStart w:id="279" w:name="ref-castagna2025"/>
+    <w:bookmarkEnd w:id="279"/>
+    <w:bookmarkStart w:id="281" w:name="ref-castagna2025"/>
     <w:p>
       <w:pPr>
         <w:pStyle w:val="Literaturverzeichnis"/>
@@ -15682,7 +15723,7 @@
       <w:r>
         <w:t xml:space="preserve"> </w:t>
       </w:r>
-      <w:hyperlink r:id="rId278">
+      <w:hyperlink r:id="rId280">
         <w:r>
           <w:rPr>
             <w:rStyle w:val="Hyperlink"/>
@@ -15694,8 +15735,8 @@
         <w:t xml:space="preserve">.</w:t>
       </w:r>
     </w:p>
-    <w:bookmarkEnd w:id="279"/>
-    <w:bookmarkStart w:id="281" w:name="ref-dekker2011"/>
+    <w:bookmarkEnd w:id="281"/>
+    <w:bookmarkStart w:id="283" w:name="ref-dekker2011"/>
     <w:p>
       <w:pPr>
         <w:pStyle w:val="Literaturverzeichnis"/>
@@ -15725,7 +15766,7 @@
       <w:r>
         <w:t xml:space="preserve">9 (9): 396–425. https://doi.org/</w:t>
       </w:r>
-      <w:hyperlink r:id="rId280">
+      <w:hyperlink r:id="rId282">
         <w:r>
           <w:rPr>
             <w:rStyle w:val="Hyperlink"/>
@@ -15737,8 +15778,8 @@
         <w:t xml:space="preserve">.</w:t>
       </w:r>
     </w:p>
-    <w:bookmarkEnd w:id="281"/>
-    <w:bookmarkStart w:id="283" w:name="ref-dierssen2019"/>
+    <w:bookmarkEnd w:id="283"/>
+    <w:bookmarkStart w:id="285" w:name="ref-dierssen2019"/>
     <w:p>
       <w:pPr>
         <w:pStyle w:val="Literaturverzeichnis"/>
@@ -15771,7 +15812,7 @@
       <w:r>
         <w:t xml:space="preserve"> </w:t>
       </w:r>
-      <w:hyperlink r:id="rId282">
+      <w:hyperlink r:id="rId284">
         <w:r>
           <w:rPr>
             <w:rStyle w:val="Hyperlink"/>
@@ -15783,8 +15824,8 @@
         <w:t xml:space="preserve">.</w:t>
       </w:r>
     </w:p>
-    <w:bookmarkEnd w:id="283"/>
-    <w:bookmarkStart w:id="285" w:name="ref-dierssen2021"/>
+    <w:bookmarkEnd w:id="285"/>
+    <w:bookmarkStart w:id="287" w:name="ref-dierssen2021"/>
     <w:p>
       <w:pPr>
         <w:pStyle w:val="Literaturverzeichnis"/>
@@ -15817,7 +15858,7 @@
       <w:r>
         <w:t xml:space="preserve"> </w:t>
       </w:r>
-      <w:hyperlink r:id="rId284">
+      <w:hyperlink r:id="rId286">
         <w:r>
           <w:rPr>
             <w:rStyle w:val="Hyperlink"/>
@@ -15829,8 +15870,8 @@
         <w:t xml:space="preserve">.</w:t>
       </w:r>
     </w:p>
-    <w:bookmarkEnd w:id="285"/>
-    <w:bookmarkStart w:id="287" w:name="ref-dworak2021"/>
+    <w:bookmarkEnd w:id="287"/>
+    <w:bookmarkStart w:id="289" w:name="ref-dworak2021"/>
     <w:p>
       <w:pPr>
         <w:pStyle w:val="Literaturverzeichnis"/>
@@ -15863,7 +15904,7 @@
       <w:r>
         <w:t xml:space="preserve"> </w:t>
       </w:r>
-      <w:hyperlink r:id="rId286">
+      <w:hyperlink r:id="rId288">
         <w:r>
           <w:rPr>
             <w:rStyle w:val="Hyperlink"/>
@@ -15875,8 +15916,8 @@
         <w:t xml:space="preserve">.</w:t>
       </w:r>
     </w:p>
-    <w:bookmarkEnd w:id="287"/>
-    <w:bookmarkStart w:id="289" w:name="ref-eumetsat2021"/>
+    <w:bookmarkEnd w:id="289"/>
+    <w:bookmarkStart w:id="291" w:name="ref-eumetsat2021"/>
     <w:p>
       <w:pPr>
         <w:pStyle w:val="Literaturverzeichnis"/>
@@ -15905,7 +15946,7 @@
       <w:r>
         <w:t xml:space="preserve"> </w:t>
       </w:r>
-      <w:hyperlink r:id="rId288">
+      <w:hyperlink r:id="rId290">
         <w:r>
           <w:rPr>
             <w:rStyle w:val="Hyperlink"/>
@@ -15917,8 +15958,8 @@
         <w:t xml:space="preserve">.</w:t>
       </w:r>
     </w:p>
-    <w:bookmarkEnd w:id="289"/>
-    <w:bookmarkStart w:id="291" w:name="ref-fan2016"/>
+    <w:bookmarkEnd w:id="291"/>
+    <w:bookmarkStart w:id="293" w:name="ref-fan2016"/>
     <w:p>
       <w:pPr>
         <w:pStyle w:val="Literaturverzeichnis"/>
@@ -15951,7 +15992,7 @@
       <w:r>
         <w:t xml:space="preserve"> </w:t>
       </w:r>
-      <w:hyperlink r:id="rId290">
+      <w:hyperlink r:id="rId292">
         <w:r>
           <w:rPr>
             <w:rStyle w:val="Hyperlink"/>
@@ -15963,8 +16004,8 @@
         <w:t xml:space="preserve">.</w:t>
       </w:r>
     </w:p>
-    <w:bookmarkEnd w:id="291"/>
-    <w:bookmarkStart w:id="293" w:name="ref-fink2014"/>
+    <w:bookmarkEnd w:id="293"/>
+    <w:bookmarkStart w:id="295" w:name="ref-fink2014"/>
     <w:p>
       <w:pPr>
         <w:pStyle w:val="Literaturverzeichnis"/>
@@ -15987,7 +16028,7 @@
       <w:r>
         <w:t xml:space="preserve"> </w:t>
       </w:r>
-      <w:hyperlink r:id="rId292">
+      <w:hyperlink r:id="rId294">
         <w:r>
           <w:rPr>
             <w:rStyle w:val="Hyperlink"/>
@@ -15999,8 +16040,8 @@
         <w:t xml:space="preserve">.</w:t>
       </w:r>
     </w:p>
-    <w:bookmarkEnd w:id="293"/>
-    <w:bookmarkStart w:id="295" w:name="ref-foga2017"/>
+    <w:bookmarkEnd w:id="295"/>
+    <w:bookmarkStart w:id="297" w:name="ref-foga2017"/>
     <w:p>
       <w:pPr>
         <w:pStyle w:val="Literaturverzeichnis"/>
@@ -16030,7 +16071,7 @@
       <w:r>
         <w:t xml:space="preserve">194: 379–90. https://doi.org/</w:t>
       </w:r>
-      <w:hyperlink r:id="rId294">
+      <w:hyperlink r:id="rId296">
         <w:r>
           <w:rPr>
             <w:rStyle w:val="Hyperlink"/>
@@ -16042,8 +16083,8 @@
         <w:t xml:space="preserve">.</w:t>
       </w:r>
     </w:p>
-    <w:bookmarkEnd w:id="295"/>
-    <w:bookmarkStart w:id="297" w:name="ref-frouin2019"/>
+    <w:bookmarkEnd w:id="297"/>
+    <w:bookmarkStart w:id="299" w:name="ref-frouin2019"/>
     <w:p>
       <w:pPr>
         <w:pStyle w:val="Literaturverzeichnis"/>
@@ -16076,7 +16117,7 @@
       <w:r>
         <w:t xml:space="preserve"> </w:t>
       </w:r>
-      <w:hyperlink r:id="rId296">
+      <w:hyperlink r:id="rId298">
         <w:r>
           <w:rPr>
             <w:rStyle w:val="Hyperlink"/>
@@ -16088,8 +16129,8 @@
         <w:t xml:space="preserve">.</w:t>
       </w:r>
     </w:p>
-    <w:bookmarkEnd w:id="297"/>
-    <w:bookmarkStart w:id="299" w:name="ref-gebco2024"/>
+    <w:bookmarkEnd w:id="299"/>
+    <w:bookmarkStart w:id="301" w:name="ref-gebco2024"/>
     <w:p>
       <w:pPr>
         <w:pStyle w:val="Literaturverzeichnis"/>
@@ -16112,7 +16153,7 @@
       <w:r>
         <w:t xml:space="preserve"> </w:t>
       </w:r>
-      <w:hyperlink r:id="rId298">
+      <w:hyperlink r:id="rId300">
         <w:r>
           <w:rPr>
             <w:rStyle w:val="Hyperlink"/>
@@ -16124,8 +16165,8 @@
         <w:t xml:space="preserve">.</w:t>
       </w:r>
     </w:p>
-    <w:bookmarkEnd w:id="299"/>
-    <w:bookmarkStart w:id="300" w:name="ref-gege2016"/>
+    <w:bookmarkEnd w:id="301"/>
+    <w:bookmarkStart w:id="302" w:name="ref-gege2016"/>
     <w:p>
       <w:pPr>
         <w:pStyle w:val="Literaturverzeichnis"/>
@@ -16146,8 +16187,8 @@
         <w:t xml:space="preserve">In.</w:t>
       </w:r>
     </w:p>
-    <w:bookmarkEnd w:id="300"/>
-    <w:bookmarkStart w:id="302" w:name="ref-gendall2023"/>
+    <w:bookmarkEnd w:id="302"/>
+    <w:bookmarkStart w:id="304" w:name="ref-gendall2023"/>
     <w:p>
       <w:pPr>
         <w:pStyle w:val="Literaturverzeichnis"/>
@@ -16180,7 +16221,7 @@
       <w:r>
         <w:t xml:space="preserve"> </w:t>
       </w:r>
-      <w:hyperlink r:id="rId301">
+      <w:hyperlink r:id="rId303">
         <w:r>
           <w:rPr>
             <w:rStyle w:val="Hyperlink"/>
@@ -16192,8 +16233,8 @@
         <w:t xml:space="preserve">.</w:t>
       </w:r>
     </w:p>
-    <w:bookmarkEnd w:id="302"/>
-    <w:bookmarkStart w:id="304" w:name="ref-gossn2019"/>
+    <w:bookmarkEnd w:id="304"/>
+    <w:bookmarkStart w:id="306" w:name="ref-gossn2019"/>
     <w:p>
       <w:pPr>
         <w:pStyle w:val="Literaturverzeichnis"/>
@@ -16226,7 +16267,7 @@
       <w:r>
         <w:t xml:space="preserve"> </w:t>
       </w:r>
-      <w:hyperlink r:id="rId303">
+      <w:hyperlink r:id="rId305">
         <w:r>
           <w:rPr>
             <w:rStyle w:val="Hyperlink"/>
@@ -16238,8 +16279,8 @@
         <w:t xml:space="preserve">.</w:t>
       </w:r>
     </w:p>
-    <w:bookmarkEnd w:id="304"/>
-    <w:bookmarkStart w:id="306" w:name="ref-groetsch2020"/>
+    <w:bookmarkEnd w:id="306"/>
+    <w:bookmarkStart w:id="308" w:name="ref-groetsch2020"/>
     <w:p>
       <w:pPr>
         <w:pStyle w:val="Literaturverzeichnis"/>
@@ -16272,7 +16313,7 @@
       <w:r>
         <w:t xml:space="preserve"> </w:t>
       </w:r>
-      <w:hyperlink r:id="rId305">
+      <w:hyperlink r:id="rId307">
         <w:r>
           <w:rPr>
             <w:rStyle w:val="Hyperlink"/>
@@ -16284,8 +16325,8 @@
         <w:t xml:space="preserve">.</w:t>
       </w:r>
     </w:p>
-    <w:bookmarkEnd w:id="306"/>
-    <w:bookmarkStart w:id="308" w:name="ref-guth2021"/>
+    <w:bookmarkEnd w:id="308"/>
+    <w:bookmarkStart w:id="310" w:name="ref-guth2021"/>
     <w:p>
       <w:pPr>
         <w:pStyle w:val="Literaturverzeichnis"/>
@@ -16318,7 +16359,7 @@
       <w:r>
         <w:t xml:space="preserve"> </w:t>
       </w:r>
-      <w:hyperlink r:id="rId307">
+      <w:hyperlink r:id="rId309">
         <w:r>
           <w:rPr>
             <w:rStyle w:val="Hyperlink"/>
@@ -16330,8 +16371,8 @@
         <w:t xml:space="preserve">.</w:t>
       </w:r>
     </w:p>
-    <w:bookmarkEnd w:id="308"/>
-    <w:bookmarkStart w:id="310" w:name="ref-harmel2018"/>
+    <w:bookmarkEnd w:id="310"/>
+    <w:bookmarkStart w:id="312" w:name="ref-harmel2018"/>
     <w:p>
       <w:pPr>
         <w:pStyle w:val="Literaturverzeichnis"/>
@@ -16361,7 +16402,7 @@
       <w:r>
         <w:t xml:space="preserve">204: 308–21. https://doi.org/</w:t>
       </w:r>
-      <w:hyperlink r:id="rId309">
+      <w:hyperlink r:id="rId311">
         <w:r>
           <w:rPr>
             <w:rStyle w:val="Hyperlink"/>
@@ -16373,8 +16414,8 @@
         <w:t xml:space="preserve">.</w:t>
       </w:r>
     </w:p>
-    <w:bookmarkEnd w:id="310"/>
-    <w:bookmarkStart w:id="312" w:name="ref-hartmann2022"/>
+    <w:bookmarkEnd w:id="312"/>
+    <w:bookmarkStart w:id="314" w:name="ref-hartmann2022"/>
     <w:p>
       <w:pPr>
         <w:pStyle w:val="Literaturverzeichnis"/>
@@ -16404,7 +16445,7 @@
       <w:r>
         <w:t xml:space="preserve">28: 53–75. https://doi.org/</w:t>
       </w:r>
-      <w:hyperlink r:id="rId311">
+      <w:hyperlink r:id="rId313">
         <w:r>
           <w:rPr>
             <w:rStyle w:val="Hyperlink"/>
@@ -16422,8 +16463,8 @@
         <w:t xml:space="preserve">.</w:t>
       </w:r>
     </w:p>
-    <w:bookmarkEnd w:id="312"/>
-    <w:bookmarkStart w:id="314" w:name="ref-heinila2018"/>
+    <w:bookmarkEnd w:id="314"/>
+    <w:bookmarkStart w:id="316" w:name="ref-heinila2018"/>
     <w:p>
       <w:pPr>
         <w:pStyle w:val="Literaturverzeichnis"/>
@@ -16446,7 +16487,7 @@
       <w:r>
         <w:t xml:space="preserve"> </w:t>
       </w:r>
-      <w:hyperlink r:id="rId313">
+      <w:hyperlink r:id="rId315">
         <w:r>
           <w:rPr>
             <w:rStyle w:val="Hyperlink"/>
@@ -16458,8 +16499,8 @@
         <w:t xml:space="preserve">.</w:t>
       </w:r>
     </w:p>
-    <w:bookmarkEnd w:id="314"/>
-    <w:bookmarkStart w:id="315" w:name="ref-hooker2003"/>
+    <w:bookmarkEnd w:id="316"/>
+    <w:bookmarkStart w:id="317" w:name="ref-hooker2003"/>
     <w:p>
       <w:pPr>
         <w:pStyle w:val="Literaturverzeichnis"/>
@@ -16480,8 +16521,8 @@
         <w:t xml:space="preserve">June.</w:t>
       </w:r>
     </w:p>
-    <w:bookmarkEnd w:id="315"/>
-    <w:bookmarkStart w:id="317" w:name="ref-hu2009"/>
+    <w:bookmarkEnd w:id="317"/>
+    <w:bookmarkStart w:id="319" w:name="ref-hu2009"/>
     <w:p>
       <w:pPr>
         <w:pStyle w:val="Literaturverzeichnis"/>
@@ -16511,7 +16552,7 @@
       <w:r>
         <w:t xml:space="preserve">113 (10): 2118–29. https://doi.org/</w:t>
       </w:r>
-      <w:hyperlink r:id="rId316">
+      <w:hyperlink r:id="rId318">
         <w:r>
           <w:rPr>
             <w:rStyle w:val="Hyperlink"/>
@@ -16523,8 +16564,8 @@
         <w:t xml:space="preserve">.</w:t>
       </w:r>
     </w:p>
-    <w:bookmarkEnd w:id="317"/>
-    <w:bookmarkStart w:id="319" w:name="ref-hudson2016"/>
+    <w:bookmarkEnd w:id="319"/>
+    <w:bookmarkStart w:id="321" w:name="ref-hudson2016"/>
     <w:p>
       <w:pPr>
         <w:pStyle w:val="Literaturverzeichnis"/>
@@ -16557,7 +16598,7 @@
       <w:r>
         <w:t xml:space="preserve"> </w:t>
       </w:r>
-      <w:hyperlink r:id="rId318">
+      <w:hyperlink r:id="rId320">
         <w:r>
           <w:rPr>
             <w:rStyle w:val="Hyperlink"/>
@@ -16569,8 +16610,8 @@
         <w:t xml:space="preserve">.</w:t>
       </w:r>
     </w:p>
-    <w:bookmarkEnd w:id="319"/>
-    <w:bookmarkStart w:id="321" w:name="ref-iho2024"/>
+    <w:bookmarkEnd w:id="321"/>
+    <w:bookmarkStart w:id="323" w:name="ref-iho2024"/>
     <w:p>
       <w:pPr>
         <w:pStyle w:val="Literaturverzeichnis"/>
@@ -16599,7 +16640,7 @@
       <w:r>
         <w:t xml:space="preserve"> </w:t>
       </w:r>
-      <w:hyperlink r:id="rId320">
+      <w:hyperlink r:id="rId322">
         <w:r>
           <w:rPr>
             <w:rStyle w:val="Hyperlink"/>
@@ -16611,8 +16652,8 @@
         <w:t xml:space="preserve">.</w:t>
       </w:r>
     </w:p>
-    <w:bookmarkEnd w:id="321"/>
-    <w:bookmarkStart w:id="323" w:name="ref-ilori2019"/>
+    <w:bookmarkEnd w:id="323"/>
+    <w:bookmarkStart w:id="325" w:name="ref-ilori2019"/>
     <w:p>
       <w:pPr>
         <w:pStyle w:val="Literaturverzeichnis"/>
@@ -16645,7 +16686,7 @@
       <w:r>
         <w:t xml:space="preserve"> </w:t>
       </w:r>
-      <w:hyperlink r:id="rId322">
+      <w:hyperlink r:id="rId324">
         <w:r>
           <w:rPr>
             <w:rStyle w:val="Hyperlink"/>
@@ -16657,8 +16698,8 @@
         <w:t xml:space="preserve">.</w:t>
       </w:r>
     </w:p>
-    <w:bookmarkEnd w:id="323"/>
-    <w:bookmarkStart w:id="324" w:name="ref-iso19115_2_2009"/>
+    <w:bookmarkEnd w:id="325"/>
+    <w:bookmarkStart w:id="326" w:name="ref-iso19115_2_2009"/>
     <w:p>
       <w:pPr>
         <w:pStyle w:val="Literaturverzeichnis"/>
@@ -16685,8 +16726,8 @@
         <w:t xml:space="preserve">Standard. Geneva, CH: International Organization for Standardization.</w:t>
       </w:r>
     </w:p>
-    <w:bookmarkEnd w:id="324"/>
-    <w:bookmarkStart w:id="325" w:name="ref-iso8601_1_2019"/>
+    <w:bookmarkEnd w:id="326"/>
+    <w:bookmarkStart w:id="327" w:name="ref-iso8601_1_2019"/>
     <w:p>
       <w:pPr>
         <w:pStyle w:val="Literaturverzeichnis"/>
@@ -16713,8 +16754,8 @@
         <w:t xml:space="preserve">Standard. Geneva, CH: International Organization for Standardization.</w:t>
       </w:r>
     </w:p>
-    <w:bookmarkEnd w:id="325"/>
-    <w:bookmarkStart w:id="327" w:name="ref-gum_6_2020"/>
+    <w:bookmarkEnd w:id="327"/>
+    <w:bookmarkStart w:id="329" w:name="ref-gum_6_2020"/>
     <w:p>
       <w:pPr>
         <w:pStyle w:val="Literaturverzeichnis"/>
@@ -16752,7 +16793,7 @@
       <w:r>
         <w:t xml:space="preserve"> </w:t>
       </w:r>
-      <w:hyperlink r:id="rId326">
+      <w:hyperlink r:id="rId328">
         <w:r>
           <w:rPr>
             <w:rStyle w:val="Hyperlink"/>
@@ -16764,8 +16805,8 @@
         <w:t xml:space="preserve">.</w:t>
       </w:r>
     </w:p>
-    <w:bookmarkEnd w:id="327"/>
-    <w:bookmarkStart w:id="329" w:name="ref-jones2019"/>
+    <w:bookmarkEnd w:id="329"/>
+    <w:bookmarkStart w:id="331" w:name="ref-jones2019"/>
     <w:p>
       <w:pPr>
         <w:pStyle w:val="Literaturverzeichnis"/>
@@ -16798,7 +16839,7 @@
       <w:r>
         <w:t xml:space="preserve"> </w:t>
       </w:r>
-      <w:hyperlink r:id="rId328">
+      <w:hyperlink r:id="rId330">
         <w:r>
           <w:rPr>
             <w:rStyle w:val="Hyperlink"/>
@@ -16810,8 +16851,8 @@
         <w:t xml:space="preserve">.</w:t>
       </w:r>
     </w:p>
-    <w:bookmarkEnd w:id="329"/>
-    <w:bookmarkStart w:id="331" w:name="ref-kay2009"/>
+    <w:bookmarkEnd w:id="331"/>
+    <w:bookmarkStart w:id="333" w:name="ref-kay2009"/>
     <w:p>
       <w:pPr>
         <w:pStyle w:val="Literaturverzeichnis"/>
@@ -16844,7 +16885,7 @@
       <w:r>
         <w:t xml:space="preserve"> </w:t>
       </w:r>
-      <w:hyperlink r:id="rId330">
+      <w:hyperlink r:id="rId332">
         <w:r>
           <w:rPr>
             <w:rStyle w:val="Hyperlink"/>
@@ -16856,8 +16897,8 @@
         <w:t xml:space="preserve">.</w:t>
       </w:r>
     </w:p>
-    <w:bookmarkEnd w:id="331"/>
-    <w:bookmarkStart w:id="333" w:name="ref-kay2013"/>
+    <w:bookmarkEnd w:id="333"/>
+    <w:bookmarkStart w:id="335" w:name="ref-kay2013"/>
     <w:p>
       <w:pPr>
         <w:pStyle w:val="Literaturverzeichnis"/>
@@ -16890,7 +16931,7 @@
       <w:r>
         <w:t xml:space="preserve"> </w:t>
       </w:r>
-      <w:hyperlink r:id="rId332">
+      <w:hyperlink r:id="rId334">
         <w:r>
           <w:rPr>
             <w:rStyle w:val="Hyperlink"/>
@@ -16902,8 +16943,8 @@
         <w:t xml:space="preserve">.</w:t>
       </w:r>
     </w:p>
-    <w:bookmarkEnd w:id="333"/>
-    <w:bookmarkStart w:id="335" w:name="ref-dekeukelaere2018"/>
+    <w:bookmarkEnd w:id="335"/>
+    <w:bookmarkStart w:id="337" w:name="ref-dekeukelaere2018"/>
     <w:p>
       <w:pPr>
         <w:pStyle w:val="Literaturverzeichnis"/>
@@ -16936,7 +16977,7 @@
       <w:r>
         <w:t xml:space="preserve"> </w:t>
       </w:r>
-      <w:hyperlink r:id="rId334">
+      <w:hyperlink r:id="rId336">
         <w:r>
           <w:rPr>
             <w:rStyle w:val="Hyperlink"/>
@@ -16948,8 +16989,8 @@
         <w:t xml:space="preserve">.</w:t>
       </w:r>
     </w:p>
-    <w:bookmarkEnd w:id="335"/>
-    <w:bookmarkStart w:id="337" w:name="ref-khazaei2022"/>
+    <w:bookmarkEnd w:id="337"/>
+    <w:bookmarkStart w:id="339" w:name="ref-khazaei2022"/>
     <w:p>
       <w:pPr>
         <w:pStyle w:val="Literaturverzeichnis"/>
@@ -16982,7 +17023,7 @@
       <w:r>
         <w:t xml:space="preserve"> </w:t>
       </w:r>
-      <w:hyperlink r:id="rId336">
+      <w:hyperlink r:id="rId338">
         <w:r>
           <w:rPr>
             <w:rStyle w:val="Hyperlink"/>
@@ -16994,8 +17035,8 @@
         <w:t xml:space="preserve">.</w:t>
       </w:r>
     </w:p>
-    <w:bookmarkEnd w:id="337"/>
-    <w:bookmarkStart w:id="339" w:name="ref-kim2024"/>
+    <w:bookmarkEnd w:id="339"/>
+    <w:bookmarkStart w:id="341" w:name="ref-kim2024"/>
     <w:p>
       <w:pPr>
         <w:pStyle w:val="Literaturverzeichnis"/>
@@ -17028,7 +17069,7 @@
       <w:r>
         <w:t xml:space="preserve"> </w:t>
       </w:r>
-      <w:hyperlink r:id="rId338">
+      <w:hyperlink r:id="rId340">
         <w:r>
           <w:rPr>
             <w:rStyle w:val="Hyperlink"/>
@@ -17040,8 +17081,8 @@
         <w:t xml:space="preserve">.</w:t>
       </w:r>
     </w:p>
-    <w:bookmarkEnd w:id="339"/>
-    <w:bookmarkStart w:id="341" w:name="ref-kiselev2015"/>
+    <w:bookmarkEnd w:id="341"/>
+    <w:bookmarkStart w:id="343" w:name="ref-kiselev2015"/>
     <w:p>
       <w:pPr>
         <w:pStyle w:val="Literaturverzeichnis"/>
@@ -17071,7 +17112,7 @@
       <w:r>
         <w:t xml:space="preserve">157: 85–95. https://doi.org/</w:t>
       </w:r>
-      <w:hyperlink r:id="rId340">
+      <w:hyperlink r:id="rId342">
         <w:r>
           <w:rPr>
             <w:rStyle w:val="Hyperlink"/>
@@ -17083,8 +17124,8 @@
         <w:t xml:space="preserve">.</w:t>
       </w:r>
     </w:p>
-    <w:bookmarkEnd w:id="341"/>
-    <w:bookmarkStart w:id="343" w:name="ref-koepke1984"/>
+    <w:bookmarkEnd w:id="343"/>
+    <w:bookmarkStart w:id="345" w:name="ref-koepke1984"/>
     <w:p>
       <w:pPr>
         <w:pStyle w:val="Literaturverzeichnis"/>
@@ -17117,7 +17158,7 @@
       <w:r>
         <w:t xml:space="preserve"> </w:t>
       </w:r>
-      <w:hyperlink r:id="rId342">
+      <w:hyperlink r:id="rId344">
         <w:r>
           <w:rPr>
             <w:rStyle w:val="Hyperlink"/>
@@ -17129,8 +17170,8 @@
         <w:t xml:space="preserve">.</w:t>
       </w:r>
     </w:p>
-    <w:bookmarkEnd w:id="343"/>
-    <w:bookmarkStart w:id="345" w:name="ref-kutser2020"/>
+    <w:bookmarkEnd w:id="345"/>
+    <w:bookmarkStart w:id="347" w:name="ref-kutser2020"/>
     <w:p>
       <w:pPr>
         <w:pStyle w:val="Literaturverzeichnis"/>
@@ -17160,7 +17201,7 @@
       <w:r>
         <w:t xml:space="preserve">240: 111619. https://doi.org/</w:t>
       </w:r>
-      <w:hyperlink r:id="rId344">
+      <w:hyperlink r:id="rId346">
         <w:r>
           <w:rPr>
             <w:rStyle w:val="Hyperlink"/>
@@ -17172,8 +17213,8 @@
         <w:t xml:space="preserve">.</w:t>
       </w:r>
     </w:p>
-    <w:bookmarkEnd w:id="345"/>
-    <w:bookmarkStart w:id="347" w:name="ref-kutser2009"/>
+    <w:bookmarkEnd w:id="347"/>
+    <w:bookmarkStart w:id="349" w:name="ref-kutser2009"/>
     <w:p>
       <w:pPr>
         <w:pStyle w:val="Literaturverzeichnis"/>
@@ -17203,7 +17244,7 @@
       <w:r>
         <w:t xml:space="preserve">113 (10): 2267–74. https://doi.org/</w:t>
       </w:r>
-      <w:hyperlink r:id="rId346">
+      <w:hyperlink r:id="rId348">
         <w:r>
           <w:rPr>
             <w:rStyle w:val="Hyperlink"/>
@@ -17215,8 +17256,8 @@
         <w:t xml:space="preserve">.</w:t>
       </w:r>
     </w:p>
-    <w:bookmarkEnd w:id="347"/>
-    <w:bookmarkStart w:id="349" w:name="ref-lavender2010whitecaps"/>
+    <w:bookmarkEnd w:id="349"/>
+    <w:bookmarkStart w:id="351" w:name="ref-lavender2010whitecaps"/>
     <w:p>
       <w:pPr>
         <w:pStyle w:val="Literaturverzeichnis"/>
@@ -17245,7 +17286,7 @@
       <w:r>
         <w:t xml:space="preserve"> </w:t>
       </w:r>
-      <w:hyperlink r:id="rId348">
+      <w:hyperlink r:id="rId350">
         <w:r>
           <w:rPr>
             <w:rStyle w:val="Hyperlink"/>
@@ -17257,8 +17298,8 @@
         <w:t xml:space="preserve">.</w:t>
       </w:r>
     </w:p>
-    <w:bookmarkEnd w:id="349"/>
-    <w:bookmarkStart w:id="351" w:name="ref-lavender2010glint"/>
+    <w:bookmarkEnd w:id="351"/>
+    <w:bookmarkStart w:id="353" w:name="ref-lavender2010glint"/>
     <w:p>
       <w:pPr>
         <w:pStyle w:val="Literaturverzeichnis"/>
@@ -17287,7 +17328,7 @@
       <w:r>
         <w:t xml:space="preserve"> </w:t>
       </w:r>
-      <w:hyperlink r:id="rId350">
+      <w:hyperlink r:id="rId352">
         <w:r>
           <w:rPr>
             <w:rStyle w:val="Hyperlink"/>
@@ -17299,8 +17340,8 @@
         <w:t xml:space="preserve">.</w:t>
       </w:r>
     </w:p>
-    <w:bookmarkEnd w:id="351"/>
-    <w:bookmarkStart w:id="353" w:name="ref-lee2011"/>
+    <w:bookmarkEnd w:id="353"/>
+    <w:bookmarkStart w:id="355" w:name="ref-lee2011"/>
     <w:p>
       <w:pPr>
         <w:pStyle w:val="Literaturverzeichnis"/>
@@ -17333,7 +17374,7 @@
       <w:r>
         <w:t xml:space="preserve"> </w:t>
       </w:r>
-      <w:hyperlink r:id="rId352">
+      <w:hyperlink r:id="rId354">
         <w:r>
           <w:rPr>
             <w:rStyle w:val="Hyperlink"/>
@@ -17345,8 +17386,8 @@
         <w:t xml:space="preserve">.</w:t>
       </w:r>
     </w:p>
-    <w:bookmarkEnd w:id="353"/>
-    <w:bookmarkStart w:id="354" w:name="ref-liu2019"/>
+    <w:bookmarkEnd w:id="355"/>
+    <w:bookmarkStart w:id="356" w:name="ref-liu2019"/>
     <w:p>
       <w:pPr>
         <w:pStyle w:val="Literaturverzeichnis"/>
@@ -17361,8 +17402,8 @@
         <w:t xml:space="preserve">“Ice Surface Temperature, Ice Concentration, and Ice Cover Algorithm Theoretical Basic Document.”</w:t>
       </w:r>
     </w:p>
-    <w:bookmarkEnd w:id="354"/>
-    <w:bookmarkStart w:id="356" w:name="ref-liu2016"/>
+    <w:bookmarkEnd w:id="356"/>
+    <w:bookmarkStart w:id="358" w:name="ref-liu2016"/>
     <w:p>
       <w:pPr>
         <w:pStyle w:val="Literaturverzeichnis"/>
@@ -17395,7 +17436,7 @@
       <w:r>
         <w:t xml:space="preserve"> </w:t>
       </w:r>
-      <w:hyperlink r:id="rId355">
+      <w:hyperlink r:id="rId357">
         <w:r>
           <w:rPr>
             <w:rStyle w:val="Hyperlink"/>
@@ -17407,8 +17448,8 @@
         <w:t xml:space="preserve">.</w:t>
       </w:r>
     </w:p>
-    <w:bookmarkEnd w:id="356"/>
-    <w:bookmarkStart w:id="358" w:name="ref-matthews2012"/>
+    <w:bookmarkEnd w:id="358"/>
+    <w:bookmarkStart w:id="360" w:name="ref-matthews2012"/>
     <w:p>
       <w:pPr>
         <w:pStyle w:val="Literaturverzeichnis"/>
@@ -17438,7 +17479,7 @@
       <w:r>
         <w:t xml:space="preserve">124: 637–52. https://doi.org/</w:t>
       </w:r>
-      <w:hyperlink r:id="rId357">
+      <w:hyperlink r:id="rId359">
         <w:r>
           <w:rPr>
             <w:rStyle w:val="Hyperlink"/>
@@ -17450,8 +17491,8 @@
         <w:t xml:space="preserve">.</w:t>
       </w:r>
     </w:p>
-    <w:bookmarkEnd w:id="358"/>
-    <w:bookmarkStart w:id="360" w:name="ref-matthews2015"/>
+    <w:bookmarkEnd w:id="360"/>
+    <w:bookmarkStart w:id="362" w:name="ref-matthews2015"/>
     <w:p>
       <w:pPr>
         <w:pStyle w:val="Literaturverzeichnis"/>
@@ -17481,7 +17522,7 @@
       <w:r>
         <w:t xml:space="preserve">156: 374–82. https://doi.org/</w:t>
       </w:r>
-      <w:hyperlink r:id="rId359">
+      <w:hyperlink r:id="rId361">
         <w:r>
           <w:rPr>
             <w:rStyle w:val="Hyperlink"/>
@@ -17493,8 +17534,8 @@
         <w:t xml:space="preserve">.</w:t>
       </w:r>
     </w:p>
-    <w:bookmarkEnd w:id="360"/>
-    <w:bookmarkStart w:id="362" w:name="ref-mikelsons2021"/>
+    <w:bookmarkEnd w:id="362"/>
+    <w:bookmarkStart w:id="364" w:name="ref-mikelsons2021"/>
     <w:p>
       <w:pPr>
         <w:pStyle w:val="Literaturverzeichnis"/>
@@ -17524,7 +17565,7 @@
       <w:r>
         <w:t xml:space="preserve">257: 112356. https://doi.org/</w:t>
       </w:r>
-      <w:hyperlink r:id="rId361">
+      <w:hyperlink r:id="rId363">
         <w:r>
           <w:rPr>
             <w:rStyle w:val="Hyperlink"/>
@@ -17536,8 +17577,8 @@
         <w:t xml:space="preserve">.</w:t>
       </w:r>
     </w:p>
-    <w:bookmarkEnd w:id="362"/>
-    <w:bookmarkStart w:id="364" w:name="ref-mobley2016"/>
+    <w:bookmarkEnd w:id="364"/>
+    <w:bookmarkStart w:id="366" w:name="ref-mobley2016"/>
     <w:p>
       <w:pPr>
         <w:pStyle w:val="Literaturverzeichnis"/>
@@ -17554,7 +17595,7 @@
       <w:r>
         <w:t xml:space="preserve"> </w:t>
       </w:r>
-      <w:hyperlink r:id="rId363">
+      <w:hyperlink r:id="rId365">
         <w:r>
           <w:rPr>
             <w:rStyle w:val="Hyperlink"/>
@@ -17566,8 +17607,8 @@
         <w:t xml:space="preserve">.</w:t>
       </w:r>
     </w:p>
-    <w:bookmarkEnd w:id="364"/>
-    <w:bookmarkStart w:id="366" w:name="ref-moore1999"/>
+    <w:bookmarkEnd w:id="366"/>
+    <w:bookmarkStart w:id="368" w:name="ref-moore1999"/>
     <w:p>
       <w:pPr>
         <w:pStyle w:val="Literaturverzeichnis"/>
@@ -17600,7 +17641,7 @@
       <w:r>
         <w:t xml:space="preserve"> </w:t>
       </w:r>
-      <w:hyperlink r:id="rId365">
+      <w:hyperlink r:id="rId367">
         <w:r>
           <w:rPr>
             <w:rStyle w:val="Hyperlink"/>
@@ -17612,8 +17653,8 @@
         <w:t xml:space="preserve">.</w:t>
       </w:r>
     </w:p>
-    <w:bookmarkEnd w:id="366"/>
-    <w:bookmarkStart w:id="368" w:name="ref-moore2000"/>
+    <w:bookmarkEnd w:id="368"/>
+    <w:bookmarkStart w:id="370" w:name="ref-moore2000"/>
     <w:p>
       <w:pPr>
         <w:pStyle w:val="Literaturverzeichnis"/>
@@ -17643,7 +17684,7 @@
       <w:r>
         <w:t xml:space="preserve">105 (C3): 6493–99. https://doi.org/</w:t>
       </w:r>
-      <w:hyperlink r:id="rId367">
+      <w:hyperlink r:id="rId369">
         <w:r>
           <w:rPr>
             <w:rStyle w:val="Hyperlink"/>
@@ -17655,8 +17696,8 @@
         <w:t xml:space="preserve">.</w:t>
       </w:r>
     </w:p>
-    <w:bookmarkEnd w:id="368"/>
-    <w:bookmarkStart w:id="370" w:name="ref-morel2002"/>
+    <w:bookmarkEnd w:id="370"/>
+    <w:bookmarkStart w:id="372" w:name="ref-morel2002"/>
     <w:p>
       <w:pPr>
         <w:pStyle w:val="Literaturverzeichnis"/>
@@ -17689,7 +17730,7 @@
       <w:r>
         <w:t xml:space="preserve"> </w:t>
       </w:r>
-      <w:hyperlink r:id="rId369">
+      <w:hyperlink r:id="rId371">
         <w:r>
           <w:rPr>
             <w:rStyle w:val="Hyperlink"/>
@@ -17701,8 +17742,8 @@
         <w:t xml:space="preserve">.</w:t>
       </w:r>
     </w:p>
-    <w:bookmarkEnd w:id="370"/>
-    <w:bookmarkStart w:id="372" w:name="ref-morel2006"/>
+    <w:bookmarkEnd w:id="372"/>
+    <w:bookmarkStart w:id="374" w:name="ref-morel2006"/>
     <w:p>
       <w:pPr>
         <w:pStyle w:val="Literaturverzeichnis"/>
@@ -17732,7 +17773,7 @@
       <w:r>
         <w:t xml:space="preserve">102 (3): 237–49. https://doi.org/</w:t>
       </w:r>
-      <w:hyperlink r:id="rId371">
+      <w:hyperlink r:id="rId373">
         <w:r>
           <w:rPr>
             <w:rStyle w:val="Hyperlink"/>
@@ -17744,8 +17785,8 @@
         <w:t xml:space="preserve">.</w:t>
       </w:r>
     </w:p>
-    <w:bookmarkEnd w:id="372"/>
-    <w:bookmarkStart w:id="374" w:name="ref-morel2008"/>
+    <w:bookmarkEnd w:id="374"/>
+    <w:bookmarkStart w:id="376" w:name="ref-morel2008"/>
     <w:p>
       <w:pPr>
         <w:pStyle w:val="Literaturverzeichnis"/>
@@ -17787,7 +17828,7 @@
       <w:r>
         <w:t xml:space="preserve">112 (3): 934–38. https://doi.org/</w:t>
       </w:r>
-      <w:hyperlink r:id="rId373">
+      <w:hyperlink r:id="rId375">
         <w:r>
           <w:rPr>
             <w:rStyle w:val="Hyperlink"/>
@@ -17799,8 +17840,8 @@
         <w:t xml:space="preserve">.</w:t>
       </w:r>
     </w:p>
-    <w:bookmarkEnd w:id="374"/>
-    <w:bookmarkStart w:id="376" w:name="ref-pahlevan2021"/>
+    <w:bookmarkEnd w:id="376"/>
+    <w:bookmarkStart w:id="378" w:name="ref-pahlevan2021"/>
     <w:p>
       <w:pPr>
         <w:pStyle w:val="Literaturverzeichnis"/>
@@ -17830,7 +17871,7 @@
       <w:r>
         <w:t xml:space="preserve">258: 112366. https://doi.org/</w:t>
       </w:r>
-      <w:hyperlink r:id="rId375">
+      <w:hyperlink r:id="rId377">
         <w:r>
           <w:rPr>
             <w:rStyle w:val="Hyperlink"/>
@@ -17842,8 +17883,8 @@
         <w:t xml:space="preserve">.</w:t>
       </w:r>
     </w:p>
-    <w:bookmarkEnd w:id="376"/>
-    <w:bookmarkStart w:id="378" w:name="ref-pahlevan2017"/>
+    <w:bookmarkEnd w:id="378"/>
+    <w:bookmarkStart w:id="380" w:name="ref-pahlevan2017"/>
     <w:p>
       <w:pPr>
         <w:pStyle w:val="Literaturverzeichnis"/>
@@ -17873,7 +17914,7 @@
       <w:r>
         <w:t xml:space="preserve">190: 289–301. https://doi.org/</w:t>
       </w:r>
-      <w:hyperlink r:id="rId377">
+      <w:hyperlink r:id="rId379">
         <w:r>
           <w:rPr>
             <w:rStyle w:val="Hyperlink"/>
@@ -17885,8 +17926,8 @@
         <w:t xml:space="preserve">.</w:t>
       </w:r>
     </w:p>
-    <w:bookmarkEnd w:id="378"/>
-    <w:bookmarkStart w:id="380" w:name="ref-pan2025"/>
+    <w:bookmarkEnd w:id="380"/>
+    <w:bookmarkStart w:id="382" w:name="ref-pan2025"/>
     <w:p>
       <w:pPr>
         <w:pStyle w:val="Literaturverzeichnis"/>
@@ -17916,7 +17957,7 @@
       <w:r>
         <w:t xml:space="preserve">317: 114508. https://doi.org/</w:t>
       </w:r>
-      <w:hyperlink r:id="rId379">
+      <w:hyperlink r:id="rId381">
         <w:r>
           <w:rPr>
             <w:rStyle w:val="Hyperlink"/>
@@ -17928,8 +17969,8 @@
         <w:t xml:space="preserve">.</w:t>
       </w:r>
     </w:p>
-    <w:bookmarkEnd w:id="380"/>
-    <w:bookmarkStart w:id="382" w:name="ref-park2005"/>
+    <w:bookmarkEnd w:id="382"/>
+    <w:bookmarkStart w:id="384" w:name="ref-park2005"/>
     <w:p>
       <w:pPr>
         <w:pStyle w:val="Literaturverzeichnis"/>
@@ -17962,7 +18003,7 @@
       <w:r>
         <w:t xml:space="preserve"> </w:t>
       </w:r>
-      <w:hyperlink r:id="rId381">
+      <w:hyperlink r:id="rId383">
         <w:r>
           <w:rPr>
             <w:rStyle w:val="Hyperlink"/>
@@ -17974,8 +18015,8 @@
         <w:t xml:space="preserve">.</w:t>
       </w:r>
     </w:p>
-    <w:bookmarkEnd w:id="382"/>
-    <w:bookmarkStart w:id="384" w:name="ref-pekel2016"/>
+    <w:bookmarkEnd w:id="384"/>
+    <w:bookmarkStart w:id="386" w:name="ref-pekel2016"/>
     <w:p>
       <w:pPr>
         <w:pStyle w:val="Literaturverzeichnis"/>
@@ -18008,7 +18049,7 @@
       <w:r>
         <w:t xml:space="preserve"> </w:t>
       </w:r>
-      <w:hyperlink r:id="rId383">
+      <w:hyperlink r:id="rId385">
         <w:r>
           <w:rPr>
             <w:rStyle w:val="Hyperlink"/>
@@ -18020,8 +18061,8 @@
         <w:t xml:space="preserve">.</w:t>
       </w:r>
     </w:p>
-    <w:bookmarkEnd w:id="384"/>
-    <w:bookmarkStart w:id="386" w:name="ref-reusen2023"/>
+    <w:bookmarkEnd w:id="386"/>
+    <w:bookmarkStart w:id="388" w:name="ref-reusen2023"/>
     <w:p>
       <w:pPr>
         <w:pStyle w:val="Literaturverzeichnis"/>
@@ -18044,7 +18085,7 @@
       <w:r>
         <w:t xml:space="preserve"> </w:t>
       </w:r>
-      <w:hyperlink r:id="rId385">
+      <w:hyperlink r:id="rId387">
         <w:r>
           <w:rPr>
             <w:rStyle w:val="Hyperlink"/>
@@ -18056,8 +18097,8 @@
         <w:t xml:space="preserve">.</w:t>
       </w:r>
     </w:p>
-    <w:bookmarkEnd w:id="386"/>
-    <w:bookmarkStart w:id="388" w:name="ref-richardson2024"/>
+    <w:bookmarkEnd w:id="388"/>
+    <w:bookmarkStart w:id="390" w:name="ref-richardson2024"/>
     <w:p>
       <w:pPr>
         <w:pStyle w:val="Literaturverzeichnis"/>
@@ -18087,7 +18128,7 @@
       <w:r>
         <w:t xml:space="preserve">311: 114302. https://doi.org/</w:t>
       </w:r>
-      <w:hyperlink r:id="rId387">
+      <w:hyperlink r:id="rId389">
         <w:r>
           <w:rPr>
             <w:rStyle w:val="Hyperlink"/>
@@ -18099,8 +18140,8 @@
         <w:t xml:space="preserve">.</w:t>
       </w:r>
     </w:p>
-    <w:bookmarkEnd w:id="388"/>
-    <w:bookmarkStart w:id="389" w:name="ref-robinson2003"/>
+    <w:bookmarkEnd w:id="390"/>
+    <w:bookmarkStart w:id="391" w:name="ref-robinson2003"/>
     <w:p>
       <w:pPr>
         <w:pStyle w:val="Literaturverzeichnis"/>
@@ -18128,8 +18169,8 @@
         <w:t xml:space="preserve">, May, 34–40.</w:t>
       </w:r>
     </w:p>
-    <w:bookmarkEnd w:id="389"/>
-    <w:bookmarkStart w:id="391" w:name="ref-sei2015"/>
+    <w:bookmarkEnd w:id="391"/>
+    <w:bookmarkStart w:id="393" w:name="ref-sei2015"/>
     <w:p>
       <w:pPr>
         <w:pStyle w:val="Literaturverzeichnis"/>
@@ -18162,7 +18203,7 @@
       <w:r>
         <w:t xml:space="preserve"> </w:t>
       </w:r>
-      <w:hyperlink r:id="rId390">
+      <w:hyperlink r:id="rId392">
         <w:r>
           <w:rPr>
             <w:rStyle w:val="Hyperlink"/>
@@ -18174,8 +18215,8 @@
         <w:t xml:space="preserve">.</w:t>
       </w:r>
     </w:p>
-    <w:bookmarkEnd w:id="391"/>
-    <w:bookmarkStart w:id="393" w:name="ref-shi2007"/>
+    <w:bookmarkEnd w:id="393"/>
+    <w:bookmarkStart w:id="395" w:name="ref-shi2007"/>
     <w:p>
       <w:pPr>
         <w:pStyle w:val="Literaturverzeichnis"/>
@@ -18205,7 +18246,7 @@
       <w:r>
         <w:t xml:space="preserve">110 (2): 149–61. https://doi.org/</w:t>
       </w:r>
-      <w:hyperlink r:id="rId392">
+      <w:hyperlink r:id="rId394">
         <w:r>
           <w:rPr>
             <w:rStyle w:val="Hyperlink"/>
@@ -18217,8 +18258,8 @@
         <w:t xml:space="preserve">.</w:t>
       </w:r>
     </w:p>
-    <w:bookmarkEnd w:id="393"/>
-    <w:bookmarkStart w:id="395" w:name="ref-skakun2022"/>
+    <w:bookmarkEnd w:id="395"/>
+    <w:bookmarkStart w:id="397" w:name="ref-skakun2022"/>
     <w:p>
       <w:pPr>
         <w:pStyle w:val="Literaturverzeichnis"/>
@@ -18248,7 +18289,7 @@
       <w:r>
         <w:t xml:space="preserve">274: 112990. https://doi.org/</w:t>
       </w:r>
-      <w:hyperlink r:id="rId394">
+      <w:hyperlink r:id="rId396">
         <w:r>
           <w:rPr>
             <w:rStyle w:val="Hyperlink"/>
@@ -18260,8 +18301,8 @@
         <w:t xml:space="preserve">.</w:t>
       </w:r>
     </w:p>
-    <w:bookmarkEnd w:id="395"/>
-    <w:bookmarkStart w:id="397" w:name="ref-soppa2021"/>
+    <w:bookmarkEnd w:id="397"/>
+    <w:bookmarkStart w:id="399" w:name="ref-soppa2021"/>
     <w:p>
       <w:pPr>
         <w:pStyle w:val="Literaturverzeichnis"/>
@@ -18294,7 +18335,7 @@
       <w:r>
         <w:t xml:space="preserve"> </w:t>
       </w:r>
-      <w:hyperlink r:id="rId396">
+      <w:hyperlink r:id="rId398">
         <w:r>
           <w:rPr>
             <w:rStyle w:val="Hyperlink"/>
@@ -18306,8 +18347,8 @@
         <w:t xml:space="preserve">.</w:t>
       </w:r>
     </w:p>
-    <w:bookmarkEnd w:id="397"/>
-    <w:bookmarkStart w:id="399" w:name="ref-sterckx2015"/>
+    <w:bookmarkEnd w:id="399"/>
+    <w:bookmarkStart w:id="401" w:name="ref-sterckx2015"/>
     <w:p>
       <w:pPr>
         <w:pStyle w:val="Literaturverzeichnis"/>
@@ -18337,7 +18378,7 @@
       <w:r>
         <w:t xml:space="preserve">157: 96–110. https://doi.org/</w:t>
       </w:r>
-      <w:hyperlink r:id="rId398">
+      <w:hyperlink r:id="rId400">
         <w:r>
           <w:rPr>
             <w:rStyle w:val="Hyperlink"/>
@@ -18349,8 +18390,8 @@
         <w:t xml:space="preserve">.</w:t>
       </w:r>
     </w:p>
-    <w:bookmarkEnd w:id="399"/>
-    <w:bookmarkStart w:id="400" w:name="ref-stumpf2003"/>
+    <w:bookmarkEnd w:id="401"/>
+    <w:bookmarkStart w:id="402" w:name="ref-stumpf2003"/>
     <w:p>
       <w:pPr>
         <w:pStyle w:val="Literaturverzeichnis"/>
@@ -18381,8 +18422,8 @@
         <w:t xml:space="preserve">206892 (May): 51–59.</w:t>
       </w:r>
     </w:p>
-    <w:bookmarkEnd w:id="400"/>
-    <w:bookmarkStart w:id="402" w:name="ref-vabson2024"/>
+    <w:bookmarkEnd w:id="402"/>
+    <w:bookmarkStart w:id="404" w:name="ref-vabson2024"/>
     <w:p>
       <w:pPr>
         <w:pStyle w:val="Literaturverzeichnis"/>
@@ -18415,7 +18456,7 @@
       <w:r>
         <w:t xml:space="preserve"> </w:t>
       </w:r>
-      <w:hyperlink r:id="rId401">
+      <w:hyperlink r:id="rId403">
         <w:r>
           <w:rPr>
             <w:rStyle w:val="Hyperlink"/>
@@ -18427,8 +18468,8 @@
         <w:t xml:space="preserve">.</w:t>
       </w:r>
     </w:p>
-    <w:bookmarkEnd w:id="402"/>
-    <w:bookmarkStart w:id="404" w:name="ref-vanhellemont2019"/>
+    <w:bookmarkEnd w:id="404"/>
+    <w:bookmarkStart w:id="406" w:name="ref-vanhellemont2019"/>
     <w:p>
       <w:pPr>
         <w:pStyle w:val="Literaturverzeichnis"/>
@@ -18458,7 +18499,7 @@
       <w:r>
         <w:t xml:space="preserve">225: 175–92. https://doi.org/</w:t>
       </w:r>
-      <w:hyperlink r:id="rId403">
+      <w:hyperlink r:id="rId405">
         <w:r>
           <w:rPr>
             <w:rStyle w:val="Hyperlink"/>
@@ -18470,8 +18511,8 @@
         <w:t xml:space="preserve">.</w:t>
       </w:r>
     </w:p>
-    <w:bookmarkEnd w:id="404"/>
-    <w:bookmarkStart w:id="406" w:name="ref-wang2017"/>
+    <w:bookmarkEnd w:id="406"/>
+    <w:bookmarkStart w:id="408" w:name="ref-wang2017"/>
     <w:p>
       <w:pPr>
         <w:pStyle w:val="Literaturverzeichnis"/>
@@ -18494,7 +18535,7 @@
       <w:r>
         <w:t xml:space="preserve"> </w:t>
       </w:r>
-      <w:hyperlink r:id="rId405">
+      <w:hyperlink r:id="rId407">
         <w:r>
           <w:rPr>
             <w:rStyle w:val="Hyperlink"/>
@@ -18506,8 +18547,8 @@
         <w:t xml:space="preserve">.</w:t>
       </w:r>
     </w:p>
-    <w:bookmarkEnd w:id="406"/>
-    <w:bookmarkStart w:id="408" w:name="ref-weatherall2015"/>
+    <w:bookmarkEnd w:id="408"/>
+    <w:bookmarkStart w:id="410" w:name="ref-weatherall2015"/>
     <w:p>
       <w:pPr>
         <w:pStyle w:val="Literaturverzeichnis"/>
@@ -18537,7 +18578,7 @@
       <w:r>
         <w:t xml:space="preserve">2 (8): 331–45. https://doi.org/</w:t>
       </w:r>
-      <w:hyperlink r:id="rId407">
+      <w:hyperlink r:id="rId409">
         <w:r>
           <w:rPr>
             <w:rStyle w:val="Hyperlink"/>
@@ -18549,8 +18590,8 @@
         <w:t xml:space="preserve">.</w:t>
       </w:r>
     </w:p>
-    <w:bookmarkEnd w:id="408"/>
-    <w:bookmarkStart w:id="410" w:name="ref-wu2023"/>
+    <w:bookmarkEnd w:id="410"/>
+    <w:bookmarkStart w:id="412" w:name="ref-wu2023"/>
     <w:p>
       <w:pPr>
         <w:pStyle w:val="Literaturverzeichnis"/>
@@ -18580,7 +18621,7 @@
       <w:r>
         <w:t xml:space="preserve">303: 108589. https://doi.org/</w:t>
       </w:r>
-      <w:hyperlink r:id="rId409">
+      <w:hyperlink r:id="rId411">
         <w:r>
           <w:rPr>
             <w:rStyle w:val="Hyperlink"/>
@@ -18592,8 +18633,8 @@
         <w:t xml:space="preserve">.</w:t>
       </w:r>
     </w:p>
-    <w:bookmarkEnd w:id="410"/>
-    <w:bookmarkStart w:id="412" w:name="ref-wu2024"/>
+    <w:bookmarkEnd w:id="412"/>
+    <w:bookmarkStart w:id="414" w:name="ref-wu2024"/>
     <w:p>
       <w:pPr>
         <w:pStyle w:val="Literaturverzeichnis"/>
@@ -18623,7 +18664,7 @@
       <w:r>
         <w:t xml:space="preserve">315: 114433. https://doi.org/</w:t>
       </w:r>
-      <w:hyperlink r:id="rId411">
+      <w:hyperlink r:id="rId413">
         <w:r>
           <w:rPr>
             <w:rStyle w:val="Hyperlink"/>
@@ -18635,8 +18676,8 @@
         <w:t xml:space="preserve">.</w:t>
       </w:r>
     </w:p>
-    <w:bookmarkEnd w:id="412"/>
-    <w:bookmarkStart w:id="414" w:name="ref-zhang2017"/>
+    <w:bookmarkEnd w:id="414"/>
+    <w:bookmarkStart w:id="416" w:name="ref-zhang2017"/>
     <w:p>
       <w:pPr>
         <w:pStyle w:val="Literaturverzeichnis"/>
@@ -18669,7 +18710,7 @@
       <w:r>
         <w:t xml:space="preserve"> </w:t>
       </w:r>
-      <w:hyperlink r:id="rId413">
+      <w:hyperlink r:id="rId415">
         <w:r>
           <w:rPr>
             <w:rStyle w:val="Hyperlink"/>
@@ -18681,8 +18722,8 @@
         <w:t xml:space="preserve">.</w:t>
       </w:r>
     </w:p>
-    <w:bookmarkEnd w:id="414"/>
-    <w:bookmarkStart w:id="416" w:name="ref-zhu2015"/>
+    <w:bookmarkEnd w:id="416"/>
+    <w:bookmarkStart w:id="418" w:name="ref-zhu2015"/>
     <w:p>
       <w:pPr>
         <w:pStyle w:val="Literaturverzeichnis"/>
@@ -18712,7 +18753,7 @@
       <w:r>
         <w:t xml:space="preserve">159: 269–77. https://doi.org/</w:t>
       </w:r>
-      <w:hyperlink r:id="rId415">
+      <w:hyperlink r:id="rId417">
         <w:r>
           <w:rPr>
             <w:rStyle w:val="Hyperlink"/>
@@ -18724,8 +18765,8 @@
         <w:t xml:space="preserve">.</w:t>
       </w:r>
     </w:p>
-    <w:bookmarkEnd w:id="416"/>
-    <w:bookmarkStart w:id="418" w:name="ref-zhu2012"/>
+    <w:bookmarkEnd w:id="418"/>
+    <w:bookmarkStart w:id="420" w:name="ref-zhu2012"/>
     <w:p>
       <w:pPr>
         <w:pStyle w:val="Literaturverzeichnis"/>
@@ -18755,7 +18796,7 @@
       <w:r>
         <w:t xml:space="preserve">118: 83–94. https://doi.org/</w:t>
       </w:r>
-      <w:hyperlink r:id="rId417">
+      <w:hyperlink r:id="rId419">
         <w:r>
           <w:rPr>
             <w:rStyle w:val="Hyperlink"/>
@@ -18767,10 +18808,10 @@
         <w:t xml:space="preserve">.</w:t>
       </w:r>
     </w:p>
-    <w:bookmarkEnd w:id="418"/>
-    <w:bookmarkEnd w:id="419"/>
     <w:bookmarkEnd w:id="420"/>
     <w:bookmarkEnd w:id="421"/>
+    <w:bookmarkEnd w:id="422"/>
+    <w:bookmarkEnd w:id="423"/>
     <w:sectPr>
       <w:headerReference r:id="rId11" w:type="even"/>
       <w:headerReference r:id="rId10" w:type="default"/>

</xml_diff>

<commit_message>
Deploy latest version of PFS documents 899901f21befd8f7f4c041ec32d4ea12d953820f
</commit_message>
<xml_diff>
--- a/latest/AR.docx
+++ b/latest/AR.docx
@@ -1545,10 +1545,10 @@
         </w:numPr>
       </w:pPr>
       <w:r>
-        <w:t xml:space="preserve">Relationship to Section </w:t>
-      </w:r>
-      <w:r>
-        <w:t xml:space="preserve">“</w:t>
+        <w:t xml:space="preserve">Relationship to</w:t>
+      </w:r>
+      <w:r>
+        <w:t xml:space="preserve"> </w:t>
       </w:r>
       <w:hyperlink w:anchor="sec:pral-muncer-ar">
         <w:r>
@@ -1559,9 +1559,6 @@
         </w:r>
       </w:hyperlink>
       <w:r>
-        <w:t xml:space="preserve">”</w:t>
-      </w:r>
-      <w:r>
         <w:t xml:space="preserve">. Traceability requires an estimate of measurement uncertainty.</w:t>
       </w:r>
     </w:p>
@@ -3959,10 +3956,10 @@
         <w:pStyle w:val="FirstParagraph"/>
       </w:pPr>
       <w:r>
-        <w:t xml:space="preserve">Percentage of valid pixels in a specified area based on the applied flags from Section </w:t>
-      </w:r>
-      <w:r>
-        <w:t xml:space="preserve">“</w:t>
+        <w:t xml:space="preserve">Percentage of valid pixels in a specified area based on the applied flags from</w:t>
+      </w:r>
+      <w:r>
+        <w:t xml:space="preserve"> </w:t>
       </w:r>
       <w:hyperlink w:anchor="sec:pxl">
         <w:r>
@@ -3973,9 +3970,6 @@
         </w:r>
       </w:hyperlink>
       <w:r>
-        <w:t xml:space="preserve">”</w:t>
-      </w:r>
-      <w:r>
         <w:t xml:space="preserve">.</w:t>
       </w:r>
     </w:p>
@@ -4090,7 +4084,7 @@
         <w:t xml:space="preserve"> </w:t>
       </w:r>
       <w:r>
-        <w:t xml:space="preserve">Whether the metadata is provided in a single record relevant to all pixels, or separately for each pixel, is at the discretion of the data provider.</w:t>
+        <w:t xml:space="preserve">Whether the metadata is provided in a single record relevant to all pixels or separately for each pixel is at the discretion of the data provider.</w:t>
       </w:r>
       <w:r>
         <w:t xml:space="preserve"> </w:t>
@@ -5765,10 +5759,10 @@
         </w:numPr>
       </w:pPr>
       <w:r>
-        <w:t xml:space="preserve">See Section </w:t>
-      </w:r>
-      <w:r>
-        <w:t xml:space="preserve">“</w:t>
+        <w:t xml:space="preserve">See</w:t>
+      </w:r>
+      <w:r>
+        <w:t xml:space="preserve"> </w:t>
       </w:r>
       <w:hyperlink w:anchor="sec:pral-cosungli">
         <w:r>
@@ -5779,9 +5773,6 @@
         </w:r>
       </w:hyperlink>
       <w:r>
-        <w:t xml:space="preserve">”</w:t>
-      </w:r>
-      <w:r>
         <w:t xml:space="preserve"> </w:t>
       </w:r>
       <w:r>
@@ -5989,10 +5980,10 @@
         </w:numPr>
       </w:pPr>
       <w:r>
-        <w:t xml:space="preserve">See Section </w:t>
-      </w:r>
-      <w:r>
-        <w:t xml:space="preserve">“</w:t>
+        <w:t xml:space="preserve">See</w:t>
+      </w:r>
+      <w:r>
+        <w:t xml:space="preserve"> </w:t>
       </w:r>
       <w:hyperlink w:anchor="sec:pral-coskygli">
         <w:r>
@@ -6003,9 +5994,6 @@
         </w:r>
       </w:hyperlink>
       <w:r>
-        <w:t xml:space="preserve">”</w:t>
-      </w:r>
-      <w:r>
         <w:t xml:space="preserve">,</w:t>
       </w:r>
       <w:r>
@@ -6352,10 +6340,10 @@
         </w:numPr>
       </w:pPr>
       <w:r>
-        <w:t xml:space="preserve">See Section </w:t>
-      </w:r>
-      <w:r>
-        <w:t xml:space="preserve">“</w:t>
+        <w:t xml:space="preserve">See</w:t>
+      </w:r>
+      <w:r>
+        <w:t xml:space="preserve"> </w:t>
       </w:r>
       <w:hyperlink w:anchor="sec:pral-cowhifo">
         <w:r>
@@ -6365,9 +6353,6 @@
           <w:t xml:space="preserve">Products and Algorithms: Whitecap / Foam Correction</w:t>
         </w:r>
       </w:hyperlink>
-      <w:r>
-        <w:t xml:space="preserve">”</w:t>
-      </w:r>
       <w:r>
         <w:t xml:space="preserve">,</w:t>
       </w:r>
@@ -8689,10 +8674,10 @@
         </w:numPr>
       </w:pPr>
       <w:r>
-        <w:t xml:space="preserve">See also Section </w:t>
-      </w:r>
-      <w:r>
-        <w:t xml:space="preserve">“</w:t>
+        <w:t xml:space="preserve">See also</w:t>
+      </w:r>
+      <w:r>
+        <w:t xml:space="preserve"> </w:t>
       </w:r>
       <w:hyperlink w:anchor="sec:meta-trace-ar">
         <w:r>
@@ -8703,16 +8688,13 @@
         </w:r>
       </w:hyperlink>
       <w:r>
-        <w:t xml:space="preserve">”</w:t>
-      </w:r>
-      <w:r>
-        <w:t xml:space="preserve"> </w:t>
-      </w:r>
-      <w:r>
-        <w:t xml:space="preserve">and Section </w:t>
-      </w:r>
-      <w:r>
-        <w:t xml:space="preserve">“</w:t>
+        <w:t xml:space="preserve"> </w:t>
+      </w:r>
+      <w:r>
+        <w:t xml:space="preserve">and</w:t>
+      </w:r>
+      <w:r>
+        <w:t xml:space="preserve"> </w:t>
       </w:r>
       <w:hyperlink w:anchor="sec:pral-mnormal-ar">
         <w:r>
@@ -8722,9 +8704,6 @@
           <w:t xml:space="preserve">Products and Algorithms: Measurement Normalisation</w:t>
         </w:r>
       </w:hyperlink>
-      <w:r>
-        <w:t xml:space="preserve">”</w:t>
-      </w:r>
     </w:p>
     <w:bookmarkEnd w:id="199"/>
     <w:bookmarkStart w:id="200" w:name="assessment-39"/>
@@ -9537,10 +9516,10 @@
         </w:numPr>
       </w:pPr>
       <w:r>
-        <w:t xml:space="preserve">Relevant metadata must be provided in Section </w:t>
-      </w:r>
-      <w:r>
-        <w:t xml:space="preserve">“</w:t>
+        <w:t xml:space="preserve">Relevant metadata must be provided in</w:t>
+      </w:r>
+      <w:r>
+        <w:t xml:space="preserve"> </w:t>
       </w:r>
       <w:hyperlink w:anchor="sec:meta-geounc">
         <w:r>
@@ -9551,16 +9530,13 @@
         </w:r>
       </w:hyperlink>
       <w:r>
-        <w:t xml:space="preserve">”</w:t>
-      </w:r>
-      <w:r>
-        <w:t xml:space="preserve"> </w:t>
-      </w:r>
-      <w:r>
-        <w:t xml:space="preserve">and Section </w:t>
-      </w:r>
-      <w:r>
-        <w:t xml:space="preserve">“</w:t>
+        <w:t xml:space="preserve"> </w:t>
+      </w:r>
+      <w:r>
+        <w:t xml:space="preserve">and</w:t>
+      </w:r>
+      <w:r>
+        <w:t xml:space="preserve"> </w:t>
       </w:r>
       <w:hyperlink w:anchor="sec:meta-instru-ar">
         <w:r>
@@ -9571,9 +9547,6 @@
         </w:r>
       </w:hyperlink>
       <w:r>
-        <w:t xml:space="preserve">”</w:t>
-      </w:r>
-      <w:r>
         <w:t xml:space="preserve">.</w:t>
       </w:r>
     </w:p>
@@ -9887,10 +9860,10 @@
         </w:numPr>
       </w:pPr>
       <w:r>
-        <w:t xml:space="preserve">Relevant metadata must be provided in Section </w:t>
-      </w:r>
-      <w:r>
-        <w:t xml:space="preserve">“</w:t>
+        <w:t xml:space="preserve">Relevant metadata must be provided in</w:t>
+      </w:r>
+      <w:r>
+        <w:t xml:space="preserve"> </w:t>
       </w:r>
       <w:hyperlink w:anchor="sec:meta-geounc">
         <w:r>
@@ -9901,16 +9874,13 @@
         </w:r>
       </w:hyperlink>
       <w:r>
-        <w:t xml:space="preserve">”</w:t>
-      </w:r>
-      <w:r>
-        <w:t xml:space="preserve"> </w:t>
-      </w:r>
-      <w:r>
-        <w:t xml:space="preserve">and Section </w:t>
-      </w:r>
-      <w:r>
-        <w:t xml:space="preserve">“</w:t>
+        <w:t xml:space="preserve"> </w:t>
+      </w:r>
+      <w:r>
+        <w:t xml:space="preserve">and</w:t>
+      </w:r>
+      <w:r>
+        <w:t xml:space="preserve"> </w:t>
       </w:r>
       <w:hyperlink w:anchor="sec:meta-instru-ar">
         <w:r>
@@ -9921,9 +9891,6 @@
         </w:r>
       </w:hyperlink>
       <w:r>
-        <w:t xml:space="preserve">”</w:t>
-      </w:r>
-      <w:r>
         <w:t xml:space="preserve">.</w:t>
       </w:r>
     </w:p>
@@ -10208,10 +10175,10 @@
         </w:numPr>
       </w:pPr>
       <w:r>
-        <w:t xml:space="preserve">See Section </w:t>
-      </w:r>
-      <w:r>
-        <w:t xml:space="preserve">“</w:t>
+        <w:t xml:space="preserve">See</w:t>
+      </w:r>
+      <w:r>
+        <w:t xml:space="preserve"> </w:t>
       </w:r>
       <w:hyperlink w:anchor="sec:pxl-pisungli">
         <w:r>
@@ -10222,9 +10189,6 @@
         </w:r>
       </w:hyperlink>
       <w:r>
-        <w:t xml:space="preserve">”</w:t>
-      </w:r>
-      <w:r>
         <w:t xml:space="preserve">,</w:t>
       </w:r>
       <w:r>
@@ -10496,10 +10460,10 @@
         </w:numPr>
       </w:pPr>
       <w:r>
-        <w:t xml:space="preserve">See Section </w:t>
-      </w:r>
-      <w:r>
-        <w:t xml:space="preserve">“</w:t>
+        <w:t xml:space="preserve">See</w:t>
+      </w:r>
+      <w:r>
+        <w:t xml:space="preserve"> </w:t>
       </w:r>
       <w:hyperlink w:anchor="sec:pxl-piskygli">
         <w:r>
@@ -10510,9 +10474,6 @@
         </w:r>
       </w:hyperlink>
       <w:r>
-        <w:t xml:space="preserve">”</w:t>
-      </w:r>
-      <w:r>
         <w:t xml:space="preserve">,</w:t>
       </w:r>
       <w:r>
@@ -10928,10 +10889,10 @@
         </w:numPr>
       </w:pPr>
       <w:r>
-        <w:t xml:space="preserve">See Section </w:t>
-      </w:r>
-      <w:r>
-        <w:t xml:space="preserve">“</w:t>
+        <w:t xml:space="preserve">See</w:t>
+      </w:r>
+      <w:r>
+        <w:t xml:space="preserve"> </w:t>
       </w:r>
       <w:hyperlink w:anchor="sec:pxl-piwhifo">
         <w:r>
@@ -10942,9 +10903,6 @@
         </w:r>
       </w:hyperlink>
       <w:r>
-        <w:t xml:space="preserve">”</w:t>
-      </w:r>
-      <w:r>
         <w:t xml:space="preserve">.</w:t>
       </w:r>
     </w:p>
@@ -11512,10 +11470,10 @@
         <w:pStyle w:val="FirstParagraph"/>
       </w:pPr>
       <w:r>
-        <w:t xml:space="preserve">Geometric corrections must place the measurement accurately on the surface of the Earth (that is, geolocate the measurement) allowing measurements taken through time to be compared. Ocean and coastal imagery do not have an independent terrestrial referencing system and therefore Section </w:t>
-      </w:r>
-      <w:r>
-        <w:t xml:space="preserve">“</w:t>
+        <w:t xml:space="preserve">Geometric corrections must place the measurement accurately on the surface of the Earth (that is, geolocate the measurement) allowing measurements taken through time to be compared. Ocean and coastal imagery do not have an independent terrestrial referencing system and therefore</w:t>
+      </w:r>
+      <w:r>
+        <w:t xml:space="preserve"> </w:t>
       </w:r>
       <w:hyperlink w:anchor="sec:gcom-corore">
         <w:r>
@@ -11526,9 +11484,6 @@
         </w:r>
       </w:hyperlink>
       <w:r>
-        <w:t xml:space="preserve">”</w:t>
-      </w:r>
-      <w:r>
         <w:t xml:space="preserve"> </w:t>
       </w:r>
       <w:r>
@@ -11656,10 +11611,10 @@
         <w:pStyle w:val="Textkrper"/>
       </w:pPr>
       <w:r>
-        <w:t xml:space="preserve">Relevant metadata must be provided under Section </w:t>
-      </w:r>
-      <w:r>
-        <w:t xml:space="preserve">“</w:t>
+        <w:t xml:space="preserve">Relevant metadata must be provided under</w:t>
+      </w:r>
+      <w:r>
+        <w:t xml:space="preserve"> </w:t>
       </w:r>
       <w:hyperlink w:anchor="sec:meta-geounc">
         <w:r>
@@ -11670,16 +11625,13 @@
         </w:r>
       </w:hyperlink>
       <w:r>
-        <w:t xml:space="preserve">”</w:t>
-      </w:r>
-      <w:r>
-        <w:t xml:space="preserve"> </w:t>
-      </w:r>
-      <w:r>
-        <w:t xml:space="preserve">and Section </w:t>
-      </w:r>
-      <w:r>
-        <w:t xml:space="preserve">“</w:t>
+        <w:t xml:space="preserve"> </w:t>
+      </w:r>
+      <w:r>
+        <w:t xml:space="preserve">and</w:t>
+      </w:r>
+      <w:r>
+        <w:t xml:space="preserve"> </w:t>
       </w:r>
       <w:hyperlink w:anchor="sec:meta-instru-ar">
         <w:r>
@@ -11690,9 +11642,6 @@
         </w:r>
       </w:hyperlink>
       <w:r>
-        <w:t xml:space="preserve">”</w:t>
-      </w:r>
-      <w:r>
         <w:t xml:space="preserve">.</w:t>
       </w:r>
     </w:p>
@@ -11767,10 +11716,10 @@
         <w:pStyle w:val="Textkrper"/>
       </w:pPr>
       <w:r>
-        <w:t xml:space="preserve">Relevant metadata must be provided under Section </w:t>
-      </w:r>
-      <w:r>
-        <w:t xml:space="preserve">“</w:t>
+        <w:t xml:space="preserve">Relevant metadata must be provided under</w:t>
+      </w:r>
+      <w:r>
+        <w:t xml:space="preserve"> </w:t>
       </w:r>
       <w:hyperlink w:anchor="sec:meta-geounc">
         <w:r>
@@ -11781,16 +11730,13 @@
         </w:r>
       </w:hyperlink>
       <w:r>
-        <w:t xml:space="preserve">”</w:t>
-      </w:r>
-      <w:r>
-        <w:t xml:space="preserve"> </w:t>
-      </w:r>
-      <w:r>
-        <w:t xml:space="preserve">and Section </w:t>
-      </w:r>
-      <w:r>
-        <w:t xml:space="preserve">“</w:t>
+        <w:t xml:space="preserve"> </w:t>
+      </w:r>
+      <w:r>
+        <w:t xml:space="preserve">and</w:t>
+      </w:r>
+      <w:r>
+        <w:t xml:space="preserve"> </w:t>
       </w:r>
       <w:hyperlink w:anchor="sec:meta-instru-ar">
         <w:r>
@@ -11800,9 +11746,6 @@
           <w:t xml:space="preserve">General Metadata: Instrument</w:t>
         </w:r>
       </w:hyperlink>
-      <w:r>
-        <w:t xml:space="preserve">”</w:t>
-      </w:r>
       <w:r>
         <w:t xml:space="preserve">.</w:t>
       </w:r>

</xml_diff>